<commit_message>
Cập nhật logic xác thực và tài liệu dự án.
</commit_message>
<xml_diff>
--- a/docs/HƯỚNG DẪN SỬ DỤNG HỆ THỐNG VÀ CHẠY DEMO.docx
+++ b/docs/HƯỚNG DẪN SỬ DỤNG HỆ THỐNG VÀ CHẠY DEMO.docx
@@ -214,26 +214,6 @@
     </w:p>
     <w:p>
       <w:pPr>
-        <w:ind w:hanging="572"/>
-        <w:rPr>
-          <w:lang w:val="en-US"/>
-        </w:rPr>
-      </w:pPr>
-      <w:r>
-        <w:t>Sau đó import file SQL nằm trong thư mục:</w:t>
-      </w:r>
-      <w:r>
-        <w:rPr>
-          <w:lang w:val="en-US"/>
-        </w:rPr>
-        <w:t xml:space="preserve"> </w:t>
-      </w:r>
-      <w:r>
-        <w:t>src/database/</w:t>
-      </w:r>
-    </w:p>
-    <w:p>
-      <w:pPr>
         <w:ind w:hanging="1281"/>
         <w:rPr>
           <w:b/>
@@ -390,7 +370,8 @@
     </w:p>
     <w:p>
       <w:pPr>
-        <w:ind w:hanging="714"/>
+        <w:ind w:left="0" w:firstLine="567"/>
+        <w:jc w:val="both"/>
         <w:rPr>
           <w:lang w:val="en-US"/>
         </w:rPr>
@@ -405,8 +386,31 @@
         </w:rPr>
         <w:t xml:space="preserve"> </w:t>
       </w:r>
-      <w:r>
-        <w:t>http://localhost:8080</w:t>
+      <w:hyperlink r:id="rId5" w:history="1">
+        <w:r>
+          <w:rPr>
+            <w:rStyle w:val="Hyperlink"/>
+          </w:rPr>
+          <w:t>http://localhost:8080</w:t>
+        </w:r>
+      </w:hyperlink>
+      <w:r>
+        <w:rPr>
+          <w:lang w:val="en-US"/>
+        </w:rPr>
+        <w:t xml:space="preserve">. </w:t>
+      </w:r>
+      <w:r>
+        <w:t xml:space="preserve">Chạy thành công lần đầu, Hibernate tự động tạo toàn bộ bảng trong database. Sau đó </w:t>
+      </w:r>
+      <w:r>
+        <w:rPr>
+          <w:bCs w:val="0"/>
+        </w:rPr>
+        <w:t>dừng server</w:t>
+      </w:r>
+      <w:r>
+        <w:t>, mở MySQL, chọn database auction_db và import file DbReset_full.sql (nằm trong thư mục src/database/) để nạp dữ liệu mẫu. Tiếp tục chạy lại server sau khi import xong.</w:t>
       </w:r>
     </w:p>
     <w:p>
@@ -557,12 +561,16 @@
       </w:r>
     </w:p>
     <w:p>
-      <w:r>
-        <w:t>Email: buyer2@gmail.com</w:t>
-      </w:r>
-    </w:p>
-    <w:p>
-      <w:pPr>
+      <w:pPr>
+        <w:ind w:left="2205" w:hanging="1281"/>
+      </w:pPr>
+      <w:r>
+        <w:t>Email: shopabc@gmail.com</w:t>
+      </w:r>
+    </w:p>
+    <w:p>
+      <w:pPr>
+        <w:ind w:left="2205" w:hanging="1281"/>
         <w:rPr>
           <w:lang w:val="en-US"/>
         </w:rPr>
@@ -715,31 +723,13 @@
     <w:p>
       <w:pPr>
         <w:ind w:hanging="714"/>
+        <w:rPr>
+          <w:lang w:val="en-US"/>
+        </w:rPr>
       </w:pPr>
       <w:r>
         <w:t>Hệ thống xác thực bằng JWT Authentication.</w:t>
       </w:r>
-    </w:p>
-    <w:p>
-      <w:pPr>
-        <w:rPr>
-          <w:lang w:val="en-US"/>
-        </w:rPr>
-      </w:pPr>
-    </w:p>
-    <w:p>
-      <w:pPr>
-        <w:rPr>
-          <w:lang w:val="en-US"/>
-        </w:rPr>
-      </w:pPr>
-    </w:p>
-    <w:p>
-      <w:pPr>
-        <w:rPr>
-          <w:lang w:val="en-US"/>
-        </w:rPr>
-      </w:pPr>
     </w:p>
     <w:p>
       <w:pPr>
@@ -963,7 +953,13 @@
         </w:numPr>
       </w:pPr>
       <w:r>
-        <w:t>Gửi thông báo realtime</w:t>
+        <w:t xml:space="preserve">Gửi thông báo </w:t>
+      </w:r>
+      <w:r>
+        <w:rPr>
+          <w:lang w:val="en-US"/>
+        </w:rPr>
+        <w:t>tức thời</w:t>
       </w:r>
     </w:p>
     <w:p>
@@ -1063,6 +1059,9 @@
     <w:p>
       <w:pPr>
         <w:ind w:hanging="714"/>
+        <w:rPr>
+          <w:lang w:val="en-US"/>
+        </w:rPr>
       </w:pPr>
       <w:r>
         <w:t>Sản phẩm chuyển sang trạng thái:</w:t>
@@ -1079,6 +1078,22 @@
     </w:p>
     <w:p>
       <w:pPr>
+        <w:ind w:hanging="714"/>
+        <w:rPr>
+          <w:lang w:val="en-US"/>
+        </w:rPr>
+      </w:pPr>
+    </w:p>
+    <w:p>
+      <w:pPr>
+        <w:ind w:hanging="714"/>
+        <w:rPr>
+          <w:lang w:val="en-US"/>
+        </w:rPr>
+      </w:pPr>
+    </w:p>
+    <w:p>
+      <w:pPr>
         <w:ind w:hanging="997"/>
         <w:rPr>
           <w:b/>
@@ -1088,6 +1103,7 @@
         <w:rPr>
           <w:b/>
         </w:rPr>
+        <w:lastRenderedPageBreak/>
         <w:t>8.7 Admin duyệt sản phẩm</w:t>
       </w:r>
     </w:p>
@@ -1108,7 +1124,6 @@
         </w:numPr>
       </w:pPr>
       <w:r>
-        <w:lastRenderedPageBreak/>
         <w:t>Duyệt sản phẩm</w:t>
       </w:r>
     </w:p>
@@ -1126,21 +1141,37 @@
     </w:p>
     <w:p>
       <w:pPr>
+        <w:ind w:left="0" w:firstLine="924"/>
+      </w:pPr>
+      <w:r>
+        <w:t>Sau khi duyệt:</w:t>
+      </w:r>
+      <w:r>
         <w:rPr>
           <w:lang w:val="en-US"/>
         </w:rPr>
-      </w:pPr>
-      <w:r>
-        <w:t>Sau khi duyệt:</w:t>
+        <w:t xml:space="preserve"> tr</w:t>
       </w:r>
       <w:r>
         <w:rPr>
           <w:lang w:val="en-US"/>
         </w:rPr>
-        <w:t xml:space="preserve"> trang thái của phiên đấu giá là </w:t>
-      </w:r>
-      <w:r>
-        <w:t>ACTIVE</w:t>
+        <w:t>ạ</w:t>
+      </w:r>
+      <w:r>
+        <w:rPr>
+          <w:lang w:val="en-US"/>
+        </w:rPr>
+        <w:t xml:space="preserve">ng thái của phiên đấu giá </w:t>
+      </w:r>
+      <w:r>
+        <w:rPr>
+          <w:lang w:val="en-US"/>
+        </w:rPr>
+        <w:t xml:space="preserve">là </w:t>
+      </w:r>
+      <w:r>
+        <w:t>UPCOMING (sắp diễn ra), hệ thống sẽ tự động chuyển sang ACTIVE khi đến giờ bắt đầu.</w:t>
       </w:r>
     </w:p>
     <w:p>
@@ -1158,6 +1189,9 @@
       </w:r>
     </w:p>
     <w:p>
+      <w:pPr>
+        <w:ind w:hanging="714"/>
+      </w:pPr>
       <w:r>
         <w:t>Khi hết thời gian:</w:t>
       </w:r>
@@ -1167,11 +1201,14 @@
         <w:pStyle w:val="ListParagraph"/>
         <w:numPr>
           <w:ilvl w:val="0"/>
-          <w:numId w:val="25"/>
+          <w:numId w:val="27"/>
         </w:numPr>
-      </w:pPr>
-      <w:r>
-        <w:t>Hệ thống xác định người trả giá cao nhất</w:t>
+        <w:rPr>
+          <w:lang w:val="en-US"/>
+        </w:rPr>
+      </w:pPr>
+      <w:r>
+        <w:t xml:space="preserve">Trường hợp đạt giá sàn (có người đặt giá đủ điều kiện): </w:t>
       </w:r>
     </w:p>
     <w:p>
@@ -1179,11 +1216,14 @@
         <w:pStyle w:val="ListParagraph"/>
         <w:numPr>
           <w:ilvl w:val="0"/>
-          <w:numId w:val="25"/>
+          <w:numId w:val="27"/>
         </w:numPr>
-      </w:pPr>
-      <w:r>
-        <w:t>Tạo đơn hàng tự động</w:t>
+        <w:rPr>
+          <w:lang w:val="en-US"/>
+        </w:rPr>
+      </w:pPr>
+      <w:r>
+        <w:t xml:space="preserve">Hệ thống xác định người trả giá cao nhất là người thắng </w:t>
       </w:r>
     </w:p>
     <w:p>
@@ -1191,11 +1231,100 @@
         <w:pStyle w:val="ListParagraph"/>
         <w:numPr>
           <w:ilvl w:val="0"/>
-          <w:numId w:val="25"/>
+          <w:numId w:val="27"/>
         </w:numPr>
-      </w:pPr>
-      <w:r>
-        <w:t>Gửi thông báo cho người thắng</w:t>
+        <w:rPr>
+          <w:lang w:val="en-US"/>
+        </w:rPr>
+      </w:pPr>
+      <w:r>
+        <w:t xml:space="preserve">Chuyển trạng thái phiên sang SOLD </w:t>
+      </w:r>
+    </w:p>
+    <w:p>
+      <w:pPr>
+        <w:pStyle w:val="ListParagraph"/>
+        <w:numPr>
+          <w:ilvl w:val="0"/>
+          <w:numId w:val="27"/>
+        </w:numPr>
+        <w:rPr>
+          <w:lang w:val="en-US"/>
+        </w:rPr>
+      </w:pPr>
+      <w:r>
+        <w:t xml:space="preserve">Tạo đơn hàng tự động </w:t>
+      </w:r>
+    </w:p>
+    <w:p>
+      <w:pPr>
+        <w:pStyle w:val="ListParagraph"/>
+        <w:numPr>
+          <w:ilvl w:val="0"/>
+          <w:numId w:val="27"/>
+        </w:numPr>
+        <w:rPr>
+          <w:lang w:val="en-US"/>
+        </w:rPr>
+      </w:pPr>
+      <w:r>
+        <w:t xml:space="preserve">Gửi thông báo cho người thắng và người bán </w:t>
+      </w:r>
+    </w:p>
+    <w:p>
+      <w:pPr>
+        <w:ind w:hanging="714"/>
+        <w:rPr>
+          <w:lang w:val="en-US"/>
+        </w:rPr>
+      </w:pPr>
+      <w:r>
+        <w:t xml:space="preserve">Trường hợp không đạt giá sàn: </w:t>
+      </w:r>
+    </w:p>
+    <w:p>
+      <w:pPr>
+        <w:pStyle w:val="ListParagraph"/>
+        <w:numPr>
+          <w:ilvl w:val="0"/>
+          <w:numId w:val="28"/>
+        </w:numPr>
+        <w:rPr>
+          <w:lang w:val="en-US"/>
+        </w:rPr>
+      </w:pPr>
+      <w:r>
+        <w:t xml:space="preserve">Chuyển trạng thái phiên sang FAILED </w:t>
+      </w:r>
+    </w:p>
+    <w:p>
+      <w:pPr>
+        <w:pStyle w:val="ListParagraph"/>
+        <w:numPr>
+          <w:ilvl w:val="0"/>
+          <w:numId w:val="28"/>
+        </w:numPr>
+        <w:rPr>
+          <w:lang w:val="en-US"/>
+        </w:rPr>
+      </w:pPr>
+      <w:r>
+        <w:t xml:space="preserve">Không tạo đơn hàng </w:t>
+      </w:r>
+    </w:p>
+    <w:p>
+      <w:pPr>
+        <w:pStyle w:val="ListParagraph"/>
+        <w:numPr>
+          <w:ilvl w:val="0"/>
+          <w:numId w:val="28"/>
+        </w:numPr>
+        <w:rPr>
+          <w:lang w:val="en-US"/>
+        </w:rPr>
+      </w:pPr>
+      <w:r>
+        <w:t>Gửi thông báo cho người bán</w:t>
       </w:r>
     </w:p>
     <w:p>
@@ -1370,6 +1499,7 @@
         <w:rPr>
           <w:b/>
         </w:rPr>
+        <w:lastRenderedPageBreak/>
         <w:t>Lỗi Frontend không chạy</w:t>
       </w:r>
     </w:p>
@@ -2453,6 +2583,119 @@
     </w:lvl>
   </w:abstractNum>
   <w:abstractNum w:abstractNumId="7" w15:restartNumberingAfterBreak="0">
+    <w:nsid w:val="24EF13D2"/>
+    <w:multiLevelType w:val="hybridMultilevel"/>
+    <w:tmpl w:val="338A92DE"/>
+    <w:lvl w:ilvl="0" w:tplc="042A0001">
+      <w:start w:val="1"/>
+      <w:numFmt w:val="bullet"/>
+      <w:lvlText w:val=""/>
+      <w:lvlJc w:val="left"/>
+      <w:pPr>
+        <w:ind w:left="1004" w:hanging="360"/>
+      </w:pPr>
+      <w:rPr>
+        <w:rFonts w:ascii="Symbol" w:hAnsi="Symbol" w:hint="default"/>
+      </w:rPr>
+    </w:lvl>
+    <w:lvl w:ilvl="1" w:tplc="042A0003" w:tentative="1">
+      <w:start w:val="1"/>
+      <w:numFmt w:val="bullet"/>
+      <w:lvlText w:val="o"/>
+      <w:lvlJc w:val="left"/>
+      <w:pPr>
+        <w:ind w:left="1724" w:hanging="360"/>
+      </w:pPr>
+      <w:rPr>
+        <w:rFonts w:ascii="Courier New" w:hAnsi="Courier New" w:cs="Courier New" w:hint="default"/>
+      </w:rPr>
+    </w:lvl>
+    <w:lvl w:ilvl="2" w:tplc="042A0005" w:tentative="1">
+      <w:start w:val="1"/>
+      <w:numFmt w:val="bullet"/>
+      <w:lvlText w:val=""/>
+      <w:lvlJc w:val="left"/>
+      <w:pPr>
+        <w:ind w:left="2444" w:hanging="360"/>
+      </w:pPr>
+      <w:rPr>
+        <w:rFonts w:ascii="Wingdings" w:hAnsi="Wingdings" w:hint="default"/>
+      </w:rPr>
+    </w:lvl>
+    <w:lvl w:ilvl="3" w:tplc="042A0001" w:tentative="1">
+      <w:start w:val="1"/>
+      <w:numFmt w:val="bullet"/>
+      <w:lvlText w:val=""/>
+      <w:lvlJc w:val="left"/>
+      <w:pPr>
+        <w:ind w:left="3164" w:hanging="360"/>
+      </w:pPr>
+      <w:rPr>
+        <w:rFonts w:ascii="Symbol" w:hAnsi="Symbol" w:hint="default"/>
+      </w:rPr>
+    </w:lvl>
+    <w:lvl w:ilvl="4" w:tplc="042A0003" w:tentative="1">
+      <w:start w:val="1"/>
+      <w:numFmt w:val="bullet"/>
+      <w:lvlText w:val="o"/>
+      <w:lvlJc w:val="left"/>
+      <w:pPr>
+        <w:ind w:left="3884" w:hanging="360"/>
+      </w:pPr>
+      <w:rPr>
+        <w:rFonts w:ascii="Courier New" w:hAnsi="Courier New" w:cs="Courier New" w:hint="default"/>
+      </w:rPr>
+    </w:lvl>
+    <w:lvl w:ilvl="5" w:tplc="042A0005" w:tentative="1">
+      <w:start w:val="1"/>
+      <w:numFmt w:val="bullet"/>
+      <w:lvlText w:val=""/>
+      <w:lvlJc w:val="left"/>
+      <w:pPr>
+        <w:ind w:left="4604" w:hanging="360"/>
+      </w:pPr>
+      <w:rPr>
+        <w:rFonts w:ascii="Wingdings" w:hAnsi="Wingdings" w:hint="default"/>
+      </w:rPr>
+    </w:lvl>
+    <w:lvl w:ilvl="6" w:tplc="042A0001" w:tentative="1">
+      <w:start w:val="1"/>
+      <w:numFmt w:val="bullet"/>
+      <w:lvlText w:val=""/>
+      <w:lvlJc w:val="left"/>
+      <w:pPr>
+        <w:ind w:left="5324" w:hanging="360"/>
+      </w:pPr>
+      <w:rPr>
+        <w:rFonts w:ascii="Symbol" w:hAnsi="Symbol" w:hint="default"/>
+      </w:rPr>
+    </w:lvl>
+    <w:lvl w:ilvl="7" w:tplc="042A0003" w:tentative="1">
+      <w:start w:val="1"/>
+      <w:numFmt w:val="bullet"/>
+      <w:lvlText w:val="o"/>
+      <w:lvlJc w:val="left"/>
+      <w:pPr>
+        <w:ind w:left="6044" w:hanging="360"/>
+      </w:pPr>
+      <w:rPr>
+        <w:rFonts w:ascii="Courier New" w:hAnsi="Courier New" w:cs="Courier New" w:hint="default"/>
+      </w:rPr>
+    </w:lvl>
+    <w:lvl w:ilvl="8" w:tplc="042A0005" w:tentative="1">
+      <w:start w:val="1"/>
+      <w:numFmt w:val="bullet"/>
+      <w:lvlText w:val=""/>
+      <w:lvlJc w:val="left"/>
+      <w:pPr>
+        <w:ind w:left="6764" w:hanging="360"/>
+      </w:pPr>
+      <w:rPr>
+        <w:rFonts w:ascii="Wingdings" w:hAnsi="Wingdings" w:hint="default"/>
+      </w:rPr>
+    </w:lvl>
+  </w:abstractNum>
+  <w:abstractNum w:abstractNumId="8" w15:restartNumberingAfterBreak="0">
     <w:nsid w:val="26850742"/>
     <w:multiLevelType w:val="hybridMultilevel"/>
     <w:tmpl w:val="2E2226DE"/>
@@ -2565,7 +2808,120 @@
       </w:rPr>
     </w:lvl>
   </w:abstractNum>
-  <w:abstractNum w:abstractNumId="8" w15:restartNumberingAfterBreak="0">
+  <w:abstractNum w:abstractNumId="9" w15:restartNumberingAfterBreak="0">
+    <w:nsid w:val="273F670B"/>
+    <w:multiLevelType w:val="hybridMultilevel"/>
+    <w:tmpl w:val="BCEC599A"/>
+    <w:lvl w:ilvl="0" w:tplc="042A0001">
+      <w:start w:val="1"/>
+      <w:numFmt w:val="bullet"/>
+      <w:lvlText w:val=""/>
+      <w:lvlJc w:val="left"/>
+      <w:pPr>
+        <w:ind w:left="1004" w:hanging="360"/>
+      </w:pPr>
+      <w:rPr>
+        <w:rFonts w:ascii="Symbol" w:hAnsi="Symbol" w:hint="default"/>
+      </w:rPr>
+    </w:lvl>
+    <w:lvl w:ilvl="1" w:tplc="042A0003" w:tentative="1">
+      <w:start w:val="1"/>
+      <w:numFmt w:val="bullet"/>
+      <w:lvlText w:val="o"/>
+      <w:lvlJc w:val="left"/>
+      <w:pPr>
+        <w:ind w:left="1724" w:hanging="360"/>
+      </w:pPr>
+      <w:rPr>
+        <w:rFonts w:ascii="Courier New" w:hAnsi="Courier New" w:cs="Courier New" w:hint="default"/>
+      </w:rPr>
+    </w:lvl>
+    <w:lvl w:ilvl="2" w:tplc="042A0005" w:tentative="1">
+      <w:start w:val="1"/>
+      <w:numFmt w:val="bullet"/>
+      <w:lvlText w:val=""/>
+      <w:lvlJc w:val="left"/>
+      <w:pPr>
+        <w:ind w:left="2444" w:hanging="360"/>
+      </w:pPr>
+      <w:rPr>
+        <w:rFonts w:ascii="Wingdings" w:hAnsi="Wingdings" w:hint="default"/>
+      </w:rPr>
+    </w:lvl>
+    <w:lvl w:ilvl="3" w:tplc="042A0001" w:tentative="1">
+      <w:start w:val="1"/>
+      <w:numFmt w:val="bullet"/>
+      <w:lvlText w:val=""/>
+      <w:lvlJc w:val="left"/>
+      <w:pPr>
+        <w:ind w:left="3164" w:hanging="360"/>
+      </w:pPr>
+      <w:rPr>
+        <w:rFonts w:ascii="Symbol" w:hAnsi="Symbol" w:hint="default"/>
+      </w:rPr>
+    </w:lvl>
+    <w:lvl w:ilvl="4" w:tplc="042A0003" w:tentative="1">
+      <w:start w:val="1"/>
+      <w:numFmt w:val="bullet"/>
+      <w:lvlText w:val="o"/>
+      <w:lvlJc w:val="left"/>
+      <w:pPr>
+        <w:ind w:left="3884" w:hanging="360"/>
+      </w:pPr>
+      <w:rPr>
+        <w:rFonts w:ascii="Courier New" w:hAnsi="Courier New" w:cs="Courier New" w:hint="default"/>
+      </w:rPr>
+    </w:lvl>
+    <w:lvl w:ilvl="5" w:tplc="042A0005" w:tentative="1">
+      <w:start w:val="1"/>
+      <w:numFmt w:val="bullet"/>
+      <w:lvlText w:val=""/>
+      <w:lvlJc w:val="left"/>
+      <w:pPr>
+        <w:ind w:left="4604" w:hanging="360"/>
+      </w:pPr>
+      <w:rPr>
+        <w:rFonts w:ascii="Wingdings" w:hAnsi="Wingdings" w:hint="default"/>
+      </w:rPr>
+    </w:lvl>
+    <w:lvl w:ilvl="6" w:tplc="042A0001" w:tentative="1">
+      <w:start w:val="1"/>
+      <w:numFmt w:val="bullet"/>
+      <w:lvlText w:val=""/>
+      <w:lvlJc w:val="left"/>
+      <w:pPr>
+        <w:ind w:left="5324" w:hanging="360"/>
+      </w:pPr>
+      <w:rPr>
+        <w:rFonts w:ascii="Symbol" w:hAnsi="Symbol" w:hint="default"/>
+      </w:rPr>
+    </w:lvl>
+    <w:lvl w:ilvl="7" w:tplc="042A0003" w:tentative="1">
+      <w:start w:val="1"/>
+      <w:numFmt w:val="bullet"/>
+      <w:lvlText w:val="o"/>
+      <w:lvlJc w:val="left"/>
+      <w:pPr>
+        <w:ind w:left="6044" w:hanging="360"/>
+      </w:pPr>
+      <w:rPr>
+        <w:rFonts w:ascii="Courier New" w:hAnsi="Courier New" w:cs="Courier New" w:hint="default"/>
+      </w:rPr>
+    </w:lvl>
+    <w:lvl w:ilvl="8" w:tplc="042A0005" w:tentative="1">
+      <w:start w:val="1"/>
+      <w:numFmt w:val="bullet"/>
+      <w:lvlText w:val=""/>
+      <w:lvlJc w:val="left"/>
+      <w:pPr>
+        <w:ind w:left="6764" w:hanging="360"/>
+      </w:pPr>
+      <w:rPr>
+        <w:rFonts w:ascii="Wingdings" w:hAnsi="Wingdings" w:hint="default"/>
+      </w:rPr>
+    </w:lvl>
+  </w:abstractNum>
+  <w:abstractNum w:abstractNumId="10" w15:restartNumberingAfterBreak="0">
     <w:nsid w:val="274C537B"/>
     <w:multiLevelType w:val="hybridMultilevel"/>
     <w:tmpl w:val="A920D968"/>
@@ -2678,7 +3034,7 @@
       </w:rPr>
     </w:lvl>
   </w:abstractNum>
-  <w:abstractNum w:abstractNumId="9" w15:restartNumberingAfterBreak="0">
+  <w:abstractNum w:abstractNumId="11" w15:restartNumberingAfterBreak="0">
     <w:nsid w:val="2F336821"/>
     <w:multiLevelType w:val="multilevel"/>
     <w:tmpl w:val="1580192E"/>
@@ -2791,7 +3147,7 @@
       </w:pPr>
     </w:lvl>
   </w:abstractNum>
-  <w:abstractNum w:abstractNumId="10" w15:restartNumberingAfterBreak="0">
+  <w:abstractNum w:abstractNumId="12" w15:restartNumberingAfterBreak="0">
     <w:nsid w:val="322D2525"/>
     <w:multiLevelType w:val="hybridMultilevel"/>
     <w:tmpl w:val="601432E4"/>
@@ -2904,7 +3260,7 @@
       </w:rPr>
     </w:lvl>
   </w:abstractNum>
-  <w:abstractNum w:abstractNumId="11" w15:restartNumberingAfterBreak="0">
+  <w:abstractNum w:abstractNumId="13" w15:restartNumberingAfterBreak="0">
     <w:nsid w:val="39734110"/>
     <w:multiLevelType w:val="multilevel"/>
     <w:tmpl w:val="7DFEFCB2"/>
@@ -3053,7 +3409,7 @@
       </w:rPr>
     </w:lvl>
   </w:abstractNum>
-  <w:abstractNum w:abstractNumId="12" w15:restartNumberingAfterBreak="0">
+  <w:abstractNum w:abstractNumId="14" w15:restartNumberingAfterBreak="0">
     <w:nsid w:val="41AC1A2E"/>
     <w:multiLevelType w:val="hybridMultilevel"/>
     <w:tmpl w:val="30F44A16"/>
@@ -3166,7 +3522,7 @@
       </w:rPr>
     </w:lvl>
   </w:abstractNum>
-  <w:abstractNum w:abstractNumId="13" w15:restartNumberingAfterBreak="0">
+  <w:abstractNum w:abstractNumId="15" w15:restartNumberingAfterBreak="0">
     <w:nsid w:val="45CD133F"/>
     <w:multiLevelType w:val="hybridMultilevel"/>
     <w:tmpl w:val="F4308AF2"/>
@@ -3279,7 +3635,7 @@
       </w:rPr>
     </w:lvl>
   </w:abstractNum>
-  <w:abstractNum w:abstractNumId="14" w15:restartNumberingAfterBreak="0">
+  <w:abstractNum w:abstractNumId="16" w15:restartNumberingAfterBreak="0">
     <w:nsid w:val="4A893E2D"/>
     <w:multiLevelType w:val="hybridMultilevel"/>
     <w:tmpl w:val="F594B894"/>
@@ -3392,7 +3748,7 @@
       </w:rPr>
     </w:lvl>
   </w:abstractNum>
-  <w:abstractNum w:abstractNumId="15" w15:restartNumberingAfterBreak="0">
+  <w:abstractNum w:abstractNumId="17" w15:restartNumberingAfterBreak="0">
     <w:nsid w:val="4BCD4967"/>
     <w:multiLevelType w:val="multilevel"/>
     <w:tmpl w:val="7E2267EE"/>
@@ -3541,7 +3897,7 @@
       </w:rPr>
     </w:lvl>
   </w:abstractNum>
-  <w:abstractNum w:abstractNumId="16" w15:restartNumberingAfterBreak="0">
+  <w:abstractNum w:abstractNumId="18" w15:restartNumberingAfterBreak="0">
     <w:nsid w:val="4DFF01F0"/>
     <w:multiLevelType w:val="multilevel"/>
     <w:tmpl w:val="02A85C20"/>
@@ -3690,7 +4046,7 @@
       </w:rPr>
     </w:lvl>
   </w:abstractNum>
-  <w:abstractNum w:abstractNumId="17" w15:restartNumberingAfterBreak="0">
+  <w:abstractNum w:abstractNumId="19" w15:restartNumberingAfterBreak="0">
     <w:nsid w:val="4F291C48"/>
     <w:multiLevelType w:val="hybridMultilevel"/>
     <w:tmpl w:val="4D5C5B6E"/>
@@ -3803,7 +4159,7 @@
       </w:rPr>
     </w:lvl>
   </w:abstractNum>
-  <w:abstractNum w:abstractNumId="18" w15:restartNumberingAfterBreak="0">
+  <w:abstractNum w:abstractNumId="20" w15:restartNumberingAfterBreak="0">
     <w:nsid w:val="549B0A59"/>
     <w:multiLevelType w:val="multilevel"/>
     <w:tmpl w:val="6B68D032"/>
@@ -3952,7 +4308,7 @@
       </w:rPr>
     </w:lvl>
   </w:abstractNum>
-  <w:abstractNum w:abstractNumId="19" w15:restartNumberingAfterBreak="0">
+  <w:abstractNum w:abstractNumId="21" w15:restartNumberingAfterBreak="0">
     <w:nsid w:val="60FE3E4E"/>
     <w:multiLevelType w:val="multilevel"/>
     <w:tmpl w:val="E814DA7C"/>
@@ -4101,7 +4457,7 @@
       </w:rPr>
     </w:lvl>
   </w:abstractNum>
-  <w:abstractNum w:abstractNumId="20" w15:restartNumberingAfterBreak="0">
+  <w:abstractNum w:abstractNumId="22" w15:restartNumberingAfterBreak="0">
     <w:nsid w:val="680D1041"/>
     <w:multiLevelType w:val="hybridMultilevel"/>
     <w:tmpl w:val="A5986866"/>
@@ -4214,7 +4570,7 @@
       </w:rPr>
     </w:lvl>
   </w:abstractNum>
-  <w:abstractNum w:abstractNumId="21" w15:restartNumberingAfterBreak="0">
+  <w:abstractNum w:abstractNumId="23" w15:restartNumberingAfterBreak="0">
     <w:nsid w:val="6E161EB7"/>
     <w:multiLevelType w:val="hybridMultilevel"/>
     <w:tmpl w:val="06762C32"/>
@@ -4327,7 +4683,7 @@
       </w:rPr>
     </w:lvl>
   </w:abstractNum>
-  <w:abstractNum w:abstractNumId="22" w15:restartNumberingAfterBreak="0">
+  <w:abstractNum w:abstractNumId="24" w15:restartNumberingAfterBreak="0">
     <w:nsid w:val="7A321AD1"/>
     <w:multiLevelType w:val="hybridMultilevel"/>
     <w:tmpl w:val="EC94ACA8"/>
@@ -4440,7 +4796,7 @@
       </w:rPr>
     </w:lvl>
   </w:abstractNum>
-  <w:abstractNum w:abstractNumId="23" w15:restartNumberingAfterBreak="0">
+  <w:abstractNum w:abstractNumId="25" w15:restartNumberingAfterBreak="0">
     <w:nsid w:val="7A61316F"/>
     <w:multiLevelType w:val="hybridMultilevel"/>
     <w:tmpl w:val="58DA159A"/>
@@ -4553,7 +4909,7 @@
       </w:rPr>
     </w:lvl>
   </w:abstractNum>
-  <w:abstractNum w:abstractNumId="24" w15:restartNumberingAfterBreak="0">
+  <w:abstractNum w:abstractNumId="26" w15:restartNumberingAfterBreak="0">
     <w:nsid w:val="7C981C1E"/>
     <w:multiLevelType w:val="multilevel"/>
     <w:tmpl w:val="DAD6C76A"/>
@@ -4702,7 +5058,7 @@
       </w:rPr>
     </w:lvl>
   </w:abstractNum>
-  <w:abstractNum w:abstractNumId="25" w15:restartNumberingAfterBreak="0">
+  <w:abstractNum w:abstractNumId="27" w15:restartNumberingAfterBreak="0">
     <w:nsid w:val="7EA96557"/>
     <w:multiLevelType w:val="multilevel"/>
     <w:tmpl w:val="2BD4EBBC"/>
@@ -4852,13 +5208,13 @@
     </w:lvl>
   </w:abstractNum>
   <w:num w:numId="1" w16cid:durableId="1801846876">
-    <w:abstractNumId w:val="11"/>
+    <w:abstractNumId w:val="13"/>
   </w:num>
   <w:num w:numId="2" w16cid:durableId="1904559340">
-    <w:abstractNumId w:val="24"/>
+    <w:abstractNumId w:val="26"/>
   </w:num>
   <w:num w:numId="3" w16cid:durableId="1104958712">
-    <w:abstractNumId w:val="15"/>
+    <w:abstractNumId w:val="17"/>
   </w:num>
   <w:num w:numId="4" w16cid:durableId="1865435517">
     <w:abstractNumId w:val="0"/>
@@ -4870,16 +5226,16 @@
     <w:abstractNumId w:val="4"/>
   </w:num>
   <w:num w:numId="7" w16cid:durableId="1491949354">
-    <w:abstractNumId w:val="18"/>
+    <w:abstractNumId w:val="20"/>
   </w:num>
   <w:num w:numId="8" w16cid:durableId="553470653">
-    <w:abstractNumId w:val="9"/>
+    <w:abstractNumId w:val="11"/>
   </w:num>
   <w:num w:numId="9" w16cid:durableId="539167108">
-    <w:abstractNumId w:val="25"/>
+    <w:abstractNumId w:val="27"/>
   </w:num>
   <w:num w:numId="10" w16cid:durableId="1716153047">
-    <w:abstractNumId w:val="16"/>
+    <w:abstractNumId w:val="18"/>
   </w:num>
   <w:num w:numId="11" w16cid:durableId="329991630">
     <w:abstractNumId w:val="3"/>
@@ -4891,43 +5247,49 @@
     <w:abstractNumId w:val="2"/>
   </w:num>
   <w:num w:numId="14" w16cid:durableId="719011476">
+    <w:abstractNumId w:val="23"/>
+  </w:num>
+  <w:num w:numId="15" w16cid:durableId="917980449">
     <w:abstractNumId w:val="21"/>
   </w:num>
-  <w:num w:numId="15" w16cid:durableId="917980449">
-    <w:abstractNumId w:val="19"/>
-  </w:num>
   <w:num w:numId="16" w16cid:durableId="16271596">
-    <w:abstractNumId w:val="12"/>
+    <w:abstractNumId w:val="14"/>
   </w:num>
   <w:num w:numId="17" w16cid:durableId="664162679">
-    <w:abstractNumId w:val="23"/>
+    <w:abstractNumId w:val="25"/>
   </w:num>
   <w:num w:numId="18" w16cid:durableId="313336297">
     <w:abstractNumId w:val="5"/>
   </w:num>
   <w:num w:numId="19" w16cid:durableId="1622031285">
-    <w:abstractNumId w:val="17"/>
+    <w:abstractNumId w:val="19"/>
   </w:num>
   <w:num w:numId="20" w16cid:durableId="529220824">
-    <w:abstractNumId w:val="14"/>
+    <w:abstractNumId w:val="16"/>
   </w:num>
   <w:num w:numId="21" w16cid:durableId="1540585074">
-    <w:abstractNumId w:val="13"/>
+    <w:abstractNumId w:val="15"/>
   </w:num>
   <w:num w:numId="22" w16cid:durableId="1231237492">
-    <w:abstractNumId w:val="20"/>
+    <w:abstractNumId w:val="22"/>
   </w:num>
   <w:num w:numId="23" w16cid:durableId="637416715">
-    <w:abstractNumId w:val="7"/>
+    <w:abstractNumId w:val="8"/>
   </w:num>
   <w:num w:numId="24" w16cid:durableId="730083340">
-    <w:abstractNumId w:val="22"/>
+    <w:abstractNumId w:val="24"/>
   </w:num>
   <w:num w:numId="25" w16cid:durableId="667051279">
+    <w:abstractNumId w:val="12"/>
+  </w:num>
+  <w:num w:numId="26" w16cid:durableId="630331837">
     <w:abstractNumId w:val="10"/>
   </w:num>
-  <w:num w:numId="26" w16cid:durableId="630331837">
-    <w:abstractNumId w:val="8"/>
+  <w:num w:numId="27" w16cid:durableId="1737702074">
+    <w:abstractNumId w:val="9"/>
+  </w:num>
+  <w:num w:numId="28" w16cid:durableId="1288897673">
+    <w:abstractNumId w:val="7"/>
   </w:num>
 </w:numbering>
 </file>
@@ -5852,6 +6214,29 @@
       <w:spacing w:val="5"/>
     </w:rPr>
   </w:style>
+  <w:style w:type="character" w:styleId="Hyperlink">
+    <w:name w:val="Hyperlink"/>
+    <w:basedOn w:val="DefaultParagraphFont"/>
+    <w:uiPriority w:val="99"/>
+    <w:unhideWhenUsed/>
+    <w:rsid w:val="009B3F2D"/>
+    <w:rPr>
+      <w:color w:val="0563C1" w:themeColor="hyperlink"/>
+      <w:u w:val="single"/>
+    </w:rPr>
+  </w:style>
+  <w:style w:type="character" w:styleId="UnresolvedMention">
+    <w:name w:val="Unresolved Mention"/>
+    <w:basedOn w:val="DefaultParagraphFont"/>
+    <w:uiPriority w:val="99"/>
+    <w:semiHidden/>
+    <w:unhideWhenUsed/>
+    <w:rsid w:val="009B3F2D"/>
+    <w:rPr>
+      <w:color w:val="605E5C"/>
+      <w:shd w:val="clear" w:color="auto" w:fill="E1DFDD"/>
+    </w:rPr>
+  </w:style>
 </w:styles>
 </file>
 

</xml_diff>

<commit_message>
Sửa giao diện và kiểm thử mua ngay
</commit_message>
<xml_diff>
--- a/docs/HƯỚNG DẪN SỬ DỤNG HỆ THỐNG VÀ CHẠY DEMO.docx
+++ b/docs/HƯỚNG DẪN SỬ DỤNG HỆ THỐNG VÀ CHẠY DEMO.docx
@@ -183,208 +183,273 @@
     </w:p>
     <w:p>
       <w:pPr>
-        <w:ind w:hanging="1281"/>
-        <w:rPr>
-          <w:b/>
-        </w:rPr>
-      </w:pPr>
-      <w:r>
-        <w:rPr>
-          <w:b/>
-        </w:rPr>
-        <w:t>3. Chuẩn bị cơ sở dữ liệu</w:t>
-      </w:r>
-    </w:p>
-    <w:p>
-      <w:pPr>
-        <w:ind w:hanging="572"/>
-      </w:pPr>
-      <w:r>
-        <w:t>Mở MySQL và tạo database:</w:t>
-      </w:r>
-      <w:r>
-        <w:rPr>
-          <w:lang w:val="en-US"/>
-        </w:rPr>
-        <w:t xml:space="preserve"> </w:t>
-      </w:r>
-      <w:r>
-        <w:t>CREATE DATABASE auction_db;</w:t>
-      </w:r>
-    </w:p>
-    <w:p>
-      <w:pPr>
-        <w:ind w:hanging="1281"/>
-        <w:rPr>
-          <w:b/>
-        </w:rPr>
-      </w:pPr>
-      <w:r>
-        <w:rPr>
-          <w:b/>
-        </w:rPr>
-        <w:t>4. Cấu hình Backend</w:t>
-      </w:r>
-    </w:p>
-    <w:p>
-      <w:pPr>
-        <w:ind w:hanging="714"/>
-      </w:pPr>
-      <w:r>
-        <w:t>Di chuyển tới thư mục backend:</w:t>
-      </w:r>
-      <w:r>
-        <w:rPr>
-          <w:lang w:val="en-US"/>
-        </w:rPr>
-        <w:t xml:space="preserve"> </w:t>
-      </w:r>
-      <w:r>
-        <w:t>cd src/backend</w:t>
-      </w:r>
-    </w:p>
-    <w:p>
-      <w:pPr>
-        <w:ind w:hanging="714"/>
-      </w:pPr>
-      <w:r>
-        <w:t>Mở file</w:t>
-      </w:r>
-      <w:r>
-        <w:rPr>
-          <w:lang w:val="en-US"/>
-        </w:rPr>
-        <w:t xml:space="preserve"> </w:t>
-      </w:r>
-      <w:r>
-        <w:t>application.properties</w:t>
-      </w:r>
-    </w:p>
-    <w:p>
-      <w:pPr>
-        <w:ind w:hanging="714"/>
-      </w:pPr>
-      <w:r>
-        <w:t>Cấu hình database:</w:t>
-      </w:r>
-    </w:p>
-    <w:p>
-      <w:r>
-        <w:t>spring.datasource.url=jdbc:mysql://localhost:3306/auction_db</w:t>
-      </w:r>
-    </w:p>
-    <w:p>
-      <w:r>
-        <w:t>spring.datasource.username=root</w:t>
-      </w:r>
-    </w:p>
-    <w:p>
-      <w:r>
-        <w:t>spring.datasource.password=your_password</w:t>
-      </w:r>
-    </w:p>
-    <w:p>
-      <w:pPr>
-        <w:rPr>
-          <w:lang w:val="en-US"/>
-        </w:rPr>
-      </w:pPr>
-      <w:r>
-        <w:t>spring.jpa.hibernate.ddl-auto=update</w:t>
-      </w:r>
-    </w:p>
-    <w:p>
-      <w:pPr>
-        <w:ind w:hanging="1281"/>
-        <w:rPr>
-          <w:b/>
-        </w:rPr>
-      </w:pPr>
-      <w:r>
-        <w:rPr>
-          <w:b/>
-        </w:rPr>
-        <w:t>5. Chạy Backend Server</w:t>
-      </w:r>
-    </w:p>
-    <w:p>
-      <w:pPr>
-        <w:ind w:hanging="714"/>
-      </w:pPr>
-      <w:r>
-        <w:t>Trong thư mục backend chạy:</w:t>
-      </w:r>
-      <w:r>
-        <w:rPr>
-          <w:lang w:val="en-US"/>
-        </w:rPr>
-        <w:t xml:space="preserve"> </w:t>
-      </w:r>
-      <w:r>
-        <w:t>mvn spring-boot:run</w:t>
-      </w:r>
-    </w:p>
-    <w:p>
-      <w:pPr>
-        <w:ind w:hanging="714"/>
-      </w:pPr>
-      <w:r>
-        <w:t>Hoặc chạy trực tiếp bằng IDE:</w:t>
-      </w:r>
-    </w:p>
-    <w:p>
-      <w:pPr>
-        <w:pStyle w:val="ListParagraph"/>
         <w:numPr>
           <w:ilvl w:val="0"/>
-          <w:numId w:val="17"/>
+          <w:numId w:val="16"/>
         </w:numPr>
       </w:pPr>
       <w:r>
-        <w:t>IntelliJ IDEA</w:t>
-      </w:r>
-    </w:p>
-    <w:p>
-      <w:pPr>
-        <w:pStyle w:val="ListParagraph"/>
-        <w:numPr>
-          <w:ilvl w:val="0"/>
-          <w:numId w:val="17"/>
-        </w:numPr>
-      </w:pPr>
-      <w:r>
-        <w:t>Spring Tool Suite</w:t>
-      </w:r>
-    </w:p>
-    <w:p>
-      <w:pPr>
-        <w:pStyle w:val="ListParagraph"/>
-        <w:numPr>
-          <w:ilvl w:val="0"/>
-          <w:numId w:val="17"/>
-        </w:numPr>
-      </w:pPr>
-      <w:r>
-        <w:t>Eclipse</w:t>
-      </w:r>
-    </w:p>
-    <w:p>
-      <w:pPr>
-        <w:ind w:left="0" w:firstLine="567"/>
+        <w:t>Python 3.8 trở lên</w:t>
+      </w:r>
+    </w:p>
+    <w:p>
+      <w:pPr>
+        <w:ind w:hanging="1281"/>
+        <w:rPr>
+          <w:b/>
+          <w:lang w:val="en-US"/>
+        </w:rPr>
+      </w:pPr>
+      <w:r>
+        <w:rPr>
+          <w:b/>
+        </w:rPr>
+        <w:t xml:space="preserve">3. </w:t>
+      </w:r>
+      <w:r>
+        <w:rPr>
+          <w:b/>
+          <w:lang w:val="en-US"/>
+        </w:rPr>
+        <w:t>Hướng dẫn cài đặt</w:t>
+      </w:r>
+    </w:p>
+    <w:p>
+      <w:pPr>
+        <w:ind w:left="2001" w:hanging="1281"/>
+      </w:pPr>
+      <w:r>
+        <w:rPr>
+          <w:b/>
+        </w:rPr>
+        <w:t>Bước 1: Clone source code</w:t>
+      </w:r>
+    </w:p>
+    <w:p>
+      <w:pPr>
+        <w:ind w:left="2001" w:hanging="1281"/>
+      </w:pPr>
+      <w:r>
+        <w:t>git clone &lt;repository_url&gt;</w:t>
+      </w:r>
+    </w:p>
+    <w:p>
+      <w:pPr>
+        <w:ind w:left="2001" w:hanging="1281"/>
+      </w:pPr>
+      <w:r>
+        <w:rPr>
+          <w:b/>
+        </w:rPr>
+        <w:t>Bước 2: Tạo database rỗng</w:t>
+      </w:r>
+    </w:p>
+    <w:p>
+      <w:pPr>
+        <w:ind w:left="2001" w:hanging="1281"/>
+        <w:rPr>
+          <w:lang w:val="en-US"/>
+        </w:rPr>
+      </w:pPr>
+      <w:r>
+        <w:t>Mở MySQL và tạo database: CREATE DATABASE auction_db;</w:t>
+      </w:r>
+    </w:p>
+    <w:p>
+      <w:pPr>
+        <w:ind w:left="2001" w:hanging="1281"/>
+      </w:pPr>
+      <w:r>
+        <w:rPr>
+          <w:b/>
+        </w:rPr>
+        <w:t>Bước 3: Cấu hình Backend</w:t>
+      </w:r>
+    </w:p>
+    <w:p>
+      <w:pPr>
+        <w:ind w:left="2001" w:hanging="1281"/>
+      </w:pPr>
+      <w:r>
+        <w:t>Mở file src/backend/src/main/resources/application.properties và sửa:</w:t>
+      </w:r>
+    </w:p>
+    <w:p>
+      <w:pPr>
+        <w:ind w:left="2001" w:hanging="1281"/>
+      </w:pPr>
+      <w:r>
+        <w:t>spring.datasource.username=root</w:t>
+      </w:r>
+    </w:p>
+    <w:p>
+      <w:pPr>
+        <w:ind w:left="2001" w:hanging="1281"/>
+      </w:pPr>
+      <w:r>
+        <w:t>spring.datasource.password=your_password</w:t>
+      </w:r>
+    </w:p>
+    <w:p>
+      <w:pPr>
+        <w:ind w:left="2001" w:hanging="1281"/>
+      </w:pPr>
+      <w:r>
+        <w:rPr>
+          <w:b/>
+        </w:rPr>
+        <w:t>Bước 4: Chạy Backend lần đầu để tạo bảng</w:t>
+      </w:r>
+    </w:p>
+    <w:p>
+      <w:pPr>
+        <w:ind w:left="2001" w:hanging="1281"/>
+      </w:pPr>
+      <w:r>
+        <w:t>cd src/auction-system</w:t>
+      </w:r>
+    </w:p>
+    <w:p>
+      <w:pPr>
+        <w:ind w:left="2001" w:hanging="1281"/>
+      </w:pPr>
+      <w:r>
+        <w:t>mvn spring-boot:run</w:t>
+      </w:r>
+    </w:p>
+    <w:p>
+      <w:pPr>
+        <w:ind w:left="720" w:firstLine="0"/>
         <w:jc w:val="both"/>
         <w:rPr>
           <w:lang w:val="en-US"/>
         </w:rPr>
       </w:pPr>
       <w:r>
-        <w:lastRenderedPageBreak/>
-        <w:t>Sau khi chạy thành công:</w:t>
+        <w:t>Sau khi thấy Started AuctionSystemApplication trong log → </w:t>
+      </w:r>
+      <w:r>
+        <w:rPr>
+          <w:b/>
+        </w:rPr>
+        <w:t>dừng server (Ctrl+C)</w:t>
+      </w:r>
+      <w:r>
+        <w:t>.</w:t>
       </w:r>
       <w:r>
         <w:rPr>
           <w:lang w:val="en-US"/>
         </w:rPr>
         <w:t xml:space="preserve"> </w:t>
+      </w:r>
+      <w:r>
+        <w:t>Lúc này Hibernate đã tự tạo toàn bộ bảng trong auction_db.</w:t>
+      </w:r>
+    </w:p>
+    <w:p>
+      <w:pPr>
+        <w:ind w:left="720" w:firstLine="0"/>
+        <w:rPr>
+          <w:lang w:val="en-US"/>
+        </w:rPr>
+      </w:pPr>
+    </w:p>
+    <w:p>
+      <w:pPr>
+        <w:ind w:left="720" w:firstLine="0"/>
+        <w:rPr>
+          <w:lang w:val="en-US"/>
+        </w:rPr>
+      </w:pPr>
+    </w:p>
+    <w:p>
+      <w:pPr>
+        <w:ind w:left="720" w:firstLine="0"/>
+        <w:rPr>
+          <w:lang w:val="en-US"/>
+        </w:rPr>
+      </w:pPr>
+    </w:p>
+    <w:p>
+      <w:pPr>
+        <w:ind w:left="2001" w:hanging="1281"/>
+        <w:rPr>
+          <w:b/>
+          <w:lang w:val="en-US"/>
+        </w:rPr>
+      </w:pPr>
+      <w:r>
+        <w:rPr>
+          <w:b/>
+        </w:rPr>
+        <w:t>Bước 5: Import dữ liệu mẫu</w:t>
+      </w:r>
+    </w:p>
+    <w:p>
+      <w:pPr>
+        <w:ind w:left="720" w:firstLine="0"/>
+        <w:jc w:val="both"/>
+        <w:rPr>
+          <w:bCs w:val="0"/>
+          <w:lang w:val="en-US"/>
+        </w:rPr>
+      </w:pPr>
+      <w:r>
+        <w:rPr>
+          <w:bCs w:val="0"/>
+          <w:lang w:val="en-US"/>
+        </w:rPr>
+        <w:t>Mở file MySQL, chọn database auction_db và import file:</w:t>
+      </w:r>
+      <w:r>
+        <w:rPr>
+          <w:bCs w:val="0"/>
+          <w:lang w:val="en-US"/>
+        </w:rPr>
+        <w:t xml:space="preserve"> </w:t>
+      </w:r>
+      <w:r>
+        <w:rPr>
+          <w:bCs w:val="0"/>
+          <w:lang w:val="en-US"/>
+        </w:rPr>
+        <w:t>src/database/DbReset</w:t>
+      </w:r>
+    </w:p>
+    <w:p>
+      <w:pPr>
+        <w:ind w:hanging="572"/>
+      </w:pPr>
+      <w:r>
+        <w:rPr>
+          <w:b/>
+        </w:rPr>
+        <w:t>Bước 6: Chạy lại Backend</w:t>
+      </w:r>
+    </w:p>
+    <w:p>
+      <w:pPr>
+        <w:ind w:left="2001" w:hanging="1281"/>
+      </w:pPr>
+      <w:r>
+        <w:t>cd src/auction-system</w:t>
+      </w:r>
+    </w:p>
+    <w:p>
+      <w:pPr>
+        <w:ind w:left="2001" w:hanging="1281"/>
+      </w:pPr>
+      <w:r>
+        <w:t>mvn spring-boot:run</w:t>
+      </w:r>
+    </w:p>
+    <w:p>
+      <w:pPr>
+        <w:ind w:left="2001" w:hanging="1281"/>
+      </w:pPr>
+      <w:r>
+        <w:t>Backend chạy tại: </w:t>
       </w:r>
       <w:hyperlink r:id="rId5" w:history="1">
         <w:r>
@@ -394,24 +459,57 @@
           <w:t>http://localhost:8080</w:t>
         </w:r>
       </w:hyperlink>
-      <w:r>
-        <w:rPr>
-          <w:lang w:val="en-US"/>
-        </w:rPr>
-        <w:t xml:space="preserve">. </w:t>
-      </w:r>
-      <w:r>
-        <w:t xml:space="preserve">Chạy thành công lần đầu, Hibernate tự động tạo toàn bộ bảng trong database. Sau đó </w:t>
-      </w:r>
-      <w:r>
-        <w:rPr>
-          <w:bCs w:val="0"/>
-        </w:rPr>
-        <w:t>dừng server</w:t>
-      </w:r>
-      <w:r>
-        <w:t>, mở MySQL, chọn database auction_db và import file DbReset_full.sql (nằm trong thư mục src/database/) để nạp dữ liệu mẫu. Tiếp tục chạy lại server sau khi import xong.</w:t>
-      </w:r>
+    </w:p>
+    <w:p>
+      <w:pPr>
+        <w:ind w:left="2001" w:hanging="1281"/>
+      </w:pPr>
+      <w:r>
+        <w:rPr>
+          <w:b/>
+        </w:rPr>
+        <w:t>Bước 7: Chạy Frontend</w:t>
+      </w:r>
+    </w:p>
+    <w:p>
+      <w:pPr>
+        <w:ind w:left="2001" w:hanging="1281"/>
+      </w:pPr>
+      <w:r>
+        <w:t>cd src/auction-system/auction-ui</w:t>
+      </w:r>
+    </w:p>
+    <w:p>
+      <w:pPr>
+        <w:ind w:left="2001" w:hanging="1281"/>
+      </w:pPr>
+      <w:r>
+        <w:t>npm install</w:t>
+      </w:r>
+    </w:p>
+    <w:p>
+      <w:pPr>
+        <w:ind w:left="2001" w:hanging="1281"/>
+      </w:pPr>
+      <w:r>
+        <w:t>npm start</w:t>
+      </w:r>
+    </w:p>
+    <w:p>
+      <w:pPr>
+        <w:ind w:left="2001" w:hanging="1281"/>
+      </w:pPr>
+      <w:r>
+        <w:t>Frontend chạy tại: </w:t>
+      </w:r>
+      <w:hyperlink r:id="rId6" w:history="1">
+        <w:r>
+          <w:rPr>
+            <w:rStyle w:val="Hyperlink"/>
+          </w:rPr>
+          <w:t>http://localhost:3000</w:t>
+        </w:r>
+      </w:hyperlink>
     </w:p>
     <w:p>
       <w:pPr>
@@ -423,79 +521,82 @@
       <w:r>
         <w:rPr>
           <w:b/>
-        </w:rPr>
-        <w:t>6. Chạy Frontend</w:t>
+          <w:lang w:val="en-US"/>
+        </w:rPr>
+        <w:t>4</w:t>
+      </w:r>
+      <w:r>
+        <w:rPr>
+          <w:b/>
+        </w:rPr>
+        <w:t>. Tài khoản đăng nhập thử nghiệm</w:t>
       </w:r>
     </w:p>
     <w:p>
       <w:pPr>
         <w:ind w:hanging="714"/>
-      </w:pPr>
-      <w:r>
-        <w:t>Di chuyển tới thư mục frontend:</w:t>
-      </w:r>
-      <w:r>
-        <w:rPr>
-          <w:lang w:val="en-US"/>
-        </w:rPr>
-        <w:t xml:space="preserve"> </w:t>
-      </w:r>
-      <w:r>
-        <w:t>cd src/frontend</w:t>
+        <w:rPr>
+          <w:b/>
+        </w:rPr>
+      </w:pPr>
+      <w:r>
+        <w:rPr>
+          <w:b/>
+        </w:rPr>
+        <w:t>Quản trị viên</w:t>
+      </w:r>
+    </w:p>
+    <w:p>
+      <w:r>
+        <w:t>Email: admin@gmail.com</w:t>
+      </w:r>
+    </w:p>
+    <w:p>
+      <w:r>
+        <w:t>Password: 123456</w:t>
       </w:r>
     </w:p>
     <w:p>
       <w:pPr>
         <w:ind w:hanging="714"/>
-      </w:pPr>
-      <w:r>
-        <w:t>Cài dependencies:</w:t>
-      </w:r>
-      <w:r>
-        <w:rPr>
-          <w:lang w:val="en-US"/>
-        </w:rPr>
-        <w:t xml:space="preserve"> </w:t>
-      </w:r>
-      <w:r>
-        <w:t>npm install</w:t>
-      </w:r>
-    </w:p>
-    <w:p>
-      <w:pPr>
-        <w:ind w:hanging="714"/>
-      </w:pPr>
-      <w:r>
-        <w:t>Khởi động project:</w:t>
-      </w:r>
-      <w:r>
-        <w:rPr>
-          <w:lang w:val="en-US"/>
-        </w:rPr>
-        <w:t xml:space="preserve"> </w:t>
-      </w:r>
-      <w:r>
-        <w:t>npm start</w:t>
-      </w:r>
-    </w:p>
-    <w:p>
-      <w:pPr>
-        <w:ind w:hanging="714"/>
-        <w:rPr>
-          <w:lang w:val="en-US"/>
-        </w:rPr>
-      </w:pPr>
-      <w:r>
-        <w:t>Sau khi chạy thành công:</w:t>
-      </w:r>
-      <w:r>
-        <w:rPr>
-          <w:lang w:val="en-US"/>
-        </w:rPr>
-        <w:t xml:space="preserve"> </w:t>
-      </w:r>
-      <w:r>
-        <w:t>http://localhost:3000</w:t>
+        <w:rPr>
+          <w:b/>
+        </w:rPr>
+      </w:pPr>
+      <w:r>
+        <w:rPr>
+          <w:b/>
+        </w:rPr>
+        <w:t>Người dùng</w:t>
+      </w:r>
+    </w:p>
+    <w:p>
+      <w:r>
+        <w:t>Email: buyer1@gmail.com</w:t>
+      </w:r>
+    </w:p>
+    <w:p>
+      <w:r>
+        <w:t>Password: 123456</w:t>
+      </w:r>
+    </w:p>
+    <w:p>
+      <w:pPr>
+        <w:ind w:left="2205" w:hanging="1281"/>
+      </w:pPr>
+      <w:r>
+        <w:t>Email: shopabc@gmail.com</w:t>
+      </w:r>
+    </w:p>
+    <w:p>
+      <w:pPr>
+        <w:ind w:left="2205" w:hanging="1281"/>
+        <w:rPr>
+          <w:lang w:val="en-US"/>
+        </w:rPr>
+      </w:pPr>
+      <w:r>
+        <w:t>Password: 123456</w:t>
       </w:r>
     </w:p>
     <w:p>
@@ -508,89 +609,15 @@
       <w:r>
         <w:rPr>
           <w:b/>
-        </w:rPr>
-        <w:t>7. Tài khoản đăng nhập thử nghiệm</w:t>
-      </w:r>
-    </w:p>
-    <w:p>
-      <w:pPr>
-        <w:ind w:hanging="714"/>
-        <w:rPr>
-          <w:b/>
-        </w:rPr>
-      </w:pPr>
-      <w:r>
-        <w:rPr>
-          <w:b/>
-        </w:rPr>
-        <w:t>Quản trị viên</w:t>
-      </w:r>
-    </w:p>
-    <w:p>
-      <w:r>
-        <w:t>Email: admin@gmail.com</w:t>
-      </w:r>
-    </w:p>
-    <w:p>
-      <w:r>
-        <w:t>Password: 123456</w:t>
-      </w:r>
-    </w:p>
-    <w:p>
-      <w:pPr>
-        <w:ind w:hanging="714"/>
-        <w:rPr>
-          <w:b/>
-        </w:rPr>
-      </w:pPr>
-      <w:r>
-        <w:rPr>
-          <w:b/>
-        </w:rPr>
-        <w:t>Người dùng</w:t>
-      </w:r>
-    </w:p>
-    <w:p>
-      <w:r>
-        <w:t>Email: buyer1@gmail.com</w:t>
-      </w:r>
-    </w:p>
-    <w:p>
-      <w:r>
-        <w:t>Password: 123456</w:t>
-      </w:r>
-    </w:p>
-    <w:p>
-      <w:pPr>
-        <w:ind w:left="2205" w:hanging="1281"/>
-      </w:pPr>
-      <w:r>
-        <w:t>Email: shopabc@gmail.com</w:t>
-      </w:r>
-    </w:p>
-    <w:p>
-      <w:pPr>
-        <w:ind w:left="2205" w:hanging="1281"/>
-        <w:rPr>
-          <w:lang w:val="en-US"/>
-        </w:rPr>
-      </w:pPr>
-      <w:r>
-        <w:t>Password: 123456</w:t>
-      </w:r>
-    </w:p>
-    <w:p>
-      <w:pPr>
-        <w:ind w:hanging="1281"/>
-        <w:rPr>
-          <w:b/>
-        </w:rPr>
-      </w:pPr>
-      <w:r>
-        <w:rPr>
-          <w:b/>
-        </w:rPr>
-        <w:t>8. Hướng dẫn chức năng</w:t>
+          <w:lang w:val="en-US"/>
+        </w:rPr>
+        <w:t>5</w:t>
+      </w:r>
+      <w:r>
+        <w:rPr>
+          <w:b/>
+        </w:rPr>
+        <w:t>. Hướng dẫn chức năng</w:t>
       </w:r>
     </w:p>
     <w:p>
@@ -603,8 +630,15 @@
       <w:r>
         <w:rPr>
           <w:b/>
-        </w:rPr>
-        <w:t>8.1 Đăng ký tài khoản</w:t>
+          <w:lang w:val="en-US"/>
+        </w:rPr>
+        <w:t>5</w:t>
+      </w:r>
+      <w:r>
+        <w:rPr>
+          <w:b/>
+        </w:rPr>
+        <w:t>.1 Đăng ký tài khoản</w:t>
       </w:r>
     </w:p>
     <w:p>
@@ -684,8 +718,15 @@
       <w:r>
         <w:rPr>
           <w:b/>
-        </w:rPr>
-        <w:t>8.2 Đăng nhập</w:t>
+          <w:lang w:val="en-US"/>
+        </w:rPr>
+        <w:t>5</w:t>
+      </w:r>
+      <w:r>
+        <w:rPr>
+          <w:b/>
+        </w:rPr>
+        <w:t>.2 Đăng nhập</w:t>
       </w:r>
     </w:p>
     <w:p>
@@ -705,6 +746,7 @@
         </w:numPr>
       </w:pPr>
       <w:r>
+        <w:lastRenderedPageBreak/>
         <w:t>Email</w:t>
       </w:r>
     </w:p>
@@ -741,9 +783,15 @@
       <w:r>
         <w:rPr>
           <w:b/>
-        </w:rPr>
-        <w:lastRenderedPageBreak/>
-        <w:t>8.3 Xem danh sách sản phẩm</w:t>
+          <w:lang w:val="en-US"/>
+        </w:rPr>
+        <w:t>5</w:t>
+      </w:r>
+      <w:r>
+        <w:rPr>
+          <w:b/>
+        </w:rPr>
+        <w:t>.3 Xem danh sách sản phẩm</w:t>
       </w:r>
     </w:p>
     <w:p>
@@ -800,8 +848,15 @@
       <w:r>
         <w:rPr>
           <w:b/>
-        </w:rPr>
-        <w:t>8.4 Tìm kiếm sản phẩm</w:t>
+          <w:lang w:val="en-US"/>
+        </w:rPr>
+        <w:t>5</w:t>
+      </w:r>
+      <w:r>
+        <w:rPr>
+          <w:b/>
+        </w:rPr>
+        <w:t>.4 Tìm kiếm sản phẩm</w:t>
       </w:r>
     </w:p>
     <w:p>
@@ -858,8 +913,15 @@
       <w:r>
         <w:rPr>
           <w:b/>
-        </w:rPr>
-        <w:t>8.5 Tham gia đấu giá</w:t>
+          <w:lang w:val="en-US"/>
+        </w:rPr>
+        <w:t>5</w:t>
+      </w:r>
+      <w:r>
+        <w:rPr>
+          <w:b/>
+        </w:rPr>
+        <w:t>.5 Tham gia đấu giá</w:t>
       </w:r>
     </w:p>
     <w:p>
@@ -876,9 +938,6 @@
           <w:ilvl w:val="0"/>
           <w:numId w:val="8"/>
         </w:numPr>
-        <w:tabs>
-          <w:tab w:val="num" w:pos="720"/>
-        </w:tabs>
       </w:pPr>
       <w:r>
         <w:t>Chọn sản phẩm</w:t>
@@ -890,9 +949,6 @@
           <w:ilvl w:val="0"/>
           <w:numId w:val="8"/>
         </w:numPr>
-        <w:tabs>
-          <w:tab w:val="num" w:pos="720"/>
-        </w:tabs>
       </w:pPr>
       <w:r>
         <w:t>Nhập mức giá muốn đặt</w:t>
@@ -904,9 +960,6 @@
           <w:ilvl w:val="0"/>
           <w:numId w:val="8"/>
         </w:numPr>
-        <w:tabs>
-          <w:tab w:val="num" w:pos="720"/>
-        </w:tabs>
       </w:pPr>
       <w:r>
         <w:t>Xác nhận đặt giá</w:t>
@@ -972,8 +1025,15 @@
       <w:r>
         <w:rPr>
           <w:b/>
-        </w:rPr>
-        <w:t>8.6 Người bán đăng sản phẩm</w:t>
+          <w:lang w:val="en-US"/>
+        </w:rPr>
+        <w:t>5</w:t>
+      </w:r>
+      <w:r>
+        <w:rPr>
+          <w:b/>
+        </w:rPr>
+        <w:t>.6 Người bán đăng sản phẩm</w:t>
       </w:r>
     </w:p>
     <w:p>
@@ -1064,6 +1124,7 @@
         </w:rPr>
       </w:pPr>
       <w:r>
+        <w:lastRenderedPageBreak/>
         <w:t>Sản phẩm chuyển sang trạng thái:</w:t>
       </w:r>
       <w:r>
@@ -1078,22 +1139,6 @@
     </w:p>
     <w:p>
       <w:pPr>
-        <w:ind w:hanging="714"/>
-        <w:rPr>
-          <w:lang w:val="en-US"/>
-        </w:rPr>
-      </w:pPr>
-    </w:p>
-    <w:p>
-      <w:pPr>
-        <w:ind w:hanging="714"/>
-        <w:rPr>
-          <w:lang w:val="en-US"/>
-        </w:rPr>
-      </w:pPr>
-    </w:p>
-    <w:p>
-      <w:pPr>
         <w:ind w:hanging="997"/>
         <w:rPr>
           <w:b/>
@@ -1102,9 +1147,15 @@
       <w:r>
         <w:rPr>
           <w:b/>
-        </w:rPr>
-        <w:lastRenderedPageBreak/>
-        <w:t>8.7 Admin duyệt sản phẩm</w:t>
+          <w:lang w:val="en-US"/>
+        </w:rPr>
+        <w:t>5</w:t>
+      </w:r>
+      <w:r>
+        <w:rPr>
+          <w:b/>
+        </w:rPr>
+        <w:t>.7 Admin duyệt sản phẩm</w:t>
       </w:r>
     </w:p>
     <w:p>
@@ -1141,7 +1192,8 @@
     </w:p>
     <w:p>
       <w:pPr>
-        <w:ind w:left="0" w:firstLine="924"/>
+        <w:ind w:left="0" w:firstLine="567"/>
+        <w:jc w:val="both"/>
       </w:pPr>
       <w:r>
         <w:t>Sau khi duyệt:</w:t>
@@ -1184,8 +1236,15 @@
       <w:r>
         <w:rPr>
           <w:b/>
-        </w:rPr>
-        <w:t>8.8 Kết thúc đấu giá</w:t>
+          <w:lang w:val="en-US"/>
+        </w:rPr>
+        <w:t>5</w:t>
+      </w:r>
+      <w:r>
+        <w:rPr>
+          <w:b/>
+        </w:rPr>
+        <w:t>.8 Kết thúc đấu giá</w:t>
       </w:r>
     </w:p>
     <w:p>
@@ -1337,8 +1396,15 @@
       <w:r>
         <w:rPr>
           <w:b/>
-        </w:rPr>
-        <w:t>8.9 Quản lý đơn hàng</w:t>
+          <w:lang w:val="en-US"/>
+        </w:rPr>
+        <w:t>5</w:t>
+      </w:r>
+      <w:r>
+        <w:rPr>
+          <w:b/>
+        </w:rPr>
+        <w:t>.9 Quản lý đơn hàng</w:t>
       </w:r>
     </w:p>
     <w:p>
@@ -1414,6 +1480,389 @@
     </w:p>
     <w:p>
       <w:pPr>
+        <w:ind w:left="0" w:firstLine="0"/>
+        <w:rPr>
+          <w:b/>
+        </w:rPr>
+      </w:pPr>
+      <w:r>
+        <w:rPr>
+          <w:b/>
+          <w:lang w:val="en-US"/>
+        </w:rPr>
+        <w:t>6</w:t>
+      </w:r>
+      <w:r>
+        <w:rPr>
+          <w:b/>
+        </w:rPr>
+        <w:t>. Kiểm thử Mua ngay đồng thời</w:t>
+      </w:r>
+    </w:p>
+    <w:p>
+      <w:pPr>
+        <w:ind w:left="0" w:firstLine="567"/>
+        <w:jc w:val="both"/>
+        <w:rPr>
+          <w:lang w:val="en-US"/>
+        </w:rPr>
+      </w:pPr>
+      <w:r>
+        <w:t xml:space="preserve">Script </w:t>
+      </w:r>
+      <w:r>
+        <w:rPr>
+          <w:lang w:val="en-US"/>
+        </w:rPr>
+        <w:t>test_buy_now_concurrent.py</w:t>
+      </w:r>
+      <w:r>
+        <w:t xml:space="preserve"> kiểm tra tính đúng đắn của cơ chế Optimistic Locking: nhiều người dùng cùng nhấn "Mua ngay" một lúc, hệ thống chỉ cho phép đúng 1 người mua thành công.</w:t>
+      </w:r>
+    </w:p>
+    <w:p>
+      <w:pPr>
+        <w:ind w:left="0" w:firstLine="567"/>
+        <w:jc w:val="both"/>
+        <w:rPr>
+          <w:lang w:val="en-US"/>
+        </w:rPr>
+      </w:pPr>
+    </w:p>
+    <w:p>
+      <w:pPr>
+        <w:ind w:left="567" w:firstLine="0"/>
+        <w:rPr>
+          <w:b/>
+        </w:rPr>
+      </w:pPr>
+      <w:r>
+        <w:rPr>
+          <w:b/>
+        </w:rPr>
+        <w:lastRenderedPageBreak/>
+        <w:t>Yêu cầu</w:t>
+      </w:r>
+    </w:p>
+    <w:p>
+      <w:pPr>
+        <w:numPr>
+          <w:ilvl w:val="0"/>
+          <w:numId w:val="29"/>
+        </w:numPr>
+        <w:ind w:left="1287"/>
+      </w:pPr>
+      <w:r>
+        <w:t xml:space="preserve">Thư viện </w:t>
+      </w:r>
+      <w:r>
+        <w:rPr>
+          <w:lang w:val="en-US"/>
+        </w:rPr>
+        <w:t>aiohttp</w:t>
+      </w:r>
+      <w:r>
+        <w:t xml:space="preserve">: </w:t>
+      </w:r>
+      <w:r>
+        <w:rPr>
+          <w:lang w:val="en-US"/>
+        </w:rPr>
+        <w:t>pip install aiohttp</w:t>
+      </w:r>
+    </w:p>
+    <w:p>
+      <w:pPr>
+        <w:numPr>
+          <w:ilvl w:val="0"/>
+          <w:numId w:val="29"/>
+        </w:numPr>
+        <w:ind w:left="1287"/>
+      </w:pPr>
+      <w:r>
+        <w:t>Backend Spring Boot đang chạy tại localhost:8080</w:t>
+      </w:r>
+    </w:p>
+    <w:p>
+      <w:pPr>
+        <w:numPr>
+          <w:ilvl w:val="0"/>
+          <w:numId w:val="29"/>
+        </w:numPr>
+        <w:ind w:left="1287"/>
+      </w:pPr>
+      <w:r>
+        <w:t xml:space="preserve">Database đã import </w:t>
+      </w:r>
+      <w:r>
+        <w:rPr>
+          <w:lang w:val="en-US"/>
+        </w:rPr>
+        <w:t>DbReset_full.sql</w:t>
+      </w:r>
+    </w:p>
+    <w:p>
+      <w:pPr>
+        <w:ind w:left="567" w:firstLine="0"/>
+        <w:rPr>
+          <w:b/>
+        </w:rPr>
+      </w:pPr>
+      <w:r>
+        <w:rPr>
+          <w:b/>
+        </w:rPr>
+        <w:t>Các bước chạy</w:t>
+      </w:r>
+    </w:p>
+    <w:p>
+      <w:pPr>
+        <w:numPr>
+          <w:ilvl w:val="0"/>
+          <w:numId w:val="30"/>
+        </w:numPr>
+        <w:tabs>
+          <w:tab w:val="clear" w:pos="720"/>
+          <w:tab w:val="num" w:pos="1647"/>
+        </w:tabs>
+        <w:ind w:left="1287"/>
+      </w:pPr>
+      <w:r>
+        <w:t xml:space="preserve">Cài thư viện (chỉ cần làm 1 lần): </w:t>
+      </w:r>
+      <w:r>
+        <w:rPr>
+          <w:lang w:val="en-US"/>
+        </w:rPr>
+        <w:t>pip install aiohttp</w:t>
+      </w:r>
+    </w:p>
+    <w:p>
+      <w:pPr>
+        <w:numPr>
+          <w:ilvl w:val="0"/>
+          <w:numId w:val="30"/>
+        </w:numPr>
+        <w:tabs>
+          <w:tab w:val="clear" w:pos="720"/>
+          <w:tab w:val="num" w:pos="1287"/>
+        </w:tabs>
+        <w:ind w:left="1287"/>
+      </w:pPr>
+      <w:r>
+        <w:t xml:space="preserve">Mở terminal tại thư mục </w:t>
+      </w:r>
+      <w:r>
+        <w:rPr>
+          <w:lang w:val="en-US"/>
+        </w:rPr>
+        <w:t>src/auction-system</w:t>
+      </w:r>
+    </w:p>
+    <w:p>
+      <w:pPr>
+        <w:numPr>
+          <w:ilvl w:val="0"/>
+          <w:numId w:val="30"/>
+        </w:numPr>
+        <w:tabs>
+          <w:tab w:val="clear" w:pos="720"/>
+          <w:tab w:val="num" w:pos="1287"/>
+        </w:tabs>
+        <w:ind w:left="1287"/>
+      </w:pPr>
+      <w:r>
+        <w:t xml:space="preserve">Chạy lệnh: </w:t>
+      </w:r>
+      <w:r>
+        <w:rPr>
+          <w:lang w:val="en-US"/>
+        </w:rPr>
+        <w:t>python test_buy_now_concurrent.py</w:t>
+      </w:r>
+    </w:p>
+    <w:p>
+      <w:pPr>
+        <w:ind w:left="567" w:firstLine="0"/>
+        <w:rPr>
+          <w:b/>
+        </w:rPr>
+      </w:pPr>
+      <w:r>
+        <w:rPr>
+          <w:b/>
+        </w:rPr>
+        <w:t>Kết quả mong đợi</w:t>
+      </w:r>
+    </w:p>
+    <w:p>
+      <w:pPr>
+        <w:numPr>
+          <w:ilvl w:val="0"/>
+          <w:numId w:val="29"/>
+        </w:numPr>
+        <w:ind w:left="1287"/>
+        <w:jc w:val="both"/>
+      </w:pPr>
+      <w:r>
+        <w:t xml:space="preserve">Đúng 1 người nhận </w:t>
+      </w:r>
+      <w:r>
+        <w:rPr>
+          <w:lang w:val="en-US"/>
+        </w:rPr>
+        <w:t>HTTP 200</w:t>
+      </w:r>
+      <w:r>
+        <w:t xml:space="preserve"> </w:t>
+      </w:r>
+      <w:r>
+        <w:rPr>
+          <w:lang w:val="en-US"/>
+        </w:rPr>
+        <w:t>–</w:t>
+      </w:r>
+      <w:r>
+        <w:t xml:space="preserve"> mua thành công</w:t>
+      </w:r>
+    </w:p>
+    <w:p>
+      <w:pPr>
+        <w:numPr>
+          <w:ilvl w:val="0"/>
+          <w:numId w:val="29"/>
+        </w:numPr>
+        <w:ind w:left="1287"/>
+        <w:jc w:val="both"/>
+      </w:pPr>
+      <w:r>
+        <w:t xml:space="preserve">3 người còn lại nhận </w:t>
+      </w:r>
+      <w:r>
+        <w:rPr>
+          <w:lang w:val="en-US"/>
+        </w:rPr>
+        <w:t>HTTP 400</w:t>
+      </w:r>
+      <w:r>
+        <w:t xml:space="preserve"> </w:t>
+      </w:r>
+      <w:r>
+        <w:rPr>
+          <w:lang w:val="en-US"/>
+        </w:rPr>
+        <w:t>–</w:t>
+      </w:r>
+      <w:r>
+        <w:t xml:space="preserve"> phiên đã kết thúc (Auction is not active)</w:t>
+      </w:r>
+    </w:p>
+    <w:p>
+      <w:pPr>
+        <w:numPr>
+          <w:ilvl w:val="0"/>
+          <w:numId w:val="29"/>
+        </w:numPr>
+        <w:ind w:left="1287"/>
+        <w:jc w:val="both"/>
+      </w:pPr>
+      <w:r>
+        <w:t>Kết quả in ra</w:t>
+      </w:r>
+      <w:r>
+        <w:rPr>
+          <w:lang w:val="en-US"/>
+        </w:rPr>
+        <w:t xml:space="preserve"> </w:t>
+      </w:r>
+      <w:r>
+        <w:rPr>
+          <w:lang w:val="en-US"/>
+        </w:rPr>
+        <w:t>ĐẠT</w:t>
+      </w:r>
+      <w:r>
+        <w:t xml:space="preserve"> xác nhận Optimistic Locking hoạt động đúng</w:t>
+      </w:r>
+    </w:p>
+    <w:p>
+      <w:pPr>
+        <w:ind w:left="567" w:firstLine="0"/>
+        <w:rPr>
+          <w:b/>
+        </w:rPr>
+      </w:pPr>
+      <w:r>
+        <w:rPr>
+          <w:b/>
+        </w:rPr>
+        <w:t>Lưu ý</w:t>
+      </w:r>
+    </w:p>
+    <w:p>
+      <w:pPr>
+        <w:numPr>
+          <w:ilvl w:val="0"/>
+          <w:numId w:val="29"/>
+        </w:numPr>
+        <w:ind w:left="1287"/>
+        <w:jc w:val="both"/>
+      </w:pPr>
+      <w:r>
+        <w:t xml:space="preserve">Mỗi lần chạy </w:t>
+      </w:r>
+      <w:r>
+        <w:rPr>
+          <w:lang w:val="en-US"/>
+        </w:rPr>
+        <w:t>thử</w:t>
+      </w:r>
+      <w:r>
+        <w:t xml:space="preserve"> xong, phiên đấu giá sẽ chuyển sang trạng thái SOLD. Cần import lại </w:t>
+      </w:r>
+      <w:r>
+        <w:rPr>
+          <w:lang w:val="en-US"/>
+        </w:rPr>
+        <w:t>DbReset_full.sql</w:t>
+      </w:r>
+      <w:r>
+        <w:t xml:space="preserve"> để chạy lại từ đầu</w:t>
+      </w:r>
+    </w:p>
+    <w:p>
+      <w:pPr>
+        <w:numPr>
+          <w:ilvl w:val="0"/>
+          <w:numId w:val="29"/>
+        </w:numPr>
+        <w:ind w:left="1287"/>
+        <w:jc w:val="both"/>
+      </w:pPr>
+      <w:r>
+        <w:t xml:space="preserve">Có thể đổi </w:t>
+      </w:r>
+      <w:r>
+        <w:rPr>
+          <w:lang w:val="en-US"/>
+        </w:rPr>
+        <w:t>AUCTION_ID</w:t>
+      </w:r>
+      <w:r>
+        <w:t xml:space="preserve"> trong script để </w:t>
+      </w:r>
+      <w:r>
+        <w:rPr>
+          <w:lang w:val="en-US"/>
+        </w:rPr>
+        <w:t>kiểm thử</w:t>
+      </w:r>
+      <w:r>
+        <w:t xml:space="preserve"> các phiên khác: 2 (Samsung S24 Ultra), 6 (Dell XPS 15 9530), 10 (iPad Pro M4), 11 (Samsung Tab S9 Ultra)</w:t>
+      </w:r>
+    </w:p>
+    <w:p>
+      <w:pPr>
         <w:ind w:hanging="1281"/>
         <w:rPr>
           <w:b/>
@@ -1424,7 +1873,7 @@
           <w:b/>
           <w:lang w:val="en-US"/>
         </w:rPr>
-        <w:t>9</w:t>
+        <w:t>7</w:t>
       </w:r>
       <w:r>
         <w:rPr>
@@ -1456,8 +1905,8 @@
       <w:pPr>
         <w:pStyle w:val="ListParagraph"/>
         <w:numPr>
-          <w:ilvl w:val="0"/>
-          <w:numId w:val="26"/>
+          <w:ilvl w:val="1"/>
+          <w:numId w:val="31"/>
         </w:numPr>
       </w:pPr>
       <w:r>
@@ -1468,8 +1917,8 @@
       <w:pPr>
         <w:pStyle w:val="ListParagraph"/>
         <w:numPr>
-          <w:ilvl w:val="0"/>
-          <w:numId w:val="26"/>
+          <w:ilvl w:val="1"/>
+          <w:numId w:val="31"/>
         </w:numPr>
       </w:pPr>
       <w:r>
@@ -1480,8 +1929,8 @@
       <w:pPr>
         <w:pStyle w:val="ListParagraph"/>
         <w:numPr>
-          <w:ilvl w:val="0"/>
-          <w:numId w:val="26"/>
+          <w:ilvl w:val="1"/>
+          <w:numId w:val="31"/>
         </w:numPr>
       </w:pPr>
       <w:r>
@@ -1499,7 +1948,6 @@
         <w:rPr>
           <w:b/>
         </w:rPr>
-        <w:lastRenderedPageBreak/>
         <w:t>Lỗi Frontend không chạy</w:t>
       </w:r>
     </w:p>
@@ -2931,19 +3379,19 @@
       <w:lvlText w:val=""/>
       <w:lvlJc w:val="left"/>
       <w:pPr>
-        <w:ind w:left="1284" w:hanging="360"/>
+        <w:ind w:left="720" w:hanging="360"/>
       </w:pPr>
       <w:rPr>
         <w:rFonts w:ascii="Symbol" w:hAnsi="Symbol" w:hint="default"/>
       </w:rPr>
     </w:lvl>
-    <w:lvl w:ilvl="1" w:tplc="042A0003" w:tentative="1">
+    <w:lvl w:ilvl="1" w:tplc="042A0003">
       <w:start w:val="1"/>
       <w:numFmt w:val="bullet"/>
       <w:lvlText w:val="o"/>
       <w:lvlJc w:val="left"/>
       <w:pPr>
-        <w:ind w:left="2004" w:hanging="360"/>
+        <w:ind w:left="1440" w:hanging="360"/>
       </w:pPr>
       <w:rPr>
         <w:rFonts w:ascii="Courier New" w:hAnsi="Courier New" w:cs="Courier New" w:hint="default"/>
@@ -2955,7 +3403,7 @@
       <w:lvlText w:val=""/>
       <w:lvlJc w:val="left"/>
       <w:pPr>
-        <w:ind w:left="2724" w:hanging="360"/>
+        <w:ind w:left="2160" w:hanging="360"/>
       </w:pPr>
       <w:rPr>
         <w:rFonts w:ascii="Wingdings" w:hAnsi="Wingdings" w:hint="default"/>
@@ -2967,7 +3415,7 @@
       <w:lvlText w:val=""/>
       <w:lvlJc w:val="left"/>
       <w:pPr>
-        <w:ind w:left="3444" w:hanging="360"/>
+        <w:ind w:left="2880" w:hanging="360"/>
       </w:pPr>
       <w:rPr>
         <w:rFonts w:ascii="Symbol" w:hAnsi="Symbol" w:hint="default"/>
@@ -2979,7 +3427,7 @@
       <w:lvlText w:val="o"/>
       <w:lvlJc w:val="left"/>
       <w:pPr>
-        <w:ind w:left="4164" w:hanging="360"/>
+        <w:ind w:left="3600" w:hanging="360"/>
       </w:pPr>
       <w:rPr>
         <w:rFonts w:ascii="Courier New" w:hAnsi="Courier New" w:cs="Courier New" w:hint="default"/>
@@ -2991,7 +3439,7 @@
       <w:lvlText w:val=""/>
       <w:lvlJc w:val="left"/>
       <w:pPr>
-        <w:ind w:left="4884" w:hanging="360"/>
+        <w:ind w:left="4320" w:hanging="360"/>
       </w:pPr>
       <w:rPr>
         <w:rFonts w:ascii="Wingdings" w:hAnsi="Wingdings" w:hint="default"/>
@@ -3003,7 +3451,7 @@
       <w:lvlText w:val=""/>
       <w:lvlJc w:val="left"/>
       <w:pPr>
-        <w:ind w:left="5604" w:hanging="360"/>
+        <w:ind w:left="5040" w:hanging="360"/>
       </w:pPr>
       <w:rPr>
         <w:rFonts w:ascii="Symbol" w:hAnsi="Symbol" w:hint="default"/>
@@ -3015,7 +3463,7 @@
       <w:lvlText w:val="o"/>
       <w:lvlJc w:val="left"/>
       <w:pPr>
-        <w:ind w:left="6324" w:hanging="360"/>
+        <w:ind w:left="5760" w:hanging="360"/>
       </w:pPr>
       <w:rPr>
         <w:rFonts w:ascii="Courier New" w:hAnsi="Courier New" w:cs="Courier New" w:hint="default"/>
@@ -3027,7 +3475,7 @@
       <w:lvlText w:val=""/>
       <w:lvlJc w:val="left"/>
       <w:pPr>
-        <w:ind w:left="7044" w:hanging="360"/>
+        <w:ind w:left="6480" w:hanging="360"/>
       </w:pPr>
       <w:rPr>
         <w:rFonts w:ascii="Wingdings" w:hAnsi="Wingdings" w:hint="default"/>
@@ -4571,6 +5019,119 @@
     </w:lvl>
   </w:abstractNum>
   <w:abstractNum w:abstractNumId="23" w15:restartNumberingAfterBreak="0">
+    <w:nsid w:val="69B17296"/>
+    <w:multiLevelType w:val="hybridMultilevel"/>
+    <w:tmpl w:val="4894CCB8"/>
+    <w:lvl w:ilvl="0" w:tplc="FFFFFFFF">
+      <w:start w:val="1"/>
+      <w:numFmt w:val="bullet"/>
+      <w:lvlText w:val=""/>
+      <w:lvlJc w:val="left"/>
+      <w:pPr>
+        <w:ind w:left="720" w:hanging="360"/>
+      </w:pPr>
+      <w:rPr>
+        <w:rFonts w:ascii="Symbol" w:hAnsi="Symbol" w:hint="default"/>
+      </w:rPr>
+    </w:lvl>
+    <w:lvl w:ilvl="1" w:tplc="04090001">
+      <w:start w:val="1"/>
+      <w:numFmt w:val="bullet"/>
+      <w:lvlText w:val=""/>
+      <w:lvlJc w:val="left"/>
+      <w:pPr>
+        <w:ind w:left="1440" w:hanging="360"/>
+      </w:pPr>
+      <w:rPr>
+        <w:rFonts w:ascii="Symbol" w:hAnsi="Symbol" w:hint="default"/>
+      </w:rPr>
+    </w:lvl>
+    <w:lvl w:ilvl="2" w:tplc="FFFFFFFF" w:tentative="1">
+      <w:start w:val="1"/>
+      <w:numFmt w:val="bullet"/>
+      <w:lvlText w:val=""/>
+      <w:lvlJc w:val="left"/>
+      <w:pPr>
+        <w:ind w:left="2160" w:hanging="360"/>
+      </w:pPr>
+      <w:rPr>
+        <w:rFonts w:ascii="Wingdings" w:hAnsi="Wingdings" w:hint="default"/>
+      </w:rPr>
+    </w:lvl>
+    <w:lvl w:ilvl="3" w:tplc="FFFFFFFF" w:tentative="1">
+      <w:start w:val="1"/>
+      <w:numFmt w:val="bullet"/>
+      <w:lvlText w:val=""/>
+      <w:lvlJc w:val="left"/>
+      <w:pPr>
+        <w:ind w:left="2880" w:hanging="360"/>
+      </w:pPr>
+      <w:rPr>
+        <w:rFonts w:ascii="Symbol" w:hAnsi="Symbol" w:hint="default"/>
+      </w:rPr>
+    </w:lvl>
+    <w:lvl w:ilvl="4" w:tplc="FFFFFFFF" w:tentative="1">
+      <w:start w:val="1"/>
+      <w:numFmt w:val="bullet"/>
+      <w:lvlText w:val="o"/>
+      <w:lvlJc w:val="left"/>
+      <w:pPr>
+        <w:ind w:left="3600" w:hanging="360"/>
+      </w:pPr>
+      <w:rPr>
+        <w:rFonts w:ascii="Courier New" w:hAnsi="Courier New" w:cs="Courier New" w:hint="default"/>
+      </w:rPr>
+    </w:lvl>
+    <w:lvl w:ilvl="5" w:tplc="FFFFFFFF" w:tentative="1">
+      <w:start w:val="1"/>
+      <w:numFmt w:val="bullet"/>
+      <w:lvlText w:val=""/>
+      <w:lvlJc w:val="left"/>
+      <w:pPr>
+        <w:ind w:left="4320" w:hanging="360"/>
+      </w:pPr>
+      <w:rPr>
+        <w:rFonts w:ascii="Wingdings" w:hAnsi="Wingdings" w:hint="default"/>
+      </w:rPr>
+    </w:lvl>
+    <w:lvl w:ilvl="6" w:tplc="FFFFFFFF" w:tentative="1">
+      <w:start w:val="1"/>
+      <w:numFmt w:val="bullet"/>
+      <w:lvlText w:val=""/>
+      <w:lvlJc w:val="left"/>
+      <w:pPr>
+        <w:ind w:left="5040" w:hanging="360"/>
+      </w:pPr>
+      <w:rPr>
+        <w:rFonts w:ascii="Symbol" w:hAnsi="Symbol" w:hint="default"/>
+      </w:rPr>
+    </w:lvl>
+    <w:lvl w:ilvl="7" w:tplc="FFFFFFFF" w:tentative="1">
+      <w:start w:val="1"/>
+      <w:numFmt w:val="bullet"/>
+      <w:lvlText w:val="o"/>
+      <w:lvlJc w:val="left"/>
+      <w:pPr>
+        <w:ind w:left="5760" w:hanging="360"/>
+      </w:pPr>
+      <w:rPr>
+        <w:rFonts w:ascii="Courier New" w:hAnsi="Courier New" w:cs="Courier New" w:hint="default"/>
+      </w:rPr>
+    </w:lvl>
+    <w:lvl w:ilvl="8" w:tplc="FFFFFFFF" w:tentative="1">
+      <w:start w:val="1"/>
+      <w:numFmt w:val="bullet"/>
+      <w:lvlText w:val=""/>
+      <w:lvlJc w:val="left"/>
+      <w:pPr>
+        <w:ind w:left="6480" w:hanging="360"/>
+      </w:pPr>
+      <w:rPr>
+        <w:rFonts w:ascii="Wingdings" w:hAnsi="Wingdings" w:hint="default"/>
+      </w:rPr>
+    </w:lvl>
+  </w:abstractNum>
+  <w:abstractNum w:abstractNumId="24" w15:restartNumberingAfterBreak="0">
     <w:nsid w:val="6E161EB7"/>
     <w:multiLevelType w:val="hybridMultilevel"/>
     <w:tmpl w:val="06762C32"/>
@@ -4683,7 +5244,7 @@
       </w:rPr>
     </w:lvl>
   </w:abstractNum>
-  <w:abstractNum w:abstractNumId="24" w15:restartNumberingAfterBreak="0">
+  <w:abstractNum w:abstractNumId="25" w15:restartNumberingAfterBreak="0">
     <w:nsid w:val="7A321AD1"/>
     <w:multiLevelType w:val="hybridMultilevel"/>
     <w:tmpl w:val="EC94ACA8"/>
@@ -4796,7 +5357,7 @@
       </w:rPr>
     </w:lvl>
   </w:abstractNum>
-  <w:abstractNum w:abstractNumId="25" w15:restartNumberingAfterBreak="0">
+  <w:abstractNum w:abstractNumId="26" w15:restartNumberingAfterBreak="0">
     <w:nsid w:val="7A61316F"/>
     <w:multiLevelType w:val="hybridMultilevel"/>
     <w:tmpl w:val="58DA159A"/>
@@ -4909,7 +5470,7 @@
       </w:rPr>
     </w:lvl>
   </w:abstractNum>
-  <w:abstractNum w:abstractNumId="26" w15:restartNumberingAfterBreak="0">
+  <w:abstractNum w:abstractNumId="27" w15:restartNumberingAfterBreak="0">
     <w:nsid w:val="7C981C1E"/>
     <w:multiLevelType w:val="multilevel"/>
     <w:tmpl w:val="DAD6C76A"/>
@@ -5058,7 +5619,7 @@
       </w:rPr>
     </w:lvl>
   </w:abstractNum>
-  <w:abstractNum w:abstractNumId="27" w15:restartNumberingAfterBreak="0">
+  <w:abstractNum w:abstractNumId="28" w15:restartNumberingAfterBreak="0">
     <w:nsid w:val="7EA96557"/>
     <w:multiLevelType w:val="multilevel"/>
     <w:tmpl w:val="2BD4EBBC"/>
@@ -5211,7 +5772,7 @@
     <w:abstractNumId w:val="13"/>
   </w:num>
   <w:num w:numId="2" w16cid:durableId="1904559340">
-    <w:abstractNumId w:val="26"/>
+    <w:abstractNumId w:val="27"/>
   </w:num>
   <w:num w:numId="3" w16cid:durableId="1104958712">
     <w:abstractNumId w:val="17"/>
@@ -5232,7 +5793,7 @@
     <w:abstractNumId w:val="11"/>
   </w:num>
   <w:num w:numId="9" w16cid:durableId="539167108">
-    <w:abstractNumId w:val="27"/>
+    <w:abstractNumId w:val="28"/>
   </w:num>
   <w:num w:numId="10" w16cid:durableId="1716153047">
     <w:abstractNumId w:val="18"/>
@@ -5247,7 +5808,7 @@
     <w:abstractNumId w:val="2"/>
   </w:num>
   <w:num w:numId="14" w16cid:durableId="719011476">
-    <w:abstractNumId w:val="23"/>
+    <w:abstractNumId w:val="24"/>
   </w:num>
   <w:num w:numId="15" w16cid:durableId="917980449">
     <w:abstractNumId w:val="21"/>
@@ -5256,7 +5817,7 @@
     <w:abstractNumId w:val="14"/>
   </w:num>
   <w:num w:numId="17" w16cid:durableId="664162679">
-    <w:abstractNumId w:val="25"/>
+    <w:abstractNumId w:val="26"/>
   </w:num>
   <w:num w:numId="18" w16cid:durableId="313336297">
     <w:abstractNumId w:val="5"/>
@@ -5277,7 +5838,7 @@
     <w:abstractNumId w:val="8"/>
   </w:num>
   <w:num w:numId="24" w16cid:durableId="730083340">
-    <w:abstractNumId w:val="24"/>
+    <w:abstractNumId w:val="25"/>
   </w:num>
   <w:num w:numId="25" w16cid:durableId="667051279">
     <w:abstractNumId w:val="12"/>
@@ -5290,6 +5851,33 @@
   </w:num>
   <w:num w:numId="28" w16cid:durableId="1288897673">
     <w:abstractNumId w:val="7"/>
+  </w:num>
+  <w:num w:numId="29" w16cid:durableId="815612509">
+    <w:abstractNumId w:val="10"/>
+    <w:lvlOverride w:ilvl="0"/>
+    <w:lvlOverride w:ilvl="1"/>
+    <w:lvlOverride w:ilvl="2"/>
+    <w:lvlOverride w:ilvl="3"/>
+    <w:lvlOverride w:ilvl="4"/>
+    <w:lvlOverride w:ilvl="5"/>
+    <w:lvlOverride w:ilvl="6"/>
+    <w:lvlOverride w:ilvl="7"/>
+    <w:lvlOverride w:ilvl="8"/>
+  </w:num>
+  <w:num w:numId="30" w16cid:durableId="524171746">
+    <w:abstractNumId w:val="13"/>
+    <w:lvlOverride w:ilvl="0"/>
+    <w:lvlOverride w:ilvl="1"/>
+    <w:lvlOverride w:ilvl="2"/>
+    <w:lvlOverride w:ilvl="3"/>
+    <w:lvlOverride w:ilvl="4"/>
+    <w:lvlOverride w:ilvl="5"/>
+    <w:lvlOverride w:ilvl="6"/>
+    <w:lvlOverride w:ilvl="7"/>
+    <w:lvlOverride w:ilvl="8"/>
+  </w:num>
+  <w:num w:numId="31" w16cid:durableId="847409443">
+    <w:abstractNumId w:val="23"/>
   </w:num>
 </w:numbering>
 </file>

</xml_diff>

<commit_message>
Thêm ví, phí tham gia
</commit_message>
<xml_diff>
--- a/docs/HƯỚNG DẪN SỬ DỤNG HỆ THỐNG VÀ CHẠY DEMO.docx
+++ b/docs/HƯỚNG DẪN SỬ DỤNG HỆ THỐNG VÀ CHẠY DEMO.docx
@@ -154,7 +154,7 @@
         </w:numPr>
       </w:pPr>
       <w:r>
-        <w:t>MySQL Server 8.0</w:t>
+        <w:t>XAMPP (MySQL/MariaDB 10.4+)</w:t>
       </w:r>
     </w:p>
     <w:p>
@@ -216,7 +216,7 @@
     </w:p>
     <w:p>
       <w:pPr>
-        <w:ind w:left="2001" w:hanging="1281"/>
+        <w:ind w:left="2001" w:hanging="1434"/>
       </w:pPr>
       <w:r>
         <w:rPr>
@@ -227,7 +227,7 @@
     </w:p>
     <w:p>
       <w:pPr>
-        <w:ind w:left="2001" w:hanging="1281"/>
+        <w:ind w:left="2001" w:hanging="1434"/>
       </w:pPr>
       <w:r>
         <w:t>git clone &lt;repository_url&gt;</w:t>
@@ -235,48 +235,139 @@
     </w:p>
     <w:p>
       <w:pPr>
-        <w:ind w:left="2001" w:hanging="1281"/>
-      </w:pPr>
-      <w:r>
-        <w:rPr>
-          <w:b/>
-        </w:rPr>
-        <w:t>Bước 2: Tạo database rỗng</w:t>
-      </w:r>
-    </w:p>
-    <w:p>
-      <w:pPr>
-        <w:ind w:left="2001" w:hanging="1281"/>
+        <w:ind w:left="2001" w:hanging="1434"/>
+      </w:pPr>
+      <w:r>
+        <w:rPr>
+          <w:b/>
+        </w:rPr>
+        <w:t xml:space="preserve">Bước 2: </w:t>
+      </w:r>
+      <w:r>
+        <w:rPr>
+          <w:b/>
+        </w:rPr>
+        <w:t>Khởi động MySQL</w:t>
+      </w:r>
+    </w:p>
+    <w:p>
+      <w:pPr>
+        <w:ind w:left="567" w:firstLine="0"/>
+        <w:jc w:val="both"/>
+      </w:pPr>
+      <w:r>
+        <w:t xml:space="preserve">Mở XAMPP Control Panel → bấm </w:t>
+      </w:r>
+      <w:r>
+        <w:rPr>
+          <w:bCs w:val="0"/>
+        </w:rPr>
+        <w:t>Start</w:t>
+      </w:r>
+      <w:r>
+        <w:t xml:space="preserve"> cạnh MySQL. MySQL chạy tại cổng</w:t>
+      </w:r>
+      <w:r>
+        <w:t xml:space="preserve"> </w:t>
+      </w:r>
+      <w:r>
+        <w:t>3306.</w:t>
+      </w:r>
+    </w:p>
+    <w:p>
+      <w:pPr>
+        <w:ind w:left="720" w:hanging="153"/>
+        <w:jc w:val="both"/>
+      </w:pPr>
+      <w:r>
+        <w:rPr>
+          <w:b/>
+        </w:rPr>
+        <w:t xml:space="preserve">Bước </w:t>
+      </w:r>
+      <w:r>
+        <w:rPr>
+          <w:b/>
+        </w:rPr>
+        <w:t>3</w:t>
+      </w:r>
+      <w:r>
+        <w:rPr>
+          <w:b/>
+        </w:rPr>
+        <w:t>: Tạo database rỗng</w:t>
+      </w:r>
+    </w:p>
+    <w:p>
+      <w:pPr>
+        <w:ind w:left="2001" w:hanging="1434"/>
+      </w:pPr>
+      <w:r>
+        <w:t>Mở phpMyAdmin (http://localhost/phpmyadmin)</w:t>
+      </w:r>
+      <w:r>
+        <w:t>,</w:t>
+      </w:r>
+      <w:r>
+        <w:t xml:space="preserve"> tạo database mới</w:t>
+      </w:r>
+      <w:r>
+        <w:t xml:space="preserve">: </w:t>
+      </w:r>
+    </w:p>
+    <w:p>
+      <w:pPr>
+        <w:ind w:left="2001" w:hanging="1434"/>
         <w:rPr>
           <w:lang w:val="en-US"/>
         </w:rPr>
       </w:pPr>
       <w:r>
-        <w:t>Mở MySQL và tạo database: CREATE DATABASE auction_db;</w:t>
-      </w:r>
-    </w:p>
-    <w:p>
-      <w:pPr>
-        <w:ind w:left="2001" w:hanging="1281"/>
-      </w:pPr>
-      <w:r>
-        <w:rPr>
-          <w:b/>
-        </w:rPr>
-        <w:t>Bước 3: Cấu hình Backend</w:t>
-      </w:r>
-    </w:p>
-    <w:p>
-      <w:pPr>
-        <w:ind w:left="2001" w:hanging="1281"/>
-      </w:pPr>
-      <w:r>
-        <w:t>Mở file src/backend/src/main/resources/application.properties và sửa:</w:t>
-      </w:r>
-    </w:p>
-    <w:p>
-      <w:pPr>
-        <w:ind w:left="2001" w:hanging="1281"/>
+        <w:t>CREATE DATABASE auction_db;</w:t>
+      </w:r>
+    </w:p>
+    <w:p>
+      <w:pPr>
+        <w:ind w:left="2001" w:hanging="1434"/>
+      </w:pPr>
+      <w:r>
+        <w:rPr>
+          <w:b/>
+        </w:rPr>
+        <w:t xml:space="preserve">Bước </w:t>
+      </w:r>
+      <w:r>
+        <w:rPr>
+          <w:b/>
+        </w:rPr>
+        <w:t>4</w:t>
+      </w:r>
+      <w:r>
+        <w:rPr>
+          <w:b/>
+        </w:rPr>
+        <w:t>: Cấu hình Backend</w:t>
+      </w:r>
+    </w:p>
+    <w:p>
+      <w:pPr>
+        <w:ind w:left="720" w:hanging="153"/>
+      </w:pPr>
+      <w:r>
+        <w:t>Mở file src/auction-system/src/main/resources/application.properties và kiểm tra:</w:t>
+      </w:r>
+    </w:p>
+    <w:p>
+      <w:pPr>
+        <w:ind w:left="567" w:firstLine="0"/>
+      </w:pPr>
+      <w:r>
+        <w:t>spring.datasource.url=jdbc:mysql://localhost:3306/auction_db?useSSL=false&amp;allowPublicKeyRetrieval=true&amp;serverTimezone=Asia/Ho_Chi_Minh</w:t>
+      </w:r>
+    </w:p>
+    <w:p>
+      <w:pPr>
+        <w:ind w:left="2001" w:hanging="1434"/>
       </w:pPr>
       <w:r>
         <w:t>spring.datasource.username=root</w:t>
@@ -284,26 +375,79 @@
     </w:p>
     <w:p>
       <w:pPr>
-        <w:ind w:left="2001" w:hanging="1281"/>
-      </w:pPr>
-      <w:r>
-        <w:t>spring.datasource.password=your_password</w:t>
-      </w:r>
-    </w:p>
-    <w:p>
-      <w:pPr>
-        <w:ind w:left="2001" w:hanging="1281"/>
-      </w:pPr>
-      <w:r>
-        <w:rPr>
-          <w:b/>
-        </w:rPr>
-        <w:t>Bước 4: Chạy Backend lần đầu để tạo bảng</w:t>
-      </w:r>
-    </w:p>
-    <w:p>
-      <w:pPr>
-        <w:ind w:left="2001" w:hanging="1281"/>
+        <w:ind w:left="2001" w:hanging="1434"/>
+      </w:pPr>
+      <w:r>
+        <w:t>spring.datasource.password=</w:t>
+      </w:r>
+    </w:p>
+    <w:p>
+      <w:pPr>
+        <w:ind w:left="2001" w:hanging="1434"/>
+      </w:pPr>
+      <w:r>
+        <w:t>textbee.api-key=YOUR_API_KEY</w:t>
+      </w:r>
+    </w:p>
+    <w:p>
+      <w:pPr>
+        <w:ind w:left="2001" w:hanging="1434"/>
+      </w:pPr>
+      <w:r>
+        <w:lastRenderedPageBreak/>
+        <w:t>textbee.device-id=YOUR_DEVICE_ID</w:t>
+      </w:r>
+    </w:p>
+    <w:p>
+      <w:pPr>
+        <w:ind w:left="2001" w:hanging="1434"/>
+      </w:pPr>
+      <w:r>
+        <w:t>vnpay.tmn-code=YOUR_TMN_CODE</w:t>
+      </w:r>
+    </w:p>
+    <w:p>
+      <w:pPr>
+        <w:ind w:left="2001" w:hanging="1434"/>
+      </w:pPr>
+      <w:r>
+        <w:t>vnpay.hash-secret=YOUR_HASH_SECRET</w:t>
+      </w:r>
+    </w:p>
+    <w:p>
+      <w:pPr>
+        <w:ind w:left="2001" w:hanging="1434"/>
+      </w:pPr>
+      <w:r>
+        <w:t>vnpay.return-url=http://localhost:3000/payment/callback</w:t>
+      </w:r>
+    </w:p>
+    <w:p>
+      <w:pPr>
+        <w:ind w:left="2001" w:hanging="1434"/>
+      </w:pPr>
+      <w:r>
+        <w:rPr>
+          <w:b/>
+        </w:rPr>
+        <w:t xml:space="preserve">Bước </w:t>
+      </w:r>
+      <w:r>
+        <w:rPr>
+          <w:b/>
+        </w:rPr>
+        <w:t>5</w:t>
+      </w:r>
+      <w:r>
+        <w:rPr>
+          <w:b/>
+        </w:rPr>
+        <w:t>: Chạy Backend lần đầu để tạo bảng</w:t>
+      </w:r>
+    </w:p>
+    <w:p>
+      <w:pPr>
+        <w:ind w:left="2001" w:hanging="1434"/>
       </w:pPr>
       <w:r>
         <w:t>cd src/auction-system</w:t>
@@ -311,7 +455,7 @@
     </w:p>
     <w:p>
       <w:pPr>
-        <w:ind w:left="2001" w:hanging="1281"/>
+        <w:ind w:left="2001" w:hanging="1434"/>
       </w:pPr>
       <w:r>
         <w:t>mvn spring-boot:run</w:t>
@@ -319,76 +463,61 @@
     </w:p>
     <w:p>
       <w:pPr>
-        <w:ind w:left="720" w:firstLine="0"/>
+        <w:ind w:left="567" w:firstLine="0"/>
         <w:jc w:val="both"/>
+      </w:pPr>
+      <w:r>
+        <w:t>Sau khi thấy Started AuctionSystemApplication trong log → </w:t>
+      </w:r>
+      <w:r>
+        <w:rPr>
+          <w:b/>
+        </w:rPr>
+        <w:t>dừng server (Ctrl+C)</w:t>
+      </w:r>
+      <w:r>
+        <w:t>.</w:t>
+      </w:r>
+      <w:r>
         <w:rPr>
           <w:lang w:val="en-US"/>
         </w:rPr>
-      </w:pPr>
-      <w:r>
-        <w:t>Sau khi thấy Started AuctionSystemApplication trong log → </w:t>
-      </w:r>
-      <w:r>
-        <w:rPr>
-          <w:b/>
-        </w:rPr>
-        <w:t>dừng server (Ctrl+C)</w:t>
-      </w:r>
-      <w:r>
-        <w:t>.</w:t>
-      </w:r>
-      <w:r>
-        <w:rPr>
+        <w:t xml:space="preserve"> </w:t>
+      </w:r>
+      <w:r>
+        <w:t>Lúc này Hibernate đã tự tạo toàn bộ bảng trong auction_db.</w:t>
+      </w:r>
+    </w:p>
+    <w:p>
+      <w:pPr>
+        <w:ind w:left="2001" w:hanging="1434"/>
+        <w:rPr>
+          <w:b/>
           <w:lang w:val="en-US"/>
         </w:rPr>
-        <w:t xml:space="preserve"> </w:t>
-      </w:r>
-      <w:r>
-        <w:t>Lúc này Hibernate đã tự tạo toàn bộ bảng trong auction_db.</w:t>
-      </w:r>
-    </w:p>
-    <w:p>
-      <w:pPr>
-        <w:ind w:left="720" w:firstLine="0"/>
-        <w:rPr>
-          <w:lang w:val="en-US"/>
-        </w:rPr>
-      </w:pPr>
-    </w:p>
-    <w:p>
-      <w:pPr>
-        <w:ind w:left="720" w:firstLine="0"/>
-        <w:rPr>
-          <w:lang w:val="en-US"/>
-        </w:rPr>
-      </w:pPr>
-    </w:p>
-    <w:p>
-      <w:pPr>
-        <w:ind w:left="720" w:firstLine="0"/>
-        <w:rPr>
-          <w:lang w:val="en-US"/>
-        </w:rPr>
-      </w:pPr>
-    </w:p>
-    <w:p>
-      <w:pPr>
-        <w:ind w:left="2001" w:hanging="1281"/>
-        <w:rPr>
-          <w:b/>
-          <w:lang w:val="en-US"/>
-        </w:rPr>
-      </w:pPr>
-      <w:r>
-        <w:rPr>
-          <w:b/>
-        </w:rPr>
-        <w:t>Bước 5: Import dữ liệu mẫu</w:t>
-      </w:r>
-    </w:p>
-    <w:p>
-      <w:pPr>
-        <w:ind w:left="720" w:firstLine="0"/>
+      </w:pPr>
+      <w:r>
+        <w:rPr>
+          <w:b/>
+        </w:rPr>
+        <w:t xml:space="preserve">Bước </w:t>
+      </w:r>
+      <w:r>
+        <w:rPr>
+          <w:b/>
+        </w:rPr>
+        <w:t>6</w:t>
+      </w:r>
+      <w:r>
+        <w:rPr>
+          <w:b/>
+        </w:rPr>
+        <w:t>: Import dữ liệu mẫu</w:t>
+      </w:r>
+    </w:p>
+    <w:p>
+      <w:pPr>
+        <w:ind w:left="567" w:firstLine="0"/>
         <w:jc w:val="both"/>
         <w:rPr>
           <w:bCs w:val="0"/>
@@ -396,41 +525,35 @@
         </w:rPr>
       </w:pPr>
       <w:r>
-        <w:rPr>
-          <w:bCs w:val="0"/>
-          <w:lang w:val="en-US"/>
-        </w:rPr>
-        <w:t>Mở file MySQL, chọn database auction_db và import file:</w:t>
-      </w:r>
-      <w:r>
-        <w:rPr>
-          <w:bCs w:val="0"/>
-          <w:lang w:val="en-US"/>
-        </w:rPr>
-        <w:t xml:space="preserve"> </w:t>
-      </w:r>
-      <w:r>
-        <w:rPr>
-          <w:bCs w:val="0"/>
-          <w:lang w:val="en-US"/>
-        </w:rPr>
-        <w:t>src/database/DbReset</w:t>
-      </w:r>
-    </w:p>
-    <w:p>
-      <w:pPr>
-        <w:ind w:hanging="572"/>
-      </w:pPr>
-      <w:r>
-        <w:rPr>
-          <w:b/>
-        </w:rPr>
-        <w:t>Bước 6: Chạy lại Backend</w:t>
-      </w:r>
-    </w:p>
-    <w:p>
-      <w:pPr>
-        <w:ind w:left="2001" w:hanging="1281"/>
+        <w:t>Mở phpMyAdmin → chọn database auction_db → tab Import → chọn file src/database/data_seed.sql → bấm Nhập.</w:t>
+      </w:r>
+    </w:p>
+    <w:p>
+      <w:pPr>
+        <w:ind w:hanging="714"/>
+      </w:pPr>
+      <w:r>
+        <w:rPr>
+          <w:b/>
+        </w:rPr>
+        <w:t xml:space="preserve">Bước </w:t>
+      </w:r>
+      <w:r>
+        <w:rPr>
+          <w:b/>
+        </w:rPr>
+        <w:t>7</w:t>
+      </w:r>
+      <w:r>
+        <w:rPr>
+          <w:b/>
+        </w:rPr>
+        <w:t>: Chạy lại Backend</w:t>
+      </w:r>
+    </w:p>
+    <w:p>
+      <w:pPr>
+        <w:ind w:left="2001" w:hanging="1434"/>
       </w:pPr>
       <w:r>
         <w:t>cd src/auction-system</w:t>
@@ -438,7 +561,7 @@
     </w:p>
     <w:p>
       <w:pPr>
-        <w:ind w:left="2001" w:hanging="1281"/>
+        <w:ind w:left="2001" w:hanging="1434"/>
       </w:pPr>
       <w:r>
         <w:t>mvn spring-boot:run</w:t>
@@ -446,7 +569,7 @@
     </w:p>
     <w:p>
       <w:pPr>
-        <w:ind w:left="2001" w:hanging="1281"/>
+        <w:ind w:left="2001" w:hanging="1434"/>
       </w:pPr>
       <w:r>
         <w:t>Backend chạy tại: </w:t>
@@ -462,18 +585,30 @@
     </w:p>
     <w:p>
       <w:pPr>
-        <w:ind w:left="2001" w:hanging="1281"/>
-      </w:pPr>
-      <w:r>
-        <w:rPr>
-          <w:b/>
-        </w:rPr>
-        <w:t>Bước 7: Chạy Frontend</w:t>
-      </w:r>
-    </w:p>
-    <w:p>
-      <w:pPr>
-        <w:ind w:left="2001" w:hanging="1281"/>
+        <w:ind w:left="2001" w:hanging="1434"/>
+      </w:pPr>
+      <w:r>
+        <w:rPr>
+          <w:b/>
+        </w:rPr>
+        <w:t xml:space="preserve">Bước </w:t>
+      </w:r>
+      <w:r>
+        <w:rPr>
+          <w:b/>
+        </w:rPr>
+        <w:t>8</w:t>
+      </w:r>
+      <w:r>
+        <w:rPr>
+          <w:b/>
+        </w:rPr>
+        <w:t>: Chạy Frontend</w:t>
+      </w:r>
+    </w:p>
+    <w:p>
+      <w:pPr>
+        <w:ind w:left="2001" w:hanging="1434"/>
       </w:pPr>
       <w:r>
         <w:t>cd src/auction-system/auction-ui</w:t>
@@ -481,7 +616,7 @@
     </w:p>
     <w:p>
       <w:pPr>
-        <w:ind w:left="2001" w:hanging="1281"/>
+        <w:ind w:left="2001" w:hanging="1434"/>
       </w:pPr>
       <w:r>
         <w:t>npm install</w:t>
@@ -489,7 +624,7 @@
     </w:p>
     <w:p>
       <w:pPr>
-        <w:ind w:left="2001" w:hanging="1281"/>
+        <w:ind w:left="2001" w:hanging="1434"/>
       </w:pPr>
       <w:r>
         <w:t>npm start</w:t>
@@ -497,7 +632,7 @@
     </w:p>
     <w:p>
       <w:pPr>
-        <w:ind w:left="2001" w:hanging="1281"/>
+        <w:ind w:left="2001" w:hanging="1434"/>
       </w:pPr>
       <w:r>
         <w:t>Frontend chạy tại: </w:t>
@@ -571,37 +706,231 @@
       </w:r>
     </w:p>
     <w:p>
-      <w:r>
-        <w:t>Email: buyer1@gmail.com</w:t>
-      </w:r>
-    </w:p>
-    <w:p>
-      <w:r>
-        <w:t>Password: 123456</w:t>
-      </w:r>
-    </w:p>
-    <w:p>
-      <w:pPr>
-        <w:ind w:left="2205" w:hanging="1281"/>
-      </w:pPr>
-      <w:r>
-        <w:t>Email: shopabc@gmail.com</w:t>
-      </w:r>
-    </w:p>
-    <w:p>
-      <w:pPr>
-        <w:ind w:left="2205" w:hanging="1281"/>
-        <w:rPr>
-          <w:lang w:val="en-US"/>
-        </w:rPr>
-      </w:pPr>
-      <w:r>
-        <w:t>Password: 123456</w:t>
-      </w:r>
-    </w:p>
-    <w:p>
-      <w:pPr>
-        <w:ind w:hanging="1281"/>
+      <w:pPr>
+        <w:ind w:left="1434" w:hanging="714"/>
+        <w:rPr>
+          <w:b/>
+        </w:rPr>
+      </w:pPr>
+      <w:r>
+        <w:rPr>
+          <w:b/>
+        </w:rPr>
+        <w:t>Người mua</w:t>
+      </w:r>
+    </w:p>
+    <w:p>
+      <w:pPr>
+        <w:pStyle w:val="ListParagraph"/>
+        <w:numPr>
+          <w:ilvl w:val="0"/>
+          <w:numId w:val="37"/>
+        </w:numPr>
+        <w:rPr>
+          <w:bCs w:val="0"/>
+        </w:rPr>
+      </w:pPr>
+      <w:r>
+        <w:rPr>
+          <w:bCs w:val="0"/>
+        </w:rPr>
+        <w:t>Email: buyer1@gmail.com / Password: 123456</w:t>
+      </w:r>
+    </w:p>
+    <w:p>
+      <w:pPr>
+        <w:pStyle w:val="ListParagraph"/>
+        <w:numPr>
+          <w:ilvl w:val="0"/>
+          <w:numId w:val="37"/>
+        </w:numPr>
+        <w:rPr>
+          <w:bCs w:val="0"/>
+        </w:rPr>
+      </w:pPr>
+      <w:r>
+        <w:rPr>
+          <w:bCs w:val="0"/>
+        </w:rPr>
+        <w:t>Email: buyer2@gmail.com / Password: 123456</w:t>
+      </w:r>
+    </w:p>
+    <w:p>
+      <w:pPr>
+        <w:pStyle w:val="ListParagraph"/>
+        <w:numPr>
+          <w:ilvl w:val="0"/>
+          <w:numId w:val="37"/>
+        </w:numPr>
+        <w:rPr>
+          <w:bCs w:val="0"/>
+        </w:rPr>
+      </w:pPr>
+      <w:r>
+        <w:rPr>
+          <w:bCs w:val="0"/>
+        </w:rPr>
+        <w:t>Email: buyer3@gmail.com / Password: 123456</w:t>
+      </w:r>
+    </w:p>
+    <w:p>
+      <w:pPr>
+        <w:pStyle w:val="ListParagraph"/>
+        <w:numPr>
+          <w:ilvl w:val="0"/>
+          <w:numId w:val="37"/>
+        </w:numPr>
+        <w:rPr>
+          <w:bCs w:val="0"/>
+        </w:rPr>
+      </w:pPr>
+      <w:r>
+        <w:rPr>
+          <w:bCs w:val="0"/>
+        </w:rPr>
+        <w:t>Email: buyer4@gmail.com / Password: 123456</w:t>
+      </w:r>
+    </w:p>
+    <w:p>
+      <w:pPr>
+        <w:ind w:left="1434" w:hanging="714"/>
+        <w:rPr>
+          <w:b/>
+        </w:rPr>
+      </w:pPr>
+      <w:r>
+        <w:rPr>
+          <w:b/>
+        </w:rPr>
+        <w:lastRenderedPageBreak/>
+        <w:t>Người bán</w:t>
+      </w:r>
+    </w:p>
+    <w:p>
+      <w:pPr>
+        <w:pStyle w:val="ListParagraph"/>
+        <w:numPr>
+          <w:ilvl w:val="0"/>
+          <w:numId w:val="38"/>
+        </w:numPr>
+        <w:rPr>
+          <w:bCs w:val="0"/>
+        </w:rPr>
+      </w:pPr>
+      <w:r>
+        <w:rPr>
+          <w:bCs w:val="0"/>
+        </w:rPr>
+        <w:t>Email: shopabc@gmail.com / Password: 123456</w:t>
+      </w:r>
+    </w:p>
+    <w:p>
+      <w:pPr>
+        <w:pStyle w:val="ListParagraph"/>
+        <w:numPr>
+          <w:ilvl w:val="0"/>
+          <w:numId w:val="38"/>
+        </w:numPr>
+        <w:rPr>
+          <w:bCs w:val="0"/>
+        </w:rPr>
+      </w:pPr>
+      <w:r>
+        <w:rPr>
+          <w:bCs w:val="0"/>
+        </w:rPr>
+        <w:t>Email: techstore@gmail.com / Password: 123456</w:t>
+      </w:r>
+    </w:p>
+    <w:p>
+      <w:pPr>
+        <w:pStyle w:val="ListParagraph"/>
+        <w:numPr>
+          <w:ilvl w:val="0"/>
+          <w:numId w:val="38"/>
+        </w:numPr>
+        <w:jc w:val="both"/>
+        <w:rPr>
+          <w:bCs w:val="0"/>
+        </w:rPr>
+      </w:pPr>
+      <w:r>
+        <w:rPr>
+          <w:bCs w:val="0"/>
+        </w:rPr>
+        <w:t>Email: gadgethub@gmail.com / Password: 123456</w:t>
+      </w:r>
+    </w:p>
+    <w:p>
+      <w:pPr>
+        <w:ind w:left="0" w:firstLine="567"/>
+        <w:jc w:val="both"/>
+        <w:rPr>
+          <w:bCs w:val="0"/>
+        </w:rPr>
+      </w:pPr>
+      <w:r>
+        <w:rPr>
+          <w:bCs w:val="0"/>
+        </w:rPr>
+        <w:t>Lưu ý: Tất cả tài khoản đều bật xác thực 2 bước (2FA) qua SMS. Khi đăng nhập, hệ thống sẽ gửi OTP 6 số về số điện thoại đã đăng ký qua TextBee.</w:t>
+      </w:r>
+      <w:r>
+        <w:rPr>
+          <w:bCs w:val="0"/>
+        </w:rPr>
+        <w:t xml:space="preserve"> Nếu không muốn nhập OTP mỗi lần đăng nhập lúc test, vào `application.properties`:</w:t>
+      </w:r>
+    </w:p>
+    <w:p>
+      <w:pPr>
+        <w:ind w:left="0" w:firstLine="567"/>
+        <w:jc w:val="both"/>
+        <w:rPr>
+          <w:bCs w:val="0"/>
+        </w:rPr>
+      </w:pPr>
+      <w:r>
+        <w:rPr>
+          <w:bCs w:val="0"/>
+        </w:rPr>
+        <w:t>app.otp.enabled=</w:t>
+      </w:r>
+      <w:r>
+        <w:rPr>
+          <w:bCs w:val="0"/>
+        </w:rPr>
+        <w:t xml:space="preserve">true </w:t>
+      </w:r>
+      <w:r>
+        <w:rPr>
+          <w:bCs w:val="0"/>
+        </w:rPr>
+        <w:t>→</w:t>
+      </w:r>
+      <w:r>
+        <w:rPr>
+          <w:bCs w:val="0"/>
+        </w:rPr>
+        <w:t xml:space="preserve"> </w:t>
+      </w:r>
+      <w:r>
+        <w:rPr>
+          <w:bCs w:val="0"/>
+        </w:rPr>
+        <w:t>app.otp.enabled=</w:t>
+      </w:r>
+      <w:r>
+        <w:rPr>
+          <w:bCs w:val="0"/>
+        </w:rPr>
+        <w:t>false</w:t>
+      </w:r>
+    </w:p>
+    <w:p>
+      <w:pPr>
+        <w:ind w:left="0" w:firstLine="567"/>
+        <w:jc w:val="both"/>
         <w:rPr>
           <w:b/>
         </w:rPr>
@@ -699,78 +1028,89 @@
     </w:p>
     <w:p>
       <w:pPr>
-        <w:ind w:hanging="714"/>
-        <w:rPr>
-          <w:lang w:val="en-US"/>
-        </w:rPr>
-      </w:pPr>
-      <w:r>
-        <w:t>Sau đó xác nhận tạo tài khoản.</w:t>
-      </w:r>
-    </w:p>
-    <w:p>
-      <w:pPr>
-        <w:ind w:hanging="997"/>
-        <w:rPr>
-          <w:b/>
-        </w:rPr>
-      </w:pPr>
-      <w:r>
-        <w:rPr>
-          <w:b/>
-          <w:lang w:val="en-US"/>
-        </w:rPr>
-        <w:t>5</w:t>
-      </w:r>
-      <w:r>
-        <w:rPr>
-          <w:b/>
-        </w:rPr>
-        <w:t>.2 Đăng nhập</w:t>
-      </w:r>
-    </w:p>
-    <w:p>
-      <w:pPr>
-        <w:ind w:hanging="714"/>
-      </w:pPr>
-      <w:r>
-        <w:t>Nhập:</w:t>
-      </w:r>
-    </w:p>
-    <w:p>
-      <w:pPr>
         <w:pStyle w:val="ListParagraph"/>
         <w:numPr>
           <w:ilvl w:val="0"/>
-          <w:numId w:val="19"/>
+          <w:numId w:val="18"/>
         </w:numPr>
       </w:pPr>
       <w:r>
-        <w:lastRenderedPageBreak/>
-        <w:t>Email</w:t>
-      </w:r>
-    </w:p>
-    <w:p>
-      <w:pPr>
-        <w:pStyle w:val="ListParagraph"/>
-        <w:numPr>
-          <w:ilvl w:val="0"/>
-          <w:numId w:val="19"/>
-        </w:numPr>
-      </w:pPr>
-      <w:r>
-        <w:t>Mật khẩu</w:t>
+        <w:t>Mật khẩu và xác nhận mật khẩu</w:t>
+      </w:r>
+    </w:p>
+    <w:p>
+      <w:pPr>
+        <w:ind w:left="0" w:firstLine="567"/>
+        <w:jc w:val="both"/>
+        <w:rPr>
+          <w:lang w:val="en-US"/>
+        </w:rPr>
+      </w:pPr>
+      <w:r>
+        <w:t>Sau đó xác nhận tạo tài khoản.</w:t>
+      </w:r>
+      <w:r>
+        <w:t xml:space="preserve"> </w:t>
+      </w:r>
+      <w:r>
+        <w:t>Sau khi đăng ký, hệ thống gửi email xác thực.</w:t>
+      </w:r>
+      <w:r>
+        <w:t xml:space="preserve"> </w:t>
+      </w:r>
+      <w:r>
+        <w:t>Người dùng phải bấm link trong email mới đăng nhập được.</w:t>
+      </w:r>
+    </w:p>
+    <w:p>
+      <w:pPr>
+        <w:ind w:hanging="997"/>
+        <w:rPr>
+          <w:b/>
+        </w:rPr>
+      </w:pPr>
+      <w:r>
+        <w:rPr>
+          <w:b/>
+          <w:lang w:val="en-US"/>
+        </w:rPr>
+        <w:t>5</w:t>
+      </w:r>
+      <w:r>
+        <w:rPr>
+          <w:b/>
+        </w:rPr>
+        <w:t>.2 Đăng nhập</w:t>
       </w:r>
     </w:p>
     <w:p>
       <w:pPr>
         <w:ind w:hanging="714"/>
-        <w:rPr>
-          <w:lang w:val="en-US"/>
-        </w:rPr>
-      </w:pPr>
-      <w:r>
-        <w:t>Hệ thống xác thực bằng JWT Authentication.</w:t>
+        <w:jc w:val="both"/>
+        <w:rPr>
+          <w:bCs w:val="0"/>
+        </w:rPr>
+      </w:pPr>
+      <w:r>
+        <w:rPr>
+          <w:bCs w:val="0"/>
+        </w:rPr>
+        <w:t>Bước 1: Nhập email và mật khẩu → bấm Tiếp theo.</w:t>
+      </w:r>
+    </w:p>
+    <w:p>
+      <w:pPr>
+        <w:ind w:left="0" w:firstLine="567"/>
+        <w:jc w:val="both"/>
+      </w:pPr>
+      <w:r>
+        <w:rPr>
+          <w:bCs w:val="0"/>
+        </w:rPr>
+        <w:t>Bước 2:</w:t>
+      </w:r>
+      <w:r>
+        <w:t xml:space="preserve"> Nhập mã OTP 6 số được gửi qua SMS về số điện thoại đã đăng ký. OTP hết hạn sau 5 phút, sai quá 5 lần sẽ bị khóa 15 phút.</w:t>
       </w:r>
     </w:p>
     <w:p>
@@ -813,6 +1153,9 @@
       <w:r>
         <w:t>Xem sản phẩm đang đấu giá</w:t>
       </w:r>
+      <w:r>
+        <w:t>, lọc theo danh mục, khoảng giá</w:t>
+      </w:r>
     </w:p>
     <w:p>
       <w:pPr>
@@ -888,6 +1231,7 @@
         </w:numPr>
       </w:pPr>
       <w:r>
+        <w:lastRenderedPageBreak/>
         <w:t>Danh mục</w:t>
       </w:r>
     </w:p>
@@ -926,6 +1270,24 @@
     </w:p>
     <w:p>
       <w:pPr>
+        <w:ind w:left="0" w:firstLine="567"/>
+        <w:jc w:val="both"/>
+      </w:pPr>
+      <w:r>
+        <w:t xml:space="preserve">Trước khi đặt giá, người dùng cần nạp tiền vào ví để đóng </w:t>
+      </w:r>
+      <w:r>
+        <w:rPr>
+          <w:bCs w:val="0"/>
+        </w:rPr>
+        <w:t>phí tham gia 500.000 VNĐ</w:t>
+      </w:r>
+      <w:r>
+        <w:t xml:space="preserve"> (thu 1 lần duy nhất mỗi phiên).</w:t>
+      </w:r>
+    </w:p>
+    <w:p>
+      <w:pPr>
         <w:ind w:hanging="714"/>
       </w:pPr>
       <w:r>
@@ -1017,6 +1379,21 @@
     </w:p>
     <w:p>
       <w:pPr>
+        <w:pStyle w:val="ListParagraph"/>
+        <w:numPr>
+          <w:ilvl w:val="0"/>
+          <w:numId w:val="21"/>
+        </w:numPr>
+      </w:pPr>
+      <w:r>
+        <w:t>Gia hạn thêm 1 phút nếu có người đặt giá trong vòng 1 phút cuối</w:t>
+      </w:r>
+      <w:r>
+        <w:t xml:space="preserve"> (tối đa 5 lần)</w:t>
+      </w:r>
+    </w:p>
+    <w:p>
+      <w:pPr>
         <w:ind w:hanging="997"/>
         <w:rPr>
           <w:b/>
@@ -1033,7 +1410,377 @@
         <w:rPr>
           <w:b/>
         </w:rPr>
-        <w:t>.6 Người bán đăng sản phẩm</w:t>
+        <w:t xml:space="preserve">.6 </w:t>
+      </w:r>
+      <w:r>
+        <w:rPr>
+          <w:b/>
+        </w:rPr>
+        <w:t>Mua ngay</w:t>
+      </w:r>
+    </w:p>
+    <w:p>
+      <w:pPr>
+        <w:ind w:left="0" w:firstLine="567"/>
+        <w:jc w:val="both"/>
+        <w:rPr>
+          <w:bCs w:val="0"/>
+        </w:rPr>
+      </w:pPr>
+      <w:r>
+        <w:rPr>
+          <w:bCs w:val="0"/>
+        </w:rPr>
+        <w:t xml:space="preserve">Nếu phiên đấu giá có thiết lập Giá mua ngay, người dùng có thể bấm nút </w:t>
+      </w:r>
+      <w:r>
+        <w:rPr>
+          <w:bCs w:val="0"/>
+        </w:rPr>
+        <w:t>“</w:t>
+      </w:r>
+      <w:r>
+        <w:rPr>
+          <w:bCs w:val="0"/>
+        </w:rPr>
+        <w:t>Mua ngay</w:t>
+      </w:r>
+      <w:r>
+        <w:rPr>
+          <w:bCs w:val="0"/>
+        </w:rPr>
+        <w:t>”</w:t>
+      </w:r>
+      <w:r>
+        <w:rPr>
+          <w:bCs w:val="0"/>
+        </w:rPr>
+        <w:t xml:space="preserve"> để kết thúc phiên ngay lập tức và trở thành người chiến thắng.</w:t>
+      </w:r>
+    </w:p>
+    <w:p>
+      <w:pPr>
+        <w:ind w:hanging="997"/>
+        <w:rPr>
+          <w:b/>
+        </w:rPr>
+      </w:pPr>
+      <w:r>
+        <w:rPr>
+          <w:b/>
+          <w:lang w:val="en-US"/>
+        </w:rPr>
+        <w:t>5</w:t>
+      </w:r>
+      <w:r>
+        <w:rPr>
+          <w:b/>
+        </w:rPr>
+        <w:t>.</w:t>
+      </w:r>
+      <w:r>
+        <w:rPr>
+          <w:b/>
+        </w:rPr>
+        <w:t>7</w:t>
+      </w:r>
+      <w:r>
+        <w:rPr>
+          <w:b/>
+        </w:rPr>
+        <w:t xml:space="preserve"> </w:t>
+      </w:r>
+      <w:r>
+        <w:rPr>
+          <w:b/>
+        </w:rPr>
+        <w:t>Nạp tiền vào ví</w:t>
+      </w:r>
+    </w:p>
+    <w:p>
+      <w:pPr>
+        <w:tabs>
+          <w:tab w:val="left" w:pos="1907"/>
+        </w:tabs>
+        <w:ind w:left="0" w:firstLine="567"/>
+        <w:rPr>
+          <w:bCs w:val="0"/>
+        </w:rPr>
+      </w:pPr>
+      <w:r>
+        <w:rPr>
+          <w:bCs w:val="0"/>
+        </w:rPr>
+        <w:t xml:space="preserve">Người dùng vào Ví → </w:t>
+      </w:r>
+      <w:r>
+        <w:rPr>
+          <w:bCs w:val="0"/>
+        </w:rPr>
+        <w:t>thẻ</w:t>
+      </w:r>
+      <w:r>
+        <w:rPr>
+          <w:bCs w:val="0"/>
+        </w:rPr>
+        <w:t xml:space="preserve"> Nạp tiền → nhập số tiền → bấm Nạp qua VNPay.</w:t>
+      </w:r>
+    </w:p>
+    <w:p>
+      <w:pPr>
+        <w:tabs>
+          <w:tab w:val="left" w:pos="1907"/>
+        </w:tabs>
+        <w:ind w:left="0" w:firstLine="0"/>
+        <w:rPr>
+          <w:bCs w:val="0"/>
+        </w:rPr>
+      </w:pPr>
+      <w:r>
+        <w:rPr>
+          <w:bCs w:val="0"/>
+        </w:rPr>
+        <w:t xml:space="preserve">Hệ thống chuyển đến cổng thanh toán VNPay </w:t>
+      </w:r>
+      <w:r>
+        <w:rPr>
+          <w:bCs w:val="0"/>
+        </w:rPr>
+        <w:t>thử nghiệm.</w:t>
+      </w:r>
+      <w:r>
+        <w:rPr>
+          <w:bCs w:val="0"/>
+        </w:rPr>
+        <w:t xml:space="preserve"> Dùng thẻ </w:t>
+      </w:r>
+      <w:r>
+        <w:rPr>
+          <w:bCs w:val="0"/>
+        </w:rPr>
+        <w:t>thử</w:t>
+      </w:r>
+      <w:r>
+        <w:rPr>
+          <w:bCs w:val="0"/>
+        </w:rPr>
+        <w:t>:</w:t>
+      </w:r>
+    </w:p>
+    <w:p>
+      <w:pPr>
+        <w:numPr>
+          <w:ilvl w:val="0"/>
+          <w:numId w:val="34"/>
+        </w:numPr>
+        <w:tabs>
+          <w:tab w:val="left" w:pos="1907"/>
+        </w:tabs>
+        <w:rPr>
+          <w:bCs w:val="0"/>
+        </w:rPr>
+      </w:pPr>
+      <w:r>
+        <w:rPr>
+          <w:bCs w:val="0"/>
+        </w:rPr>
+        <w:t>Ngân hàng: NCB</w:t>
+      </w:r>
+    </w:p>
+    <w:p>
+      <w:pPr>
+        <w:numPr>
+          <w:ilvl w:val="0"/>
+          <w:numId w:val="34"/>
+        </w:numPr>
+        <w:tabs>
+          <w:tab w:val="left" w:pos="1907"/>
+        </w:tabs>
+        <w:rPr>
+          <w:bCs w:val="0"/>
+        </w:rPr>
+      </w:pPr>
+      <w:r>
+        <w:rPr>
+          <w:bCs w:val="0"/>
+        </w:rPr>
+        <w:t>Số thẻ: 9704198526191432198</w:t>
+      </w:r>
+    </w:p>
+    <w:p>
+      <w:pPr>
+        <w:numPr>
+          <w:ilvl w:val="0"/>
+          <w:numId w:val="34"/>
+        </w:numPr>
+        <w:tabs>
+          <w:tab w:val="left" w:pos="1907"/>
+        </w:tabs>
+        <w:rPr>
+          <w:bCs w:val="0"/>
+        </w:rPr>
+      </w:pPr>
+      <w:r>
+        <w:rPr>
+          <w:bCs w:val="0"/>
+        </w:rPr>
+        <w:t>Tên chủ thẻ: NGUYEN VAN A</w:t>
+      </w:r>
+    </w:p>
+    <w:p>
+      <w:pPr>
+        <w:numPr>
+          <w:ilvl w:val="0"/>
+          <w:numId w:val="34"/>
+        </w:numPr>
+        <w:tabs>
+          <w:tab w:val="left" w:pos="1907"/>
+        </w:tabs>
+        <w:rPr>
+          <w:bCs w:val="0"/>
+        </w:rPr>
+      </w:pPr>
+      <w:r>
+        <w:rPr>
+          <w:bCs w:val="0"/>
+        </w:rPr>
+        <w:t>Ngày phát hành: 07/15</w:t>
+      </w:r>
+    </w:p>
+    <w:p>
+      <w:pPr>
+        <w:numPr>
+          <w:ilvl w:val="0"/>
+          <w:numId w:val="34"/>
+        </w:numPr>
+        <w:tabs>
+          <w:tab w:val="left" w:pos="1907"/>
+        </w:tabs>
+        <w:rPr>
+          <w:bCs w:val="0"/>
+        </w:rPr>
+      </w:pPr>
+      <w:r>
+        <w:rPr>
+          <w:bCs w:val="0"/>
+        </w:rPr>
+        <w:t>OTP: 123456</w:t>
+      </w:r>
+    </w:p>
+    <w:p>
+      <w:pPr>
+        <w:tabs>
+          <w:tab w:val="left" w:pos="1907"/>
+        </w:tabs>
+        <w:ind w:left="0" w:firstLine="567"/>
+        <w:rPr>
+          <w:bCs w:val="0"/>
+        </w:rPr>
+      </w:pPr>
+      <w:r>
+        <w:rPr>
+          <w:bCs w:val="0"/>
+        </w:rPr>
+        <w:t>Sau khi thanh toán thành công, số dư được cộng tự động vào ví.</w:t>
+      </w:r>
+    </w:p>
+    <w:p>
+      <w:pPr>
+        <w:ind w:hanging="997"/>
+        <w:rPr>
+          <w:b/>
+        </w:rPr>
+      </w:pPr>
+      <w:r>
+        <w:rPr>
+          <w:b/>
+          <w:lang w:val="en-US"/>
+        </w:rPr>
+        <w:t>5</w:t>
+      </w:r>
+      <w:r>
+        <w:rPr>
+          <w:b/>
+        </w:rPr>
+        <w:t xml:space="preserve">.6 </w:t>
+      </w:r>
+      <w:r>
+        <w:rPr>
+          <w:b/>
+        </w:rPr>
+        <w:t>Rút tiền</w:t>
+      </w:r>
+    </w:p>
+    <w:p>
+      <w:pPr>
+        <w:ind w:left="0" w:firstLine="567"/>
+        <w:jc w:val="both"/>
+        <w:rPr>
+          <w:bCs w:val="0"/>
+        </w:rPr>
+      </w:pPr>
+      <w:r>
+        <w:rPr>
+          <w:bCs w:val="0"/>
+        </w:rPr>
+        <w:t>Người dùng vào Ví</w:t>
+      </w:r>
+      <w:r>
+        <w:rPr>
+          <w:bCs w:val="0"/>
+        </w:rPr>
+        <w:t xml:space="preserve"> </w:t>
+      </w:r>
+      <w:r>
+        <w:rPr>
+          <w:bCs w:val="0"/>
+        </w:rPr>
+        <w:t>→ t</w:t>
+      </w:r>
+      <w:r>
+        <w:rPr>
+          <w:bCs w:val="0"/>
+        </w:rPr>
+        <w:t>hẻ</w:t>
+      </w:r>
+      <w:r>
+        <w:rPr>
+          <w:bCs w:val="0"/>
+        </w:rPr>
+        <w:t xml:space="preserve"> Rút tiền → nhập thông tin ngân hàng và số tiền → bấm Rút tiền. Hệ thống giả lập chuyển khoản thành công ngay lập tức.</w:t>
+      </w:r>
+    </w:p>
+    <w:p>
+      <w:pPr>
+        <w:ind w:hanging="997"/>
+        <w:rPr>
+          <w:b/>
+        </w:rPr>
+      </w:pPr>
+      <w:r>
+        <w:rPr>
+          <w:b/>
+          <w:lang w:val="en-US"/>
+        </w:rPr>
+        <w:t>5</w:t>
+      </w:r>
+      <w:r>
+        <w:rPr>
+          <w:b/>
+        </w:rPr>
+        <w:t>.</w:t>
+      </w:r>
+      <w:r>
+        <w:rPr>
+          <w:b/>
+        </w:rPr>
+        <w:t>9</w:t>
+      </w:r>
+      <w:r>
+        <w:rPr>
+          <w:b/>
+        </w:rPr>
+        <w:t xml:space="preserve"> Người bán đăng sản phẩm</w:t>
       </w:r>
     </w:p>
     <w:p>
@@ -1041,6 +1788,7 @@
         <w:ind w:hanging="714"/>
       </w:pPr>
       <w:r>
+        <w:lastRenderedPageBreak/>
         <w:t>Người bán nhập:</w:t>
       </w:r>
     </w:p>
@@ -1101,7 +1849,7 @@
         </w:numPr>
       </w:pPr>
       <w:r>
-        <w:t>Thời gian đấu giá</w:t>
+        <w:t>Giá mong muốn</w:t>
       </w:r>
     </w:p>
     <w:p>
@@ -1113,57 +1861,132 @@
         </w:numPr>
       </w:pPr>
       <w:r>
+        <w:t>Bước giá tối thiểu</w:t>
+      </w:r>
+    </w:p>
+    <w:p>
+      <w:pPr>
+        <w:pStyle w:val="ListParagraph"/>
+        <w:numPr>
+          <w:ilvl w:val="0"/>
+          <w:numId w:val="22"/>
+        </w:numPr>
+      </w:pPr>
+      <w:r>
+        <w:t>Thời gian đấu giá</w:t>
+      </w:r>
+    </w:p>
+    <w:p>
+      <w:pPr>
+        <w:pStyle w:val="ListParagraph"/>
+        <w:numPr>
+          <w:ilvl w:val="0"/>
+          <w:numId w:val="22"/>
+        </w:numPr>
+      </w:pPr>
+      <w:r>
         <w:t>Hình ảnh</w:t>
       </w:r>
     </w:p>
     <w:p>
       <w:pPr>
+        <w:ind w:left="0" w:firstLine="567"/>
+        <w:jc w:val="both"/>
+        <w:rPr>
+          <w:lang w:val="en-US"/>
+        </w:rPr>
+      </w:pPr>
+      <w:r>
+        <w:t>Sản phẩm chuyển sang trạng thái:</w:t>
+      </w:r>
+      <w:r>
+        <w:rPr>
+          <w:lang w:val="en-US"/>
+        </w:rPr>
+        <w:t xml:space="preserve"> </w:t>
+      </w:r>
+      <w:r>
+        <w:t>PENDING_APPROVAL</w:t>
+      </w:r>
+      <w:r>
+        <w:t xml:space="preserve"> chờ quản trị viên duyệt.</w:t>
+      </w:r>
+    </w:p>
+    <w:p>
+      <w:pPr>
+        <w:ind w:hanging="997"/>
+        <w:rPr>
+          <w:b/>
+        </w:rPr>
+      </w:pPr>
+      <w:r>
+        <w:rPr>
+          <w:b/>
+          <w:lang w:val="en-US"/>
+        </w:rPr>
+        <w:t>5</w:t>
+      </w:r>
+      <w:r>
+        <w:rPr>
+          <w:b/>
+        </w:rPr>
+        <w:t>.</w:t>
+      </w:r>
+      <w:r>
+        <w:rPr>
+          <w:b/>
+        </w:rPr>
+        <w:t>10</w:t>
+      </w:r>
+      <w:r>
+        <w:rPr>
+          <w:b/>
+        </w:rPr>
+        <w:t xml:space="preserve"> </w:t>
+      </w:r>
+      <w:r>
+        <w:rPr>
+          <w:b/>
+        </w:rPr>
+        <w:t>Quản trị viên</w:t>
+      </w:r>
+      <w:r>
+        <w:rPr>
+          <w:b/>
+        </w:rPr>
+        <w:t xml:space="preserve"> duyệt sản phẩm</w:t>
+      </w:r>
+    </w:p>
+    <w:p>
+      <w:pPr>
         <w:ind w:hanging="714"/>
-        <w:rPr>
-          <w:lang w:val="en-US"/>
-        </w:rPr>
-      </w:pPr>
-      <w:r>
-        <w:lastRenderedPageBreak/>
-        <w:t>Sản phẩm chuyển sang trạng thái:</w:t>
-      </w:r>
-      <w:r>
-        <w:rPr>
-          <w:lang w:val="en-US"/>
-        </w:rPr>
+      </w:pPr>
+      <w:r>
+        <w:t>Quản trị viên</w:t>
+      </w:r>
+      <w:r>
+        <w:t xml:space="preserve"> truy cập trang quản trị </w:t>
+      </w:r>
+      <w:r>
+        <w:t xml:space="preserve">→ </w:t>
+      </w:r>
+      <w:r>
+        <w:t>thẻ</w:t>
+      </w:r>
+      <w:r>
         <w:t xml:space="preserve"> </w:t>
       </w:r>
       <w:r>
-        <w:t>PENDING_APPROVAL</w:t>
-      </w:r>
-    </w:p>
-    <w:p>
-      <w:pPr>
-        <w:ind w:hanging="997"/>
-        <w:rPr>
-          <w:b/>
-        </w:rPr>
-      </w:pPr>
-      <w:r>
-        <w:rPr>
-          <w:b/>
-          <w:lang w:val="en-US"/>
-        </w:rPr>
-        <w:t>5</w:t>
-      </w:r>
-      <w:r>
-        <w:rPr>
-          <w:b/>
-        </w:rPr>
-        <w:t>.7 Admin duyệt sản phẩm</w:t>
-      </w:r>
-    </w:p>
-    <w:p>
-      <w:pPr>
-        <w:ind w:hanging="714"/>
-      </w:pPr>
-      <w:r>
-        <w:t>Admin truy cập trang quản trị để:</w:t>
+        <w:rPr>
+          <w:bCs w:val="0"/>
+        </w:rPr>
+        <w:t>Duyệt Phiên Đấu Giá</w:t>
+      </w:r>
+      <w:r>
+        <w:t xml:space="preserve"> </w:t>
+      </w:r>
+      <w:r>
+        <w:t>để:</w:t>
       </w:r>
     </w:p>
     <w:p>
@@ -1223,7 +2046,7 @@
         <w:t xml:space="preserve">là </w:t>
       </w:r>
       <w:r>
-        <w:t>UPCOMING (sắp diễn ra), hệ thống sẽ tự động chuyển sang ACTIVE khi đến giờ bắt đầu.</w:t>
+        <w:t>ACTIVE, bắt đầu đếm ngược thời gian đấu giá.</w:t>
       </w:r>
     </w:p>
     <w:p>
@@ -1244,15 +2067,273 @@
         <w:rPr>
           <w:b/>
         </w:rPr>
-        <w:t>.8 Kết thúc đấu giá</w:t>
-      </w:r>
-    </w:p>
-    <w:p>
-      <w:pPr>
-        <w:ind w:hanging="714"/>
-      </w:pPr>
-      <w:r>
-        <w:t>Khi hết thời gian:</w:t>
+        <w:t>.</w:t>
+      </w:r>
+      <w:r>
+        <w:rPr>
+          <w:b/>
+        </w:rPr>
+        <w:t>11</w:t>
+      </w:r>
+      <w:r>
+        <w:rPr>
+          <w:b/>
+        </w:rPr>
+        <w:t xml:space="preserve"> </w:t>
+      </w:r>
+      <w:r>
+        <w:rPr>
+          <w:b/>
+        </w:rPr>
+        <w:t>Quy trình đơn hàng</w:t>
+      </w:r>
+    </w:p>
+    <w:p>
+      <w:pPr>
+        <w:ind w:left="0" w:firstLine="567"/>
+      </w:pPr>
+      <w:r>
+        <w:t>T</w:t>
+      </w:r>
+      <w:r>
+        <w:t>iền được giữ bởi nền tảng, chỉ giải phóng cho người bán sau khi người mua xác nhận.</w:t>
+      </w:r>
+    </w:p>
+    <w:tbl>
+      <w:tblPr>
+        <w:tblStyle w:val="TableGrid"/>
+        <w:tblW w:w="0" w:type="auto"/>
+        <w:tblInd w:w="567" w:type="dxa"/>
+        <w:tblLook w:val="04A0" w:firstRow="1" w:lastRow="0" w:firstColumn="1" w:lastColumn="0" w:noHBand="0" w:noVBand="1"/>
+      </w:tblPr>
+      <w:tblGrid>
+        <w:gridCol w:w="2689"/>
+        <w:gridCol w:w="2308"/>
+        <w:gridCol w:w="3452"/>
+      </w:tblGrid>
+      <w:tr>
+        <w:tc>
+          <w:tcPr>
+            <w:tcW w:w="2689" w:type="dxa"/>
+          </w:tcPr>
+          <w:p>
+            <w:pPr>
+              <w:spacing w:line="360" w:lineRule="auto"/>
+              <w:ind w:left="0" w:firstLine="0"/>
+              <w:jc w:val="center"/>
+              <w:rPr>
+                <w:b/>
+                <w:bCs w:val="0"/>
+              </w:rPr>
+            </w:pPr>
+            <w:r>
+              <w:rPr>
+                <w:b/>
+                <w:bCs w:val="0"/>
+              </w:rPr>
+              <w:t>Bước</w:t>
+            </w:r>
+          </w:p>
+        </w:tc>
+        <w:tc>
+          <w:tcPr>
+            <w:tcW w:w="2308" w:type="dxa"/>
+          </w:tcPr>
+          <w:p>
+            <w:pPr>
+              <w:spacing w:line="360" w:lineRule="auto"/>
+              <w:ind w:left="0" w:firstLine="0"/>
+              <w:jc w:val="center"/>
+              <w:rPr>
+                <w:b/>
+                <w:bCs w:val="0"/>
+              </w:rPr>
+            </w:pPr>
+            <w:r>
+              <w:rPr>
+                <w:b/>
+                <w:bCs w:val="0"/>
+              </w:rPr>
+              <w:t>Ai thực hiện</w:t>
+            </w:r>
+          </w:p>
+        </w:tc>
+        <w:tc>
+          <w:tcPr>
+            <w:tcW w:w="3452" w:type="dxa"/>
+          </w:tcPr>
+          <w:p>
+            <w:pPr>
+              <w:spacing w:line="360" w:lineRule="auto"/>
+              <w:ind w:left="0" w:firstLine="0"/>
+              <w:jc w:val="center"/>
+              <w:rPr>
+                <w:b/>
+                <w:bCs w:val="0"/>
+              </w:rPr>
+            </w:pPr>
+            <w:r>
+              <w:rPr>
+                <w:b/>
+                <w:bCs w:val="0"/>
+              </w:rPr>
+              <w:t>Trạng thái</w:t>
+            </w:r>
+          </w:p>
+        </w:tc>
+      </w:tr>
+      <w:tr>
+        <w:tc>
+          <w:tcPr>
+            <w:tcW w:w="2689" w:type="dxa"/>
+          </w:tcPr>
+          <w:p>
+            <w:pPr>
+              <w:spacing w:line="360" w:lineRule="auto"/>
+              <w:ind w:left="0" w:firstLine="0"/>
+            </w:pPr>
+            <w:r>
+              <w:t>Người mua thanh toán</w:t>
+            </w:r>
+          </w:p>
+        </w:tc>
+        <w:tc>
+          <w:tcPr>
+            <w:tcW w:w="2308" w:type="dxa"/>
+          </w:tcPr>
+          <w:p>
+            <w:pPr>
+              <w:spacing w:line="360" w:lineRule="auto"/>
+              <w:ind w:left="0" w:firstLine="0"/>
+            </w:pPr>
+            <w:r>
+              <w:t>Người mua</w:t>
+            </w:r>
+          </w:p>
+        </w:tc>
+        <w:tc>
+          <w:tcPr>
+            <w:tcW w:w="3452" w:type="dxa"/>
+          </w:tcPr>
+          <w:p>
+            <w:pPr>
+              <w:spacing w:line="360" w:lineRule="auto"/>
+              <w:ind w:left="0" w:firstLine="0"/>
+            </w:pPr>
+            <w:r>
+              <w:t>PENDING → PENDING_CONFIRMATION</w:t>
+            </w:r>
+          </w:p>
+        </w:tc>
+      </w:tr>
+      <w:tr>
+        <w:tc>
+          <w:tcPr>
+            <w:tcW w:w="2689" w:type="dxa"/>
+          </w:tcPr>
+          <w:p>
+            <w:pPr>
+              <w:spacing w:line="360" w:lineRule="auto"/>
+              <w:ind w:left="0" w:firstLine="0"/>
+            </w:pPr>
+            <w:r>
+              <w:t>Xác nhận giao hàng</w:t>
+            </w:r>
+          </w:p>
+        </w:tc>
+        <w:tc>
+          <w:tcPr>
+            <w:tcW w:w="2308" w:type="dxa"/>
+          </w:tcPr>
+          <w:p>
+            <w:pPr>
+              <w:spacing w:line="360" w:lineRule="auto"/>
+              <w:ind w:left="0" w:firstLine="0"/>
+            </w:pPr>
+            <w:r>
+              <w:t>Người bán</w:t>
+            </w:r>
+          </w:p>
+        </w:tc>
+        <w:tc>
+          <w:tcPr>
+            <w:tcW w:w="3452" w:type="dxa"/>
+          </w:tcPr>
+          <w:p>
+            <w:pPr>
+              <w:tabs>
+                <w:tab w:val="left" w:pos="2173"/>
+              </w:tabs>
+              <w:spacing w:line="360" w:lineRule="auto"/>
+              <w:ind w:left="0" w:firstLine="0"/>
+            </w:pPr>
+            <w:r>
+              <w:t>PENDING_CONFIRMATION → SHIPPING</w:t>
+            </w:r>
+          </w:p>
+        </w:tc>
+      </w:tr>
+      <w:tr>
+        <w:tc>
+          <w:tcPr>
+            <w:tcW w:w="2689" w:type="dxa"/>
+          </w:tcPr>
+          <w:p>
+            <w:pPr>
+              <w:spacing w:line="360" w:lineRule="auto"/>
+              <w:ind w:left="0" w:firstLine="0"/>
+            </w:pPr>
+            <w:r>
+              <w:t xml:space="preserve">Xác nhận </w:t>
+            </w:r>
+            <w:r>
+              <w:t>nhận</w:t>
+            </w:r>
+            <w:r>
+              <w:t xml:space="preserve"> hàng</w:t>
+            </w:r>
+          </w:p>
+        </w:tc>
+        <w:tc>
+          <w:tcPr>
+            <w:tcW w:w="2308" w:type="dxa"/>
+          </w:tcPr>
+          <w:p>
+            <w:pPr>
+              <w:spacing w:line="360" w:lineRule="auto"/>
+              <w:ind w:left="0" w:firstLine="0"/>
+            </w:pPr>
+            <w:r>
+              <w:t>Người mua</w:t>
+            </w:r>
+          </w:p>
+        </w:tc>
+        <w:tc>
+          <w:tcPr>
+            <w:tcW w:w="3452" w:type="dxa"/>
+          </w:tcPr>
+          <w:p>
+            <w:pPr>
+              <w:spacing w:line="360" w:lineRule="auto"/>
+              <w:ind w:left="0" w:firstLine="0"/>
+            </w:pPr>
+            <w:r>
+              <w:t>SHIPPING → PAID</w:t>
+            </w:r>
+          </w:p>
+        </w:tc>
+      </w:tr>
+    </w:tbl>
+    <w:p>
+      <w:pPr>
+        <w:tabs>
+          <w:tab w:val="center" w:pos="4796"/>
+        </w:tabs>
+        <w:spacing w:before="240"/>
+        <w:ind w:left="567" w:firstLine="0"/>
+      </w:pPr>
+      <w:r>
+        <w:t>Phương thức thanh toán hỗ trợ:</w:t>
       </w:r>
     </w:p>
     <w:p>
@@ -1260,14 +2341,20 @@
         <w:pStyle w:val="ListParagraph"/>
         <w:numPr>
           <w:ilvl w:val="0"/>
-          <w:numId w:val="27"/>
+          <w:numId w:val="23"/>
         </w:numPr>
-        <w:rPr>
-          <w:lang w:val="en-US"/>
-        </w:rPr>
-      </w:pPr>
-      <w:r>
-        <w:t xml:space="preserve">Trường hợp đạt giá sàn (có người đặt giá đủ điều kiện): </w:t>
+        <w:tabs>
+          <w:tab w:val="center" w:pos="4796"/>
+        </w:tabs>
+      </w:pPr>
+      <w:r>
+        <w:rPr>
+          <w:b/>
+        </w:rPr>
+        <w:t>Ví hệ thống</w:t>
+      </w:r>
+      <w:r>
+        <w:t xml:space="preserve"> — trừ tiền ví ngay lập tức, tự động </w:t>
       </w:r>
     </w:p>
     <w:p>
@@ -1275,14 +2362,20 @@
         <w:pStyle w:val="ListParagraph"/>
         <w:numPr>
           <w:ilvl w:val="0"/>
-          <w:numId w:val="27"/>
+          <w:numId w:val="23"/>
         </w:numPr>
-        <w:rPr>
-          <w:lang w:val="en-US"/>
-        </w:rPr>
-      </w:pPr>
-      <w:r>
-        <w:t xml:space="preserve">Hệ thống xác định người trả giá cao nhất là người thắng </w:t>
+        <w:tabs>
+          <w:tab w:val="center" w:pos="4796"/>
+        </w:tabs>
+      </w:pPr>
+      <w:r>
+        <w:rPr>
+          <w:b/>
+        </w:rPr>
+        <w:t>VNPay</w:t>
+      </w:r>
+      <w:r>
+        <w:t xml:space="preserve"> — thanh toán qua cổng VNPay </w:t>
       </w:r>
     </w:p>
     <w:p>
@@ -1290,192 +2383,168 @@
         <w:pStyle w:val="ListParagraph"/>
         <w:numPr>
           <w:ilvl w:val="0"/>
-          <w:numId w:val="27"/>
+          <w:numId w:val="23"/>
         </w:numPr>
-        <w:rPr>
+        <w:tabs>
+          <w:tab w:val="center" w:pos="4796"/>
+        </w:tabs>
+      </w:pPr>
+      <w:r>
+        <w:rPr>
+          <w:b/>
+        </w:rPr>
+        <w:t>COD</w:t>
+      </w:r>
+      <w:r>
+        <w:t xml:space="preserve"> — thanh toán khi nhận hàng</w:t>
+      </w:r>
+    </w:p>
+    <w:p>
+      <w:pPr>
+        <w:tabs>
+          <w:tab w:val="center" w:pos="4796"/>
+        </w:tabs>
+        <w:ind w:left="0" w:firstLine="567"/>
+      </w:pPr>
+      <w:r>
+        <w:lastRenderedPageBreak/>
+        <w:t xml:space="preserve">Nếu người mua không xác nhận sau </w:t>
+      </w:r>
+      <w:r>
+        <w:rPr>
+          <w:b/>
+        </w:rPr>
+        <w:t>7 ngày</w:t>
+      </w:r>
+      <w:r>
+        <w:t xml:space="preserve"> kể từ khi giao hàng, hệ thống tự động hoàn tất đơn và giải phóng tiền cho người bán.</w:t>
+      </w:r>
+    </w:p>
+    <w:p>
+      <w:pPr>
+        <w:ind w:hanging="997"/>
+        <w:rPr>
+          <w:b/>
+        </w:rPr>
+      </w:pPr>
+      <w:r>
+        <w:rPr>
+          <w:b/>
           <w:lang w:val="en-US"/>
         </w:rPr>
-      </w:pPr>
-      <w:r>
-        <w:t xml:space="preserve">Chuyển trạng thái phiên sang SOLD </w:t>
-      </w:r>
-    </w:p>
-    <w:p>
-      <w:pPr>
-        <w:pStyle w:val="ListParagraph"/>
-        <w:numPr>
-          <w:ilvl w:val="0"/>
-          <w:numId w:val="27"/>
-        </w:numPr>
-        <w:rPr>
+        <w:t>5</w:t>
+      </w:r>
+      <w:r>
+        <w:rPr>
+          <w:b/>
+        </w:rPr>
+        <w:t>.</w:t>
+      </w:r>
+      <w:r>
+        <w:rPr>
+          <w:b/>
+        </w:rPr>
+        <w:t>12</w:t>
+      </w:r>
+      <w:r>
+        <w:rPr>
+          <w:b/>
+        </w:rPr>
+        <w:t xml:space="preserve"> </w:t>
+      </w:r>
+      <w:r>
+        <w:rPr>
+          <w:b/>
+        </w:rPr>
+        <w:t>Báo cáo vi phạm</w:t>
+      </w:r>
+    </w:p>
+    <w:p>
+      <w:pPr>
+        <w:ind w:left="0" w:firstLine="567"/>
+        <w:rPr>
+          <w:bCs w:val="0"/>
+        </w:rPr>
+      </w:pPr>
+      <w:r>
+        <w:t xml:space="preserve">Người dùng có thể báo cáo người bán vi phạm từ trang chi tiết sản phẩm. </w:t>
+      </w:r>
+      <w:r>
+        <w:t>Quản trị viên</w:t>
+      </w:r>
+      <w:r>
+        <w:t xml:space="preserve"> xem và xử lý trong </w:t>
+      </w:r>
+      <w:r>
+        <w:t>thẻ</w:t>
+      </w:r>
+      <w:r>
+        <w:t xml:space="preserve"> </w:t>
+      </w:r>
+      <w:r>
+        <w:rPr>
+          <w:bCs w:val="0"/>
+        </w:rPr>
+        <w:t>Báo Cáo.</w:t>
+      </w:r>
+    </w:p>
+    <w:p>
+      <w:pPr>
+        <w:ind w:hanging="997"/>
+        <w:rPr>
+          <w:b/>
+        </w:rPr>
+      </w:pPr>
+      <w:r>
+        <w:rPr>
+          <w:b/>
           <w:lang w:val="en-US"/>
         </w:rPr>
-      </w:pPr>
-      <w:r>
-        <w:t xml:space="preserve">Tạo đơn hàng tự động </w:t>
-      </w:r>
-    </w:p>
-    <w:p>
-      <w:pPr>
-        <w:pStyle w:val="ListParagraph"/>
-        <w:numPr>
-          <w:ilvl w:val="0"/>
-          <w:numId w:val="27"/>
-        </w:numPr>
-        <w:rPr>
-          <w:lang w:val="en-US"/>
-        </w:rPr>
-      </w:pPr>
-      <w:r>
-        <w:t xml:space="preserve">Gửi thông báo cho người thắng và người bán </w:t>
-      </w:r>
-    </w:p>
-    <w:p>
-      <w:pPr>
-        <w:ind w:hanging="714"/>
-        <w:rPr>
-          <w:lang w:val="en-US"/>
-        </w:rPr>
-      </w:pPr>
-      <w:r>
-        <w:t xml:space="preserve">Trường hợp không đạt giá sàn: </w:t>
-      </w:r>
-    </w:p>
-    <w:p>
-      <w:pPr>
-        <w:pStyle w:val="ListParagraph"/>
-        <w:numPr>
-          <w:ilvl w:val="0"/>
-          <w:numId w:val="28"/>
-        </w:numPr>
-        <w:rPr>
-          <w:lang w:val="en-US"/>
-        </w:rPr>
-      </w:pPr>
-      <w:r>
-        <w:t xml:space="preserve">Chuyển trạng thái phiên sang FAILED </w:t>
-      </w:r>
-    </w:p>
-    <w:p>
-      <w:pPr>
-        <w:pStyle w:val="ListParagraph"/>
-        <w:numPr>
-          <w:ilvl w:val="0"/>
-          <w:numId w:val="28"/>
-        </w:numPr>
-        <w:rPr>
-          <w:lang w:val="en-US"/>
-        </w:rPr>
-      </w:pPr>
-      <w:r>
-        <w:t xml:space="preserve">Không tạo đơn hàng </w:t>
-      </w:r>
-    </w:p>
-    <w:p>
-      <w:pPr>
-        <w:pStyle w:val="ListParagraph"/>
-        <w:numPr>
-          <w:ilvl w:val="0"/>
-          <w:numId w:val="28"/>
-        </w:numPr>
-        <w:rPr>
-          <w:lang w:val="en-US"/>
-        </w:rPr>
-      </w:pPr>
-      <w:r>
-        <w:t>Gửi thông báo cho người bán</w:t>
-      </w:r>
-    </w:p>
-    <w:p>
-      <w:pPr>
-        <w:ind w:hanging="997"/>
-        <w:rPr>
-          <w:b/>
-        </w:rPr>
-      </w:pPr>
-      <w:r>
-        <w:rPr>
-          <w:b/>
-          <w:lang w:val="en-US"/>
-        </w:rPr>
         <w:t>5</w:t>
       </w:r>
       <w:r>
         <w:rPr>
           <w:b/>
         </w:rPr>
-        <w:t>.9 Quản lý đơn hàng</w:t>
-      </w:r>
-    </w:p>
-    <w:p>
-      <w:pPr>
-        <w:ind w:hanging="714"/>
-      </w:pPr>
-      <w:r>
-        <w:t>Các trạng thái:</w:t>
-      </w:r>
-    </w:p>
-    <w:p>
-      <w:pPr>
-        <w:pStyle w:val="ListParagraph"/>
-        <w:numPr>
-          <w:ilvl w:val="0"/>
-          <w:numId w:val="24"/>
-        </w:numPr>
-      </w:pPr>
-      <w:r>
-        <w:t>PENDING</w:t>
-      </w:r>
-    </w:p>
-    <w:p>
-      <w:pPr>
-        <w:pStyle w:val="ListParagraph"/>
-        <w:numPr>
-          <w:ilvl w:val="0"/>
-          <w:numId w:val="24"/>
-        </w:numPr>
-      </w:pPr>
-      <w:r>
-        <w:t>PENDING_CONFIRMATION</w:t>
-      </w:r>
-    </w:p>
-    <w:p>
-      <w:pPr>
-        <w:pStyle w:val="ListParagraph"/>
-        <w:numPr>
-          <w:ilvl w:val="0"/>
-          <w:numId w:val="24"/>
-        </w:numPr>
-      </w:pPr>
-      <w:r>
-        <w:t>SHIPPING</w:t>
-      </w:r>
-    </w:p>
-    <w:p>
-      <w:pPr>
-        <w:pStyle w:val="ListParagraph"/>
-        <w:numPr>
-          <w:ilvl w:val="0"/>
-          <w:numId w:val="24"/>
-        </w:numPr>
-      </w:pPr>
-      <w:r>
-        <w:t>PAID</w:t>
-      </w:r>
-    </w:p>
-    <w:p>
-      <w:pPr>
-        <w:pStyle w:val="ListParagraph"/>
-        <w:numPr>
-          <w:ilvl w:val="0"/>
-          <w:numId w:val="24"/>
-        </w:numPr>
-        <w:rPr>
-          <w:lang w:val="en-US"/>
-        </w:rPr>
-      </w:pPr>
-      <w:r>
-        <w:t>CANCELLED</w:t>
+        <w:t>.</w:t>
+      </w:r>
+      <w:r>
+        <w:rPr>
+          <w:b/>
+        </w:rPr>
+        <w:t>1</w:t>
+      </w:r>
+      <w:r>
+        <w:rPr>
+          <w:b/>
+        </w:rPr>
+        <w:t>3</w:t>
+      </w:r>
+      <w:r>
+        <w:rPr>
+          <w:b/>
+        </w:rPr>
+        <w:t xml:space="preserve"> </w:t>
+      </w:r>
+      <w:r>
+        <w:rPr>
+          <w:b/>
+        </w:rPr>
+        <w:t>Điểm tín nhiệm</w:t>
+      </w:r>
+    </w:p>
+    <w:p>
+      <w:pPr>
+        <w:ind w:left="0" w:firstLine="567"/>
+        <w:rPr>
+          <w:bCs w:val="0"/>
+        </w:rPr>
+      </w:pPr>
+      <w:r>
+        <w:rPr>
+          <w:bCs w:val="0"/>
+        </w:rPr>
+        <w:t>Hệ thống tự động tính điểm tín nhiệm cho người mua và người bán dựa trên lịch sử giao dịch. Hiển thị trong trang hồ sơ cá nhân.</w:t>
       </w:r>
     </w:p>
     <w:p>
@@ -1503,31 +2572,31 @@
       <w:pPr>
         <w:ind w:left="0" w:firstLine="567"/>
         <w:jc w:val="both"/>
+      </w:pPr>
+      <w:r>
+        <w:t xml:space="preserve">Script </w:t>
+      </w:r>
+      <w:r>
         <w:rPr>
           <w:lang w:val="en-US"/>
         </w:rPr>
-      </w:pPr>
-      <w:r>
-        <w:t xml:space="preserve">Script </w:t>
-      </w:r>
-      <w:r>
-        <w:rPr>
-          <w:lang w:val="en-US"/>
-        </w:rPr>
         <w:t>test_buy_now_concurrent.py</w:t>
       </w:r>
       <w:r>
-        <w:t xml:space="preserve"> kiểm tra tính đúng đắn của cơ chế Optimistic Locking: nhiều người dùng cùng nhấn "Mua ngay" một lúc, hệ thống chỉ cho phép đúng 1 người mua thành công.</w:t>
-      </w:r>
-    </w:p>
-    <w:p>
-      <w:pPr>
-        <w:ind w:left="0" w:firstLine="567"/>
-        <w:jc w:val="both"/>
-        <w:rPr>
-          <w:lang w:val="en-US"/>
-        </w:rPr>
-      </w:pPr>
+        <w:t xml:space="preserve"> kiểm tra tính đúng đắn của cơ chế Optimistic Locking: nhiều người dùng cùng nhấn </w:t>
+      </w:r>
+      <w:r>
+        <w:t>“</w:t>
+      </w:r>
+      <w:r>
+        <w:t>Mua ngay</w:t>
+      </w:r>
+      <w:r>
+        <w:t>”</w:t>
+      </w:r>
+      <w:r>
+        <w:t xml:space="preserve"> một lúc, hệ thống chỉ cho phép đúng 1 người mua thành công.</w:t>
+      </w:r>
     </w:p>
     <w:p>
       <w:pPr>
@@ -1540,7 +2609,6 @@
         <w:rPr>
           <w:b/>
         </w:rPr>
-        <w:lastRenderedPageBreak/>
         <w:t>Yêu cầu</w:t>
       </w:r>
     </w:p>
@@ -1893,6 +2961,7 @@
         <w:rPr>
           <w:b/>
         </w:rPr>
+        <w:lastRenderedPageBreak/>
         <w:t>Lỗi MySQL không kết nối</w:t>
       </w:r>
     </w:p>
@@ -2010,6 +3079,259 @@
       <w:r>
         <w:t>và cấu hình Java version.</w:t>
       </w:r>
+    </w:p>
+    <w:p>
+      <w:pPr>
+        <w:tabs>
+          <w:tab w:val="left" w:pos="567"/>
+          <w:tab w:val="left" w:pos="1440"/>
+          <w:tab w:val="left" w:pos="2160"/>
+          <w:tab w:val="left" w:pos="2880"/>
+          <w:tab w:val="left" w:pos="3600"/>
+          <w:tab w:val="left" w:pos="4320"/>
+          <w:tab w:val="left" w:pos="5093"/>
+        </w:tabs>
+        <w:ind w:left="0" w:firstLine="567"/>
+        <w:rPr>
+          <w:b/>
+          <w:bCs w:val="0"/>
+        </w:rPr>
+      </w:pPr>
+      <w:r>
+        <w:rPr>
+          <w:b/>
+          <w:bCs w:val="0"/>
+        </w:rPr>
+        <w:t>Đăng nhập không nhận được OTP</w:t>
+      </w:r>
+      <w:r>
+        <w:rPr>
+          <w:b/>
+          <w:bCs w:val="0"/>
+        </w:rPr>
+        <w:tab/>
+      </w:r>
+    </w:p>
+    <w:p>
+      <w:pPr>
+        <w:tabs>
+          <w:tab w:val="left" w:pos="720"/>
+          <w:tab w:val="left" w:pos="1440"/>
+          <w:tab w:val="left" w:pos="2160"/>
+          <w:tab w:val="left" w:pos="2880"/>
+          <w:tab w:val="left" w:pos="3600"/>
+          <w:tab w:val="left" w:pos="4320"/>
+          <w:tab w:val="left" w:pos="5093"/>
+        </w:tabs>
+        <w:ind w:left="0" w:firstLine="567"/>
+      </w:pPr>
+      <w:r>
+        <w:t>Kiểm tra:</w:t>
+      </w:r>
+    </w:p>
+    <w:p>
+      <w:pPr>
+        <w:pStyle w:val="ListParagraph"/>
+        <w:numPr>
+          <w:ilvl w:val="0"/>
+          <w:numId w:val="40"/>
+        </w:numPr>
+        <w:tabs>
+          <w:tab w:val="left" w:pos="720"/>
+          <w:tab w:val="left" w:pos="1440"/>
+          <w:tab w:val="left" w:pos="2160"/>
+          <w:tab w:val="left" w:pos="2880"/>
+          <w:tab w:val="left" w:pos="3600"/>
+          <w:tab w:val="left" w:pos="4320"/>
+          <w:tab w:val="left" w:pos="5093"/>
+        </w:tabs>
+      </w:pPr>
+      <w:r>
+        <w:t>Điện thoại Android cài app TextBee đang bật và kết nối mạng</w:t>
+      </w:r>
+    </w:p>
+    <w:p>
+      <w:pPr>
+        <w:pStyle w:val="ListParagraph"/>
+        <w:numPr>
+          <w:ilvl w:val="0"/>
+          <w:numId w:val="40"/>
+        </w:numPr>
+        <w:tabs>
+          <w:tab w:val="left" w:pos="720"/>
+          <w:tab w:val="left" w:pos="1440"/>
+          <w:tab w:val="left" w:pos="2160"/>
+          <w:tab w:val="left" w:pos="2880"/>
+          <w:tab w:val="left" w:pos="3600"/>
+          <w:tab w:val="left" w:pos="4320"/>
+          <w:tab w:val="left" w:pos="5093"/>
+        </w:tabs>
+      </w:pPr>
+      <w:r>
+        <w:t>textbee.api-key và textbee.device-id trong application.properties đúng chưa</w:t>
+      </w:r>
+    </w:p>
+    <w:p>
+      <w:pPr>
+        <w:pStyle w:val="ListParagraph"/>
+        <w:numPr>
+          <w:ilvl w:val="0"/>
+          <w:numId w:val="40"/>
+        </w:numPr>
+        <w:tabs>
+          <w:tab w:val="left" w:pos="720"/>
+          <w:tab w:val="left" w:pos="1440"/>
+          <w:tab w:val="left" w:pos="2160"/>
+          <w:tab w:val="left" w:pos="2880"/>
+          <w:tab w:val="left" w:pos="3600"/>
+          <w:tab w:val="left" w:pos="4320"/>
+          <w:tab w:val="left" w:pos="5093"/>
+        </w:tabs>
+      </w:pPr>
+      <w:r>
+        <w:t>Số điện thoại trong tài khoản có đúng định dạng 10 số (VD: 0901234567) không</w:t>
+      </w:r>
+    </w:p>
+    <w:p>
+      <w:pPr>
+        <w:tabs>
+          <w:tab w:val="left" w:pos="720"/>
+          <w:tab w:val="left" w:pos="1440"/>
+          <w:tab w:val="left" w:pos="2160"/>
+          <w:tab w:val="left" w:pos="2880"/>
+          <w:tab w:val="left" w:pos="3600"/>
+          <w:tab w:val="left" w:pos="4320"/>
+          <w:tab w:val="left" w:pos="5093"/>
+        </w:tabs>
+        <w:ind w:left="360" w:firstLine="0"/>
+        <w:rPr>
+          <w:b/>
+          <w:bCs w:val="0"/>
+        </w:rPr>
+      </w:pPr>
+      <w:r>
+        <w:rPr>
+          <w:b/>
+          <w:bCs w:val="0"/>
+        </w:rPr>
+        <w:t>Nạp tiền VNPay báo lỗi</w:t>
+      </w:r>
+    </w:p>
+    <w:p>
+      <w:pPr>
+        <w:tabs>
+          <w:tab w:val="left" w:pos="720"/>
+          <w:tab w:val="left" w:pos="1440"/>
+          <w:tab w:val="left" w:pos="2160"/>
+          <w:tab w:val="left" w:pos="2880"/>
+          <w:tab w:val="left" w:pos="3600"/>
+          <w:tab w:val="left" w:pos="4320"/>
+          <w:tab w:val="left" w:pos="5093"/>
+        </w:tabs>
+        <w:ind w:left="360" w:firstLine="207"/>
+      </w:pPr>
+      <w:r>
+        <w:t>Kiểm tra:</w:t>
+      </w:r>
+    </w:p>
+    <w:p>
+      <w:pPr>
+        <w:pStyle w:val="ListParagraph"/>
+        <w:numPr>
+          <w:ilvl w:val="0"/>
+          <w:numId w:val="40"/>
+        </w:numPr>
+        <w:tabs>
+          <w:tab w:val="left" w:pos="720"/>
+          <w:tab w:val="left" w:pos="1440"/>
+          <w:tab w:val="left" w:pos="2160"/>
+          <w:tab w:val="left" w:pos="2880"/>
+          <w:tab w:val="left" w:pos="3600"/>
+          <w:tab w:val="left" w:pos="4320"/>
+          <w:tab w:val="left" w:pos="5093"/>
+        </w:tabs>
+      </w:pPr>
+      <w:r>
+        <w:t>Đang dùng đúng thẻ test NCB (9704198526191432198) chưa</w:t>
+      </w:r>
+    </w:p>
+    <w:p>
+      <w:pPr>
+        <w:pStyle w:val="ListParagraph"/>
+        <w:numPr>
+          <w:ilvl w:val="0"/>
+          <w:numId w:val="40"/>
+        </w:numPr>
+        <w:tabs>
+          <w:tab w:val="left" w:pos="720"/>
+          <w:tab w:val="left" w:pos="1440"/>
+          <w:tab w:val="left" w:pos="2160"/>
+          <w:tab w:val="left" w:pos="2880"/>
+          <w:tab w:val="left" w:pos="3600"/>
+          <w:tab w:val="left" w:pos="4320"/>
+          <w:tab w:val="left" w:pos="5093"/>
+        </w:tabs>
+      </w:pPr>
+      <w:r>
+        <w:t>Chọn tab Thẻ nội địa/Internet Banking → ngân hàng NCB, không dùng QR</w:t>
+      </w:r>
+    </w:p>
+    <w:p>
+      <w:pPr>
+        <w:pStyle w:val="ListParagraph"/>
+        <w:numPr>
+          <w:ilvl w:val="0"/>
+          <w:numId w:val="40"/>
+        </w:numPr>
+        <w:tabs>
+          <w:tab w:val="left" w:pos="720"/>
+          <w:tab w:val="left" w:pos="1440"/>
+          <w:tab w:val="left" w:pos="2160"/>
+          <w:tab w:val="left" w:pos="2880"/>
+          <w:tab w:val="left" w:pos="3600"/>
+          <w:tab w:val="left" w:pos="4320"/>
+          <w:tab w:val="left" w:pos="5093"/>
+        </w:tabs>
+      </w:pPr>
+      <w:r>
+        <w:t>vnpay.return-url trong application.properties phải là http://localhost:3000/payment/callback</w:t>
+      </w:r>
+    </w:p>
+    <w:p>
+      <w:pPr>
+        <w:tabs>
+          <w:tab w:val="left" w:pos="720"/>
+          <w:tab w:val="left" w:pos="1440"/>
+          <w:tab w:val="left" w:pos="2160"/>
+          <w:tab w:val="left" w:pos="2880"/>
+          <w:tab w:val="left" w:pos="3600"/>
+          <w:tab w:val="left" w:pos="4320"/>
+          <w:tab w:val="left" w:pos="5093"/>
+        </w:tabs>
+        <w:ind w:left="360" w:firstLine="0"/>
+        <w:rPr>
+          <w:b/>
+          <w:bCs w:val="0"/>
+        </w:rPr>
+      </w:pPr>
+    </w:p>
+    <w:p>
+      <w:pPr>
+        <w:tabs>
+          <w:tab w:val="left" w:pos="720"/>
+          <w:tab w:val="left" w:pos="1440"/>
+          <w:tab w:val="left" w:pos="2160"/>
+          <w:tab w:val="left" w:pos="2880"/>
+          <w:tab w:val="left" w:pos="3600"/>
+          <w:tab w:val="left" w:pos="4320"/>
+          <w:tab w:val="left" w:pos="5093"/>
+        </w:tabs>
+        <w:ind w:left="0" w:firstLine="0"/>
+        <w:rPr>
+          <w:b/>
+          <w:bCs w:val="0"/>
+        </w:rPr>
+      </w:pPr>
     </w:p>
     <w:sectPr>
       <w:pgSz w:w="11906" w:h="16838"/>
@@ -2322,6 +3644,530 @@
     </w:lvl>
   </w:abstractNum>
   <w:abstractNum w:abstractNumId="2" w15:restartNumberingAfterBreak="0">
+    <w:nsid w:val="083D47AF"/>
+    <w:multiLevelType w:val="hybridMultilevel"/>
+    <w:tmpl w:val="74CE65BE"/>
+    <w:lvl w:ilvl="0" w:tplc="042A0001">
+      <w:start w:val="1"/>
+      <w:numFmt w:val="bullet"/>
+      <w:lvlText w:val=""/>
+      <w:lvlJc w:val="left"/>
+      <w:pPr>
+        <w:ind w:left="1080" w:hanging="360"/>
+      </w:pPr>
+      <w:rPr>
+        <w:rFonts w:ascii="Symbol" w:hAnsi="Symbol" w:hint="default"/>
+      </w:rPr>
+    </w:lvl>
+    <w:lvl w:ilvl="1" w:tplc="042A0003" w:tentative="1">
+      <w:start w:val="1"/>
+      <w:numFmt w:val="bullet"/>
+      <w:lvlText w:val="o"/>
+      <w:lvlJc w:val="left"/>
+      <w:pPr>
+        <w:ind w:left="1800" w:hanging="360"/>
+      </w:pPr>
+      <w:rPr>
+        <w:rFonts w:ascii="Courier New" w:hAnsi="Courier New" w:cs="Courier New" w:hint="default"/>
+      </w:rPr>
+    </w:lvl>
+    <w:lvl w:ilvl="2" w:tplc="042A0005" w:tentative="1">
+      <w:start w:val="1"/>
+      <w:numFmt w:val="bullet"/>
+      <w:lvlText w:val=""/>
+      <w:lvlJc w:val="left"/>
+      <w:pPr>
+        <w:ind w:left="2520" w:hanging="360"/>
+      </w:pPr>
+      <w:rPr>
+        <w:rFonts w:ascii="Wingdings" w:hAnsi="Wingdings" w:hint="default"/>
+      </w:rPr>
+    </w:lvl>
+    <w:lvl w:ilvl="3" w:tplc="042A0001" w:tentative="1">
+      <w:start w:val="1"/>
+      <w:numFmt w:val="bullet"/>
+      <w:lvlText w:val=""/>
+      <w:lvlJc w:val="left"/>
+      <w:pPr>
+        <w:ind w:left="3240" w:hanging="360"/>
+      </w:pPr>
+      <w:rPr>
+        <w:rFonts w:ascii="Symbol" w:hAnsi="Symbol" w:hint="default"/>
+      </w:rPr>
+    </w:lvl>
+    <w:lvl w:ilvl="4" w:tplc="042A0003" w:tentative="1">
+      <w:start w:val="1"/>
+      <w:numFmt w:val="bullet"/>
+      <w:lvlText w:val="o"/>
+      <w:lvlJc w:val="left"/>
+      <w:pPr>
+        <w:ind w:left="3960" w:hanging="360"/>
+      </w:pPr>
+      <w:rPr>
+        <w:rFonts w:ascii="Courier New" w:hAnsi="Courier New" w:cs="Courier New" w:hint="default"/>
+      </w:rPr>
+    </w:lvl>
+    <w:lvl w:ilvl="5" w:tplc="042A0005" w:tentative="1">
+      <w:start w:val="1"/>
+      <w:numFmt w:val="bullet"/>
+      <w:lvlText w:val=""/>
+      <w:lvlJc w:val="left"/>
+      <w:pPr>
+        <w:ind w:left="4680" w:hanging="360"/>
+      </w:pPr>
+      <w:rPr>
+        <w:rFonts w:ascii="Wingdings" w:hAnsi="Wingdings" w:hint="default"/>
+      </w:rPr>
+    </w:lvl>
+    <w:lvl w:ilvl="6" w:tplc="042A0001" w:tentative="1">
+      <w:start w:val="1"/>
+      <w:numFmt w:val="bullet"/>
+      <w:lvlText w:val=""/>
+      <w:lvlJc w:val="left"/>
+      <w:pPr>
+        <w:ind w:left="5400" w:hanging="360"/>
+      </w:pPr>
+      <w:rPr>
+        <w:rFonts w:ascii="Symbol" w:hAnsi="Symbol" w:hint="default"/>
+      </w:rPr>
+    </w:lvl>
+    <w:lvl w:ilvl="7" w:tplc="042A0003" w:tentative="1">
+      <w:start w:val="1"/>
+      <w:numFmt w:val="bullet"/>
+      <w:lvlText w:val="o"/>
+      <w:lvlJc w:val="left"/>
+      <w:pPr>
+        <w:ind w:left="6120" w:hanging="360"/>
+      </w:pPr>
+      <w:rPr>
+        <w:rFonts w:ascii="Courier New" w:hAnsi="Courier New" w:cs="Courier New" w:hint="default"/>
+      </w:rPr>
+    </w:lvl>
+    <w:lvl w:ilvl="8" w:tplc="042A0005" w:tentative="1">
+      <w:start w:val="1"/>
+      <w:numFmt w:val="bullet"/>
+      <w:lvlText w:val=""/>
+      <w:lvlJc w:val="left"/>
+      <w:pPr>
+        <w:ind w:left="6840" w:hanging="360"/>
+      </w:pPr>
+      <w:rPr>
+        <w:rFonts w:ascii="Wingdings" w:hAnsi="Wingdings" w:hint="default"/>
+      </w:rPr>
+    </w:lvl>
+  </w:abstractNum>
+  <w:abstractNum w:abstractNumId="3" w15:restartNumberingAfterBreak="0">
+    <w:nsid w:val="09041660"/>
+    <w:multiLevelType w:val="hybridMultilevel"/>
+    <w:tmpl w:val="3872C64A"/>
+    <w:lvl w:ilvl="0" w:tplc="042A0001">
+      <w:start w:val="1"/>
+      <w:numFmt w:val="bullet"/>
+      <w:lvlText w:val=""/>
+      <w:lvlJc w:val="left"/>
+      <w:pPr>
+        <w:ind w:left="1287" w:hanging="360"/>
+      </w:pPr>
+      <w:rPr>
+        <w:rFonts w:ascii="Symbol" w:hAnsi="Symbol" w:hint="default"/>
+      </w:rPr>
+    </w:lvl>
+    <w:lvl w:ilvl="1" w:tplc="042A0003" w:tentative="1">
+      <w:start w:val="1"/>
+      <w:numFmt w:val="bullet"/>
+      <w:lvlText w:val="o"/>
+      <w:lvlJc w:val="left"/>
+      <w:pPr>
+        <w:ind w:left="2007" w:hanging="360"/>
+      </w:pPr>
+      <w:rPr>
+        <w:rFonts w:ascii="Courier New" w:hAnsi="Courier New" w:cs="Courier New" w:hint="default"/>
+      </w:rPr>
+    </w:lvl>
+    <w:lvl w:ilvl="2" w:tplc="042A0005" w:tentative="1">
+      <w:start w:val="1"/>
+      <w:numFmt w:val="bullet"/>
+      <w:lvlText w:val=""/>
+      <w:lvlJc w:val="left"/>
+      <w:pPr>
+        <w:ind w:left="2727" w:hanging="360"/>
+      </w:pPr>
+      <w:rPr>
+        <w:rFonts w:ascii="Wingdings" w:hAnsi="Wingdings" w:hint="default"/>
+      </w:rPr>
+    </w:lvl>
+    <w:lvl w:ilvl="3" w:tplc="042A0001" w:tentative="1">
+      <w:start w:val="1"/>
+      <w:numFmt w:val="bullet"/>
+      <w:lvlText w:val=""/>
+      <w:lvlJc w:val="left"/>
+      <w:pPr>
+        <w:ind w:left="3447" w:hanging="360"/>
+      </w:pPr>
+      <w:rPr>
+        <w:rFonts w:ascii="Symbol" w:hAnsi="Symbol" w:hint="default"/>
+      </w:rPr>
+    </w:lvl>
+    <w:lvl w:ilvl="4" w:tplc="042A0003" w:tentative="1">
+      <w:start w:val="1"/>
+      <w:numFmt w:val="bullet"/>
+      <w:lvlText w:val="o"/>
+      <w:lvlJc w:val="left"/>
+      <w:pPr>
+        <w:ind w:left="4167" w:hanging="360"/>
+      </w:pPr>
+      <w:rPr>
+        <w:rFonts w:ascii="Courier New" w:hAnsi="Courier New" w:cs="Courier New" w:hint="default"/>
+      </w:rPr>
+    </w:lvl>
+    <w:lvl w:ilvl="5" w:tplc="042A0005" w:tentative="1">
+      <w:start w:val="1"/>
+      <w:numFmt w:val="bullet"/>
+      <w:lvlText w:val=""/>
+      <w:lvlJc w:val="left"/>
+      <w:pPr>
+        <w:ind w:left="4887" w:hanging="360"/>
+      </w:pPr>
+      <w:rPr>
+        <w:rFonts w:ascii="Wingdings" w:hAnsi="Wingdings" w:hint="default"/>
+      </w:rPr>
+    </w:lvl>
+    <w:lvl w:ilvl="6" w:tplc="042A0001" w:tentative="1">
+      <w:start w:val="1"/>
+      <w:numFmt w:val="bullet"/>
+      <w:lvlText w:val=""/>
+      <w:lvlJc w:val="left"/>
+      <w:pPr>
+        <w:ind w:left="5607" w:hanging="360"/>
+      </w:pPr>
+      <w:rPr>
+        <w:rFonts w:ascii="Symbol" w:hAnsi="Symbol" w:hint="default"/>
+      </w:rPr>
+    </w:lvl>
+    <w:lvl w:ilvl="7" w:tplc="042A0003" w:tentative="1">
+      <w:start w:val="1"/>
+      <w:numFmt w:val="bullet"/>
+      <w:lvlText w:val="o"/>
+      <w:lvlJc w:val="left"/>
+      <w:pPr>
+        <w:ind w:left="6327" w:hanging="360"/>
+      </w:pPr>
+      <w:rPr>
+        <w:rFonts w:ascii="Courier New" w:hAnsi="Courier New" w:cs="Courier New" w:hint="default"/>
+      </w:rPr>
+    </w:lvl>
+    <w:lvl w:ilvl="8" w:tplc="042A0005" w:tentative="1">
+      <w:start w:val="1"/>
+      <w:numFmt w:val="bullet"/>
+      <w:lvlText w:val=""/>
+      <w:lvlJc w:val="left"/>
+      <w:pPr>
+        <w:ind w:left="7047" w:hanging="360"/>
+      </w:pPr>
+      <w:rPr>
+        <w:rFonts w:ascii="Wingdings" w:hAnsi="Wingdings" w:hint="default"/>
+      </w:rPr>
+    </w:lvl>
+  </w:abstractNum>
+  <w:abstractNum w:abstractNumId="4" w15:restartNumberingAfterBreak="0">
+    <w:nsid w:val="0F5E49C0"/>
+    <w:multiLevelType w:val="multilevel"/>
+    <w:tmpl w:val="0AF0FB04"/>
+    <w:lvl w:ilvl="0">
+      <w:start w:val="1"/>
+      <w:numFmt w:val="bullet"/>
+      <w:lvlText w:val=""/>
+      <w:lvlJc w:val="left"/>
+      <w:pPr>
+        <w:tabs>
+          <w:tab w:val="num" w:pos="720"/>
+        </w:tabs>
+        <w:ind w:left="720" w:hanging="360"/>
+      </w:pPr>
+      <w:rPr>
+        <w:rFonts w:ascii="Symbol" w:hAnsi="Symbol" w:hint="default"/>
+        <w:sz w:val="20"/>
+      </w:rPr>
+    </w:lvl>
+    <w:lvl w:ilvl="1" w:tentative="1">
+      <w:start w:val="1"/>
+      <w:numFmt w:val="bullet"/>
+      <w:lvlText w:val="o"/>
+      <w:lvlJc w:val="left"/>
+      <w:pPr>
+        <w:tabs>
+          <w:tab w:val="num" w:pos="1440"/>
+        </w:tabs>
+        <w:ind w:left="1440" w:hanging="360"/>
+      </w:pPr>
+      <w:rPr>
+        <w:rFonts w:ascii="Courier New" w:hAnsi="Courier New" w:hint="default"/>
+        <w:sz w:val="20"/>
+      </w:rPr>
+    </w:lvl>
+    <w:lvl w:ilvl="2" w:tentative="1">
+      <w:start w:val="1"/>
+      <w:numFmt w:val="bullet"/>
+      <w:lvlText w:val=""/>
+      <w:lvlJc w:val="left"/>
+      <w:pPr>
+        <w:tabs>
+          <w:tab w:val="num" w:pos="2160"/>
+        </w:tabs>
+        <w:ind w:left="2160" w:hanging="360"/>
+      </w:pPr>
+      <w:rPr>
+        <w:rFonts w:ascii="Wingdings" w:hAnsi="Wingdings" w:hint="default"/>
+        <w:sz w:val="20"/>
+      </w:rPr>
+    </w:lvl>
+    <w:lvl w:ilvl="3" w:tentative="1">
+      <w:start w:val="1"/>
+      <w:numFmt w:val="bullet"/>
+      <w:lvlText w:val=""/>
+      <w:lvlJc w:val="left"/>
+      <w:pPr>
+        <w:tabs>
+          <w:tab w:val="num" w:pos="2880"/>
+        </w:tabs>
+        <w:ind w:left="2880" w:hanging="360"/>
+      </w:pPr>
+      <w:rPr>
+        <w:rFonts w:ascii="Wingdings" w:hAnsi="Wingdings" w:hint="default"/>
+        <w:sz w:val="20"/>
+      </w:rPr>
+    </w:lvl>
+    <w:lvl w:ilvl="4" w:tentative="1">
+      <w:start w:val="1"/>
+      <w:numFmt w:val="bullet"/>
+      <w:lvlText w:val=""/>
+      <w:lvlJc w:val="left"/>
+      <w:pPr>
+        <w:tabs>
+          <w:tab w:val="num" w:pos="3600"/>
+        </w:tabs>
+        <w:ind w:left="3600" w:hanging="360"/>
+      </w:pPr>
+      <w:rPr>
+        <w:rFonts w:ascii="Wingdings" w:hAnsi="Wingdings" w:hint="default"/>
+        <w:sz w:val="20"/>
+      </w:rPr>
+    </w:lvl>
+    <w:lvl w:ilvl="5" w:tentative="1">
+      <w:start w:val="1"/>
+      <w:numFmt w:val="bullet"/>
+      <w:lvlText w:val=""/>
+      <w:lvlJc w:val="left"/>
+      <w:pPr>
+        <w:tabs>
+          <w:tab w:val="num" w:pos="4320"/>
+        </w:tabs>
+        <w:ind w:left="4320" w:hanging="360"/>
+      </w:pPr>
+      <w:rPr>
+        <w:rFonts w:ascii="Wingdings" w:hAnsi="Wingdings" w:hint="default"/>
+        <w:sz w:val="20"/>
+      </w:rPr>
+    </w:lvl>
+    <w:lvl w:ilvl="6" w:tentative="1">
+      <w:start w:val="1"/>
+      <w:numFmt w:val="bullet"/>
+      <w:lvlText w:val=""/>
+      <w:lvlJc w:val="left"/>
+      <w:pPr>
+        <w:tabs>
+          <w:tab w:val="num" w:pos="5040"/>
+        </w:tabs>
+        <w:ind w:left="5040" w:hanging="360"/>
+      </w:pPr>
+      <w:rPr>
+        <w:rFonts w:ascii="Wingdings" w:hAnsi="Wingdings" w:hint="default"/>
+        <w:sz w:val="20"/>
+      </w:rPr>
+    </w:lvl>
+    <w:lvl w:ilvl="7" w:tentative="1">
+      <w:start w:val="1"/>
+      <w:numFmt w:val="bullet"/>
+      <w:lvlText w:val=""/>
+      <w:lvlJc w:val="left"/>
+      <w:pPr>
+        <w:tabs>
+          <w:tab w:val="num" w:pos="5760"/>
+        </w:tabs>
+        <w:ind w:left="5760" w:hanging="360"/>
+      </w:pPr>
+      <w:rPr>
+        <w:rFonts w:ascii="Wingdings" w:hAnsi="Wingdings" w:hint="default"/>
+        <w:sz w:val="20"/>
+      </w:rPr>
+    </w:lvl>
+    <w:lvl w:ilvl="8" w:tentative="1">
+      <w:start w:val="1"/>
+      <w:numFmt w:val="bullet"/>
+      <w:lvlText w:val=""/>
+      <w:lvlJc w:val="left"/>
+      <w:pPr>
+        <w:tabs>
+          <w:tab w:val="num" w:pos="6480"/>
+        </w:tabs>
+        <w:ind w:left="6480" w:hanging="360"/>
+      </w:pPr>
+      <w:rPr>
+        <w:rFonts w:ascii="Wingdings" w:hAnsi="Wingdings" w:hint="default"/>
+        <w:sz w:val="20"/>
+      </w:rPr>
+    </w:lvl>
+  </w:abstractNum>
+  <w:abstractNum w:abstractNumId="5" w15:restartNumberingAfterBreak="0">
+    <w:nsid w:val="0F695082"/>
+    <w:multiLevelType w:val="multilevel"/>
+    <w:tmpl w:val="9524F75C"/>
+    <w:lvl w:ilvl="0">
+      <w:start w:val="1"/>
+      <w:numFmt w:val="bullet"/>
+      <w:lvlText w:val=""/>
+      <w:lvlJc w:val="left"/>
+      <w:pPr>
+        <w:tabs>
+          <w:tab w:val="num" w:pos="720"/>
+        </w:tabs>
+        <w:ind w:left="720" w:hanging="360"/>
+      </w:pPr>
+      <w:rPr>
+        <w:rFonts w:ascii="Symbol" w:hAnsi="Symbol" w:hint="default"/>
+        <w:sz w:val="20"/>
+      </w:rPr>
+    </w:lvl>
+    <w:lvl w:ilvl="1" w:tentative="1">
+      <w:start w:val="1"/>
+      <w:numFmt w:val="bullet"/>
+      <w:lvlText w:val="o"/>
+      <w:lvlJc w:val="left"/>
+      <w:pPr>
+        <w:tabs>
+          <w:tab w:val="num" w:pos="1440"/>
+        </w:tabs>
+        <w:ind w:left="1440" w:hanging="360"/>
+      </w:pPr>
+      <w:rPr>
+        <w:rFonts w:ascii="Courier New" w:hAnsi="Courier New" w:hint="default"/>
+        <w:sz w:val="20"/>
+      </w:rPr>
+    </w:lvl>
+    <w:lvl w:ilvl="2" w:tentative="1">
+      <w:start w:val="1"/>
+      <w:numFmt w:val="bullet"/>
+      <w:lvlText w:val=""/>
+      <w:lvlJc w:val="left"/>
+      <w:pPr>
+        <w:tabs>
+          <w:tab w:val="num" w:pos="2160"/>
+        </w:tabs>
+        <w:ind w:left="2160" w:hanging="360"/>
+      </w:pPr>
+      <w:rPr>
+        <w:rFonts w:ascii="Wingdings" w:hAnsi="Wingdings" w:hint="default"/>
+        <w:sz w:val="20"/>
+      </w:rPr>
+    </w:lvl>
+    <w:lvl w:ilvl="3" w:tentative="1">
+      <w:start w:val="1"/>
+      <w:numFmt w:val="bullet"/>
+      <w:lvlText w:val=""/>
+      <w:lvlJc w:val="left"/>
+      <w:pPr>
+        <w:tabs>
+          <w:tab w:val="num" w:pos="2880"/>
+        </w:tabs>
+        <w:ind w:left="2880" w:hanging="360"/>
+      </w:pPr>
+      <w:rPr>
+        <w:rFonts w:ascii="Wingdings" w:hAnsi="Wingdings" w:hint="default"/>
+        <w:sz w:val="20"/>
+      </w:rPr>
+    </w:lvl>
+    <w:lvl w:ilvl="4" w:tentative="1">
+      <w:start w:val="1"/>
+      <w:numFmt w:val="bullet"/>
+      <w:lvlText w:val=""/>
+      <w:lvlJc w:val="left"/>
+      <w:pPr>
+        <w:tabs>
+          <w:tab w:val="num" w:pos="3600"/>
+        </w:tabs>
+        <w:ind w:left="3600" w:hanging="360"/>
+      </w:pPr>
+      <w:rPr>
+        <w:rFonts w:ascii="Wingdings" w:hAnsi="Wingdings" w:hint="default"/>
+        <w:sz w:val="20"/>
+      </w:rPr>
+    </w:lvl>
+    <w:lvl w:ilvl="5" w:tentative="1">
+      <w:start w:val="1"/>
+      <w:numFmt w:val="bullet"/>
+      <w:lvlText w:val=""/>
+      <w:lvlJc w:val="left"/>
+      <w:pPr>
+        <w:tabs>
+          <w:tab w:val="num" w:pos="4320"/>
+        </w:tabs>
+        <w:ind w:left="4320" w:hanging="360"/>
+      </w:pPr>
+      <w:rPr>
+        <w:rFonts w:ascii="Wingdings" w:hAnsi="Wingdings" w:hint="default"/>
+        <w:sz w:val="20"/>
+      </w:rPr>
+    </w:lvl>
+    <w:lvl w:ilvl="6" w:tentative="1">
+      <w:start w:val="1"/>
+      <w:numFmt w:val="bullet"/>
+      <w:lvlText w:val=""/>
+      <w:lvlJc w:val="left"/>
+      <w:pPr>
+        <w:tabs>
+          <w:tab w:val="num" w:pos="5040"/>
+        </w:tabs>
+        <w:ind w:left="5040" w:hanging="360"/>
+      </w:pPr>
+      <w:rPr>
+        <w:rFonts w:ascii="Wingdings" w:hAnsi="Wingdings" w:hint="default"/>
+        <w:sz w:val="20"/>
+      </w:rPr>
+    </w:lvl>
+    <w:lvl w:ilvl="7" w:tentative="1">
+      <w:start w:val="1"/>
+      <w:numFmt w:val="bullet"/>
+      <w:lvlText w:val=""/>
+      <w:lvlJc w:val="left"/>
+      <w:pPr>
+        <w:tabs>
+          <w:tab w:val="num" w:pos="5760"/>
+        </w:tabs>
+        <w:ind w:left="5760" w:hanging="360"/>
+      </w:pPr>
+      <w:rPr>
+        <w:rFonts w:ascii="Wingdings" w:hAnsi="Wingdings" w:hint="default"/>
+        <w:sz w:val="20"/>
+      </w:rPr>
+    </w:lvl>
+    <w:lvl w:ilvl="8" w:tentative="1">
+      <w:start w:val="1"/>
+      <w:numFmt w:val="bullet"/>
+      <w:lvlText w:val=""/>
+      <w:lvlJc w:val="left"/>
+      <w:pPr>
+        <w:tabs>
+          <w:tab w:val="num" w:pos="6480"/>
+        </w:tabs>
+        <w:ind w:left="6480" w:hanging="360"/>
+      </w:pPr>
+      <w:rPr>
+        <w:rFonts w:ascii="Wingdings" w:hAnsi="Wingdings" w:hint="default"/>
+        <w:sz w:val="20"/>
+      </w:rPr>
+    </w:lvl>
+  </w:abstractNum>
+  <w:abstractNum w:abstractNumId="6" w15:restartNumberingAfterBreak="0">
     <w:nsid w:val="0FA00DF2"/>
     <w:multiLevelType w:val="multilevel"/>
     <w:tmpl w:val="7CDC7A3E"/>
@@ -2470,7 +4316,7 @@
       </w:rPr>
     </w:lvl>
   </w:abstractNum>
-  <w:abstractNum w:abstractNumId="3" w15:restartNumberingAfterBreak="0">
+  <w:abstractNum w:abstractNumId="7" w15:restartNumberingAfterBreak="0">
     <w:nsid w:val="146401A8"/>
     <w:multiLevelType w:val="multilevel"/>
     <w:tmpl w:val="8BA4779C"/>
@@ -2619,7 +4465,7 @@
       </w:rPr>
     </w:lvl>
   </w:abstractNum>
-  <w:abstractNum w:abstractNumId="4" w15:restartNumberingAfterBreak="0">
+  <w:abstractNum w:abstractNumId="8" w15:restartNumberingAfterBreak="0">
     <w:nsid w:val="169E69F6"/>
     <w:multiLevelType w:val="multilevel"/>
     <w:tmpl w:val="9E0A7A4E"/>
@@ -2768,7 +4614,156 @@
       </w:rPr>
     </w:lvl>
   </w:abstractNum>
-  <w:abstractNum w:abstractNumId="5" w15:restartNumberingAfterBreak="0">
+  <w:abstractNum w:abstractNumId="9" w15:restartNumberingAfterBreak="0">
+    <w:nsid w:val="238E41F5"/>
+    <w:multiLevelType w:val="multilevel"/>
+    <w:tmpl w:val="4F04B086"/>
+    <w:lvl w:ilvl="0">
+      <w:start w:val="1"/>
+      <w:numFmt w:val="bullet"/>
+      <w:lvlText w:val=""/>
+      <w:lvlJc w:val="left"/>
+      <w:pPr>
+        <w:tabs>
+          <w:tab w:val="num" w:pos="720"/>
+        </w:tabs>
+        <w:ind w:left="720" w:hanging="360"/>
+      </w:pPr>
+      <w:rPr>
+        <w:rFonts w:ascii="Symbol" w:hAnsi="Symbol" w:hint="default"/>
+        <w:sz w:val="20"/>
+      </w:rPr>
+    </w:lvl>
+    <w:lvl w:ilvl="1" w:tentative="1">
+      <w:start w:val="1"/>
+      <w:numFmt w:val="bullet"/>
+      <w:lvlText w:val="o"/>
+      <w:lvlJc w:val="left"/>
+      <w:pPr>
+        <w:tabs>
+          <w:tab w:val="num" w:pos="1440"/>
+        </w:tabs>
+        <w:ind w:left="1440" w:hanging="360"/>
+      </w:pPr>
+      <w:rPr>
+        <w:rFonts w:ascii="Courier New" w:hAnsi="Courier New" w:hint="default"/>
+        <w:sz w:val="20"/>
+      </w:rPr>
+    </w:lvl>
+    <w:lvl w:ilvl="2" w:tentative="1">
+      <w:start w:val="1"/>
+      <w:numFmt w:val="bullet"/>
+      <w:lvlText w:val=""/>
+      <w:lvlJc w:val="left"/>
+      <w:pPr>
+        <w:tabs>
+          <w:tab w:val="num" w:pos="2160"/>
+        </w:tabs>
+        <w:ind w:left="2160" w:hanging="360"/>
+      </w:pPr>
+      <w:rPr>
+        <w:rFonts w:ascii="Wingdings" w:hAnsi="Wingdings" w:hint="default"/>
+        <w:sz w:val="20"/>
+      </w:rPr>
+    </w:lvl>
+    <w:lvl w:ilvl="3" w:tentative="1">
+      <w:start w:val="1"/>
+      <w:numFmt w:val="bullet"/>
+      <w:lvlText w:val=""/>
+      <w:lvlJc w:val="left"/>
+      <w:pPr>
+        <w:tabs>
+          <w:tab w:val="num" w:pos="2880"/>
+        </w:tabs>
+        <w:ind w:left="2880" w:hanging="360"/>
+      </w:pPr>
+      <w:rPr>
+        <w:rFonts w:ascii="Wingdings" w:hAnsi="Wingdings" w:hint="default"/>
+        <w:sz w:val="20"/>
+      </w:rPr>
+    </w:lvl>
+    <w:lvl w:ilvl="4" w:tentative="1">
+      <w:start w:val="1"/>
+      <w:numFmt w:val="bullet"/>
+      <w:lvlText w:val=""/>
+      <w:lvlJc w:val="left"/>
+      <w:pPr>
+        <w:tabs>
+          <w:tab w:val="num" w:pos="3600"/>
+        </w:tabs>
+        <w:ind w:left="3600" w:hanging="360"/>
+      </w:pPr>
+      <w:rPr>
+        <w:rFonts w:ascii="Wingdings" w:hAnsi="Wingdings" w:hint="default"/>
+        <w:sz w:val="20"/>
+      </w:rPr>
+    </w:lvl>
+    <w:lvl w:ilvl="5" w:tentative="1">
+      <w:start w:val="1"/>
+      <w:numFmt w:val="bullet"/>
+      <w:lvlText w:val=""/>
+      <w:lvlJc w:val="left"/>
+      <w:pPr>
+        <w:tabs>
+          <w:tab w:val="num" w:pos="4320"/>
+        </w:tabs>
+        <w:ind w:left="4320" w:hanging="360"/>
+      </w:pPr>
+      <w:rPr>
+        <w:rFonts w:ascii="Wingdings" w:hAnsi="Wingdings" w:hint="default"/>
+        <w:sz w:val="20"/>
+      </w:rPr>
+    </w:lvl>
+    <w:lvl w:ilvl="6" w:tentative="1">
+      <w:start w:val="1"/>
+      <w:numFmt w:val="bullet"/>
+      <w:lvlText w:val=""/>
+      <w:lvlJc w:val="left"/>
+      <w:pPr>
+        <w:tabs>
+          <w:tab w:val="num" w:pos="5040"/>
+        </w:tabs>
+        <w:ind w:left="5040" w:hanging="360"/>
+      </w:pPr>
+      <w:rPr>
+        <w:rFonts w:ascii="Wingdings" w:hAnsi="Wingdings" w:hint="default"/>
+        <w:sz w:val="20"/>
+      </w:rPr>
+    </w:lvl>
+    <w:lvl w:ilvl="7" w:tentative="1">
+      <w:start w:val="1"/>
+      <w:numFmt w:val="bullet"/>
+      <w:lvlText w:val=""/>
+      <w:lvlJc w:val="left"/>
+      <w:pPr>
+        <w:tabs>
+          <w:tab w:val="num" w:pos="5760"/>
+        </w:tabs>
+        <w:ind w:left="5760" w:hanging="360"/>
+      </w:pPr>
+      <w:rPr>
+        <w:rFonts w:ascii="Wingdings" w:hAnsi="Wingdings" w:hint="default"/>
+        <w:sz w:val="20"/>
+      </w:rPr>
+    </w:lvl>
+    <w:lvl w:ilvl="8" w:tentative="1">
+      <w:start w:val="1"/>
+      <w:numFmt w:val="bullet"/>
+      <w:lvlText w:val=""/>
+      <w:lvlJc w:val="left"/>
+      <w:pPr>
+        <w:tabs>
+          <w:tab w:val="num" w:pos="6480"/>
+        </w:tabs>
+        <w:ind w:left="6480" w:hanging="360"/>
+      </w:pPr>
+      <w:rPr>
+        <w:rFonts w:ascii="Wingdings" w:hAnsi="Wingdings" w:hint="default"/>
+        <w:sz w:val="20"/>
+      </w:rPr>
+    </w:lvl>
+  </w:abstractNum>
+  <w:abstractNum w:abstractNumId="10" w15:restartNumberingAfterBreak="0">
     <w:nsid w:val="239A7F06"/>
     <w:multiLevelType w:val="hybridMultilevel"/>
     <w:tmpl w:val="A4B086F2"/>
@@ -2881,7 +4876,7 @@
       </w:rPr>
     </w:lvl>
   </w:abstractNum>
-  <w:abstractNum w:abstractNumId="6" w15:restartNumberingAfterBreak="0">
+  <w:abstractNum w:abstractNumId="11" w15:restartNumberingAfterBreak="0">
     <w:nsid w:val="242A06A2"/>
     <w:multiLevelType w:val="multilevel"/>
     <w:tmpl w:val="511ADDFA"/>
@@ -3030,7 +5025,7 @@
       </w:rPr>
     </w:lvl>
   </w:abstractNum>
-  <w:abstractNum w:abstractNumId="7" w15:restartNumberingAfterBreak="0">
+  <w:abstractNum w:abstractNumId="12" w15:restartNumberingAfterBreak="0">
     <w:nsid w:val="24EF13D2"/>
     <w:multiLevelType w:val="hybridMultilevel"/>
     <w:tmpl w:val="338A92DE"/>
@@ -3143,7 +5138,7 @@
       </w:rPr>
     </w:lvl>
   </w:abstractNum>
-  <w:abstractNum w:abstractNumId="8" w15:restartNumberingAfterBreak="0">
+  <w:abstractNum w:abstractNumId="13" w15:restartNumberingAfterBreak="0">
     <w:nsid w:val="26850742"/>
     <w:multiLevelType w:val="hybridMultilevel"/>
     <w:tmpl w:val="2E2226DE"/>
@@ -3256,7 +5251,7 @@
       </w:rPr>
     </w:lvl>
   </w:abstractNum>
-  <w:abstractNum w:abstractNumId="9" w15:restartNumberingAfterBreak="0">
+  <w:abstractNum w:abstractNumId="14" w15:restartNumberingAfterBreak="0">
     <w:nsid w:val="273F670B"/>
     <w:multiLevelType w:val="hybridMultilevel"/>
     <w:tmpl w:val="BCEC599A"/>
@@ -3369,7 +5364,7 @@
       </w:rPr>
     </w:lvl>
   </w:abstractNum>
-  <w:abstractNum w:abstractNumId="10" w15:restartNumberingAfterBreak="0">
+  <w:abstractNum w:abstractNumId="15" w15:restartNumberingAfterBreak="0">
     <w:nsid w:val="274C537B"/>
     <w:multiLevelType w:val="hybridMultilevel"/>
     <w:tmpl w:val="A920D968"/>
@@ -3482,7 +5477,7 @@
       </w:rPr>
     </w:lvl>
   </w:abstractNum>
-  <w:abstractNum w:abstractNumId="11" w15:restartNumberingAfterBreak="0">
+  <w:abstractNum w:abstractNumId="16" w15:restartNumberingAfterBreak="0">
     <w:nsid w:val="2F336821"/>
     <w:multiLevelType w:val="multilevel"/>
     <w:tmpl w:val="1580192E"/>
@@ -3595,7 +5590,7 @@
       </w:pPr>
     </w:lvl>
   </w:abstractNum>
-  <w:abstractNum w:abstractNumId="12" w15:restartNumberingAfterBreak="0">
+  <w:abstractNum w:abstractNumId="17" w15:restartNumberingAfterBreak="0">
     <w:nsid w:val="322D2525"/>
     <w:multiLevelType w:val="hybridMultilevel"/>
     <w:tmpl w:val="601432E4"/>
@@ -3708,7 +5703,7 @@
       </w:rPr>
     </w:lvl>
   </w:abstractNum>
-  <w:abstractNum w:abstractNumId="13" w15:restartNumberingAfterBreak="0">
+  <w:abstractNum w:abstractNumId="18" w15:restartNumberingAfterBreak="0">
     <w:nsid w:val="39734110"/>
     <w:multiLevelType w:val="multilevel"/>
     <w:tmpl w:val="7DFEFCB2"/>
@@ -3857,7 +5852,7 @@
       </w:rPr>
     </w:lvl>
   </w:abstractNum>
-  <w:abstractNum w:abstractNumId="14" w15:restartNumberingAfterBreak="0">
+  <w:abstractNum w:abstractNumId="19" w15:restartNumberingAfterBreak="0">
     <w:nsid w:val="41AC1A2E"/>
     <w:multiLevelType w:val="hybridMultilevel"/>
     <w:tmpl w:val="30F44A16"/>
@@ -3970,7 +5965,7 @@
       </w:rPr>
     </w:lvl>
   </w:abstractNum>
-  <w:abstractNum w:abstractNumId="15" w15:restartNumberingAfterBreak="0">
+  <w:abstractNum w:abstractNumId="20" w15:restartNumberingAfterBreak="0">
     <w:nsid w:val="45CD133F"/>
     <w:multiLevelType w:val="hybridMultilevel"/>
     <w:tmpl w:val="F4308AF2"/>
@@ -4083,7 +6078,120 @@
       </w:rPr>
     </w:lvl>
   </w:abstractNum>
-  <w:abstractNum w:abstractNumId="16" w15:restartNumberingAfterBreak="0">
+  <w:abstractNum w:abstractNumId="21" w15:restartNumberingAfterBreak="0">
+    <w:nsid w:val="49D54777"/>
+    <w:multiLevelType w:val="hybridMultilevel"/>
+    <w:tmpl w:val="E0525F5E"/>
+    <w:lvl w:ilvl="0" w:tplc="042A0001">
+      <w:start w:val="1"/>
+      <w:numFmt w:val="bullet"/>
+      <w:lvlText w:val=""/>
+      <w:lvlJc w:val="left"/>
+      <w:pPr>
+        <w:ind w:left="1233" w:hanging="360"/>
+      </w:pPr>
+      <w:rPr>
+        <w:rFonts w:ascii="Symbol" w:hAnsi="Symbol" w:hint="default"/>
+      </w:rPr>
+    </w:lvl>
+    <w:lvl w:ilvl="1" w:tplc="042A0003" w:tentative="1">
+      <w:start w:val="1"/>
+      <w:numFmt w:val="bullet"/>
+      <w:lvlText w:val="o"/>
+      <w:lvlJc w:val="left"/>
+      <w:pPr>
+        <w:ind w:left="1953" w:hanging="360"/>
+      </w:pPr>
+      <w:rPr>
+        <w:rFonts w:ascii="Courier New" w:hAnsi="Courier New" w:cs="Courier New" w:hint="default"/>
+      </w:rPr>
+    </w:lvl>
+    <w:lvl w:ilvl="2" w:tplc="042A0005" w:tentative="1">
+      <w:start w:val="1"/>
+      <w:numFmt w:val="bullet"/>
+      <w:lvlText w:val=""/>
+      <w:lvlJc w:val="left"/>
+      <w:pPr>
+        <w:ind w:left="2673" w:hanging="360"/>
+      </w:pPr>
+      <w:rPr>
+        <w:rFonts w:ascii="Wingdings" w:hAnsi="Wingdings" w:hint="default"/>
+      </w:rPr>
+    </w:lvl>
+    <w:lvl w:ilvl="3" w:tplc="042A0001" w:tentative="1">
+      <w:start w:val="1"/>
+      <w:numFmt w:val="bullet"/>
+      <w:lvlText w:val=""/>
+      <w:lvlJc w:val="left"/>
+      <w:pPr>
+        <w:ind w:left="3393" w:hanging="360"/>
+      </w:pPr>
+      <w:rPr>
+        <w:rFonts w:ascii="Symbol" w:hAnsi="Symbol" w:hint="default"/>
+      </w:rPr>
+    </w:lvl>
+    <w:lvl w:ilvl="4" w:tplc="042A0003" w:tentative="1">
+      <w:start w:val="1"/>
+      <w:numFmt w:val="bullet"/>
+      <w:lvlText w:val="o"/>
+      <w:lvlJc w:val="left"/>
+      <w:pPr>
+        <w:ind w:left="4113" w:hanging="360"/>
+      </w:pPr>
+      <w:rPr>
+        <w:rFonts w:ascii="Courier New" w:hAnsi="Courier New" w:cs="Courier New" w:hint="default"/>
+      </w:rPr>
+    </w:lvl>
+    <w:lvl w:ilvl="5" w:tplc="042A0005" w:tentative="1">
+      <w:start w:val="1"/>
+      <w:numFmt w:val="bullet"/>
+      <w:lvlText w:val=""/>
+      <w:lvlJc w:val="left"/>
+      <w:pPr>
+        <w:ind w:left="4833" w:hanging="360"/>
+      </w:pPr>
+      <w:rPr>
+        <w:rFonts w:ascii="Wingdings" w:hAnsi="Wingdings" w:hint="default"/>
+      </w:rPr>
+    </w:lvl>
+    <w:lvl w:ilvl="6" w:tplc="042A0001" w:tentative="1">
+      <w:start w:val="1"/>
+      <w:numFmt w:val="bullet"/>
+      <w:lvlText w:val=""/>
+      <w:lvlJc w:val="left"/>
+      <w:pPr>
+        <w:ind w:left="5553" w:hanging="360"/>
+      </w:pPr>
+      <w:rPr>
+        <w:rFonts w:ascii="Symbol" w:hAnsi="Symbol" w:hint="default"/>
+      </w:rPr>
+    </w:lvl>
+    <w:lvl w:ilvl="7" w:tplc="042A0003" w:tentative="1">
+      <w:start w:val="1"/>
+      <w:numFmt w:val="bullet"/>
+      <w:lvlText w:val="o"/>
+      <w:lvlJc w:val="left"/>
+      <w:pPr>
+        <w:ind w:left="6273" w:hanging="360"/>
+      </w:pPr>
+      <w:rPr>
+        <w:rFonts w:ascii="Courier New" w:hAnsi="Courier New" w:cs="Courier New" w:hint="default"/>
+      </w:rPr>
+    </w:lvl>
+    <w:lvl w:ilvl="8" w:tplc="042A0005" w:tentative="1">
+      <w:start w:val="1"/>
+      <w:numFmt w:val="bullet"/>
+      <w:lvlText w:val=""/>
+      <w:lvlJc w:val="left"/>
+      <w:pPr>
+        <w:ind w:left="6993" w:hanging="360"/>
+      </w:pPr>
+      <w:rPr>
+        <w:rFonts w:ascii="Wingdings" w:hAnsi="Wingdings" w:hint="default"/>
+      </w:rPr>
+    </w:lvl>
+  </w:abstractNum>
+  <w:abstractNum w:abstractNumId="22" w15:restartNumberingAfterBreak="0">
     <w:nsid w:val="4A893E2D"/>
     <w:multiLevelType w:val="hybridMultilevel"/>
     <w:tmpl w:val="F594B894"/>
@@ -4196,7 +6304,120 @@
       </w:rPr>
     </w:lvl>
   </w:abstractNum>
-  <w:abstractNum w:abstractNumId="17" w15:restartNumberingAfterBreak="0">
+  <w:abstractNum w:abstractNumId="23" w15:restartNumberingAfterBreak="0">
+    <w:nsid w:val="4AC5332C"/>
+    <w:multiLevelType w:val="hybridMultilevel"/>
+    <w:tmpl w:val="D0641228"/>
+    <w:lvl w:ilvl="0" w:tplc="042A0001">
+      <w:start w:val="1"/>
+      <w:numFmt w:val="bullet"/>
+      <w:lvlText w:val=""/>
+      <w:lvlJc w:val="left"/>
+      <w:pPr>
+        <w:ind w:left="1233" w:hanging="360"/>
+      </w:pPr>
+      <w:rPr>
+        <w:rFonts w:ascii="Symbol" w:hAnsi="Symbol" w:hint="default"/>
+      </w:rPr>
+    </w:lvl>
+    <w:lvl w:ilvl="1" w:tplc="042A0003" w:tentative="1">
+      <w:start w:val="1"/>
+      <w:numFmt w:val="bullet"/>
+      <w:lvlText w:val="o"/>
+      <w:lvlJc w:val="left"/>
+      <w:pPr>
+        <w:ind w:left="1953" w:hanging="360"/>
+      </w:pPr>
+      <w:rPr>
+        <w:rFonts w:ascii="Courier New" w:hAnsi="Courier New" w:cs="Courier New" w:hint="default"/>
+      </w:rPr>
+    </w:lvl>
+    <w:lvl w:ilvl="2" w:tplc="042A0005" w:tentative="1">
+      <w:start w:val="1"/>
+      <w:numFmt w:val="bullet"/>
+      <w:lvlText w:val=""/>
+      <w:lvlJc w:val="left"/>
+      <w:pPr>
+        <w:ind w:left="2673" w:hanging="360"/>
+      </w:pPr>
+      <w:rPr>
+        <w:rFonts w:ascii="Wingdings" w:hAnsi="Wingdings" w:hint="default"/>
+      </w:rPr>
+    </w:lvl>
+    <w:lvl w:ilvl="3" w:tplc="042A0001" w:tentative="1">
+      <w:start w:val="1"/>
+      <w:numFmt w:val="bullet"/>
+      <w:lvlText w:val=""/>
+      <w:lvlJc w:val="left"/>
+      <w:pPr>
+        <w:ind w:left="3393" w:hanging="360"/>
+      </w:pPr>
+      <w:rPr>
+        <w:rFonts w:ascii="Symbol" w:hAnsi="Symbol" w:hint="default"/>
+      </w:rPr>
+    </w:lvl>
+    <w:lvl w:ilvl="4" w:tplc="042A0003" w:tentative="1">
+      <w:start w:val="1"/>
+      <w:numFmt w:val="bullet"/>
+      <w:lvlText w:val="o"/>
+      <w:lvlJc w:val="left"/>
+      <w:pPr>
+        <w:ind w:left="4113" w:hanging="360"/>
+      </w:pPr>
+      <w:rPr>
+        <w:rFonts w:ascii="Courier New" w:hAnsi="Courier New" w:cs="Courier New" w:hint="default"/>
+      </w:rPr>
+    </w:lvl>
+    <w:lvl w:ilvl="5" w:tplc="042A0005" w:tentative="1">
+      <w:start w:val="1"/>
+      <w:numFmt w:val="bullet"/>
+      <w:lvlText w:val=""/>
+      <w:lvlJc w:val="left"/>
+      <w:pPr>
+        <w:ind w:left="4833" w:hanging="360"/>
+      </w:pPr>
+      <w:rPr>
+        <w:rFonts w:ascii="Wingdings" w:hAnsi="Wingdings" w:hint="default"/>
+      </w:rPr>
+    </w:lvl>
+    <w:lvl w:ilvl="6" w:tplc="042A0001" w:tentative="1">
+      <w:start w:val="1"/>
+      <w:numFmt w:val="bullet"/>
+      <w:lvlText w:val=""/>
+      <w:lvlJc w:val="left"/>
+      <w:pPr>
+        <w:ind w:left="5553" w:hanging="360"/>
+      </w:pPr>
+      <w:rPr>
+        <w:rFonts w:ascii="Symbol" w:hAnsi="Symbol" w:hint="default"/>
+      </w:rPr>
+    </w:lvl>
+    <w:lvl w:ilvl="7" w:tplc="042A0003" w:tentative="1">
+      <w:start w:val="1"/>
+      <w:numFmt w:val="bullet"/>
+      <w:lvlText w:val="o"/>
+      <w:lvlJc w:val="left"/>
+      <w:pPr>
+        <w:ind w:left="6273" w:hanging="360"/>
+      </w:pPr>
+      <w:rPr>
+        <w:rFonts w:ascii="Courier New" w:hAnsi="Courier New" w:cs="Courier New" w:hint="default"/>
+      </w:rPr>
+    </w:lvl>
+    <w:lvl w:ilvl="8" w:tplc="042A0005" w:tentative="1">
+      <w:start w:val="1"/>
+      <w:numFmt w:val="bullet"/>
+      <w:lvlText w:val=""/>
+      <w:lvlJc w:val="left"/>
+      <w:pPr>
+        <w:ind w:left="6993" w:hanging="360"/>
+      </w:pPr>
+      <w:rPr>
+        <w:rFonts w:ascii="Wingdings" w:hAnsi="Wingdings" w:hint="default"/>
+      </w:rPr>
+    </w:lvl>
+  </w:abstractNum>
+  <w:abstractNum w:abstractNumId="24" w15:restartNumberingAfterBreak="0">
     <w:nsid w:val="4BCD4967"/>
     <w:multiLevelType w:val="multilevel"/>
     <w:tmpl w:val="7E2267EE"/>
@@ -4345,7 +6566,7 @@
       </w:rPr>
     </w:lvl>
   </w:abstractNum>
-  <w:abstractNum w:abstractNumId="18" w15:restartNumberingAfterBreak="0">
+  <w:abstractNum w:abstractNumId="25" w15:restartNumberingAfterBreak="0">
     <w:nsid w:val="4DFF01F0"/>
     <w:multiLevelType w:val="multilevel"/>
     <w:tmpl w:val="02A85C20"/>
@@ -4494,7 +6715,7 @@
       </w:rPr>
     </w:lvl>
   </w:abstractNum>
-  <w:abstractNum w:abstractNumId="19" w15:restartNumberingAfterBreak="0">
+  <w:abstractNum w:abstractNumId="26" w15:restartNumberingAfterBreak="0">
     <w:nsid w:val="4F291C48"/>
     <w:multiLevelType w:val="hybridMultilevel"/>
     <w:tmpl w:val="4D5C5B6E"/>
@@ -4607,7 +6828,7 @@
       </w:rPr>
     </w:lvl>
   </w:abstractNum>
-  <w:abstractNum w:abstractNumId="20" w15:restartNumberingAfterBreak="0">
+  <w:abstractNum w:abstractNumId="27" w15:restartNumberingAfterBreak="0">
     <w:nsid w:val="549B0A59"/>
     <w:multiLevelType w:val="multilevel"/>
     <w:tmpl w:val="6B68D032"/>
@@ -4756,7 +6977,7 @@
       </w:rPr>
     </w:lvl>
   </w:abstractNum>
-  <w:abstractNum w:abstractNumId="21" w15:restartNumberingAfterBreak="0">
+  <w:abstractNum w:abstractNumId="28" w15:restartNumberingAfterBreak="0">
     <w:nsid w:val="60FE3E4E"/>
     <w:multiLevelType w:val="multilevel"/>
     <w:tmpl w:val="E814DA7C"/>
@@ -4905,7 +7126,156 @@
       </w:rPr>
     </w:lvl>
   </w:abstractNum>
-  <w:abstractNum w:abstractNumId="22" w15:restartNumberingAfterBreak="0">
+  <w:abstractNum w:abstractNumId="29" w15:restartNumberingAfterBreak="0">
+    <w:nsid w:val="61815388"/>
+    <w:multiLevelType w:val="multilevel"/>
+    <w:tmpl w:val="C56C35CC"/>
+    <w:lvl w:ilvl="0">
+      <w:start w:val="1"/>
+      <w:numFmt w:val="bullet"/>
+      <w:lvlText w:val=""/>
+      <w:lvlJc w:val="left"/>
+      <w:pPr>
+        <w:tabs>
+          <w:tab w:val="num" w:pos="720"/>
+        </w:tabs>
+        <w:ind w:left="720" w:hanging="360"/>
+      </w:pPr>
+      <w:rPr>
+        <w:rFonts w:ascii="Symbol" w:hAnsi="Symbol" w:hint="default"/>
+        <w:sz w:val="20"/>
+      </w:rPr>
+    </w:lvl>
+    <w:lvl w:ilvl="1" w:tentative="1">
+      <w:start w:val="1"/>
+      <w:numFmt w:val="bullet"/>
+      <w:lvlText w:val="o"/>
+      <w:lvlJc w:val="left"/>
+      <w:pPr>
+        <w:tabs>
+          <w:tab w:val="num" w:pos="1440"/>
+        </w:tabs>
+        <w:ind w:left="1440" w:hanging="360"/>
+      </w:pPr>
+      <w:rPr>
+        <w:rFonts w:ascii="Courier New" w:hAnsi="Courier New" w:hint="default"/>
+        <w:sz w:val="20"/>
+      </w:rPr>
+    </w:lvl>
+    <w:lvl w:ilvl="2" w:tentative="1">
+      <w:start w:val="1"/>
+      <w:numFmt w:val="bullet"/>
+      <w:lvlText w:val=""/>
+      <w:lvlJc w:val="left"/>
+      <w:pPr>
+        <w:tabs>
+          <w:tab w:val="num" w:pos="2160"/>
+        </w:tabs>
+        <w:ind w:left="2160" w:hanging="360"/>
+      </w:pPr>
+      <w:rPr>
+        <w:rFonts w:ascii="Wingdings" w:hAnsi="Wingdings" w:hint="default"/>
+        <w:sz w:val="20"/>
+      </w:rPr>
+    </w:lvl>
+    <w:lvl w:ilvl="3" w:tentative="1">
+      <w:start w:val="1"/>
+      <w:numFmt w:val="bullet"/>
+      <w:lvlText w:val=""/>
+      <w:lvlJc w:val="left"/>
+      <w:pPr>
+        <w:tabs>
+          <w:tab w:val="num" w:pos="2880"/>
+        </w:tabs>
+        <w:ind w:left="2880" w:hanging="360"/>
+      </w:pPr>
+      <w:rPr>
+        <w:rFonts w:ascii="Wingdings" w:hAnsi="Wingdings" w:hint="default"/>
+        <w:sz w:val="20"/>
+      </w:rPr>
+    </w:lvl>
+    <w:lvl w:ilvl="4" w:tentative="1">
+      <w:start w:val="1"/>
+      <w:numFmt w:val="bullet"/>
+      <w:lvlText w:val=""/>
+      <w:lvlJc w:val="left"/>
+      <w:pPr>
+        <w:tabs>
+          <w:tab w:val="num" w:pos="3600"/>
+        </w:tabs>
+        <w:ind w:left="3600" w:hanging="360"/>
+      </w:pPr>
+      <w:rPr>
+        <w:rFonts w:ascii="Wingdings" w:hAnsi="Wingdings" w:hint="default"/>
+        <w:sz w:val="20"/>
+      </w:rPr>
+    </w:lvl>
+    <w:lvl w:ilvl="5" w:tentative="1">
+      <w:start w:val="1"/>
+      <w:numFmt w:val="bullet"/>
+      <w:lvlText w:val=""/>
+      <w:lvlJc w:val="left"/>
+      <w:pPr>
+        <w:tabs>
+          <w:tab w:val="num" w:pos="4320"/>
+        </w:tabs>
+        <w:ind w:left="4320" w:hanging="360"/>
+      </w:pPr>
+      <w:rPr>
+        <w:rFonts w:ascii="Wingdings" w:hAnsi="Wingdings" w:hint="default"/>
+        <w:sz w:val="20"/>
+      </w:rPr>
+    </w:lvl>
+    <w:lvl w:ilvl="6" w:tentative="1">
+      <w:start w:val="1"/>
+      <w:numFmt w:val="bullet"/>
+      <w:lvlText w:val=""/>
+      <w:lvlJc w:val="left"/>
+      <w:pPr>
+        <w:tabs>
+          <w:tab w:val="num" w:pos="5040"/>
+        </w:tabs>
+        <w:ind w:left="5040" w:hanging="360"/>
+      </w:pPr>
+      <w:rPr>
+        <w:rFonts w:ascii="Wingdings" w:hAnsi="Wingdings" w:hint="default"/>
+        <w:sz w:val="20"/>
+      </w:rPr>
+    </w:lvl>
+    <w:lvl w:ilvl="7" w:tentative="1">
+      <w:start w:val="1"/>
+      <w:numFmt w:val="bullet"/>
+      <w:lvlText w:val=""/>
+      <w:lvlJc w:val="left"/>
+      <w:pPr>
+        <w:tabs>
+          <w:tab w:val="num" w:pos="5760"/>
+        </w:tabs>
+        <w:ind w:left="5760" w:hanging="360"/>
+      </w:pPr>
+      <w:rPr>
+        <w:rFonts w:ascii="Wingdings" w:hAnsi="Wingdings" w:hint="default"/>
+        <w:sz w:val="20"/>
+      </w:rPr>
+    </w:lvl>
+    <w:lvl w:ilvl="8" w:tentative="1">
+      <w:start w:val="1"/>
+      <w:numFmt w:val="bullet"/>
+      <w:lvlText w:val=""/>
+      <w:lvlJc w:val="left"/>
+      <w:pPr>
+        <w:tabs>
+          <w:tab w:val="num" w:pos="6480"/>
+        </w:tabs>
+        <w:ind w:left="6480" w:hanging="360"/>
+      </w:pPr>
+      <w:rPr>
+        <w:rFonts w:ascii="Wingdings" w:hAnsi="Wingdings" w:hint="default"/>
+        <w:sz w:val="20"/>
+      </w:rPr>
+    </w:lvl>
+  </w:abstractNum>
+  <w:abstractNum w:abstractNumId="30" w15:restartNumberingAfterBreak="0">
     <w:nsid w:val="680D1041"/>
     <w:multiLevelType w:val="hybridMultilevel"/>
     <w:tmpl w:val="A5986866"/>
@@ -5018,7 +7388,7 @@
       </w:rPr>
     </w:lvl>
   </w:abstractNum>
-  <w:abstractNum w:abstractNumId="23" w15:restartNumberingAfterBreak="0">
+  <w:abstractNum w:abstractNumId="31" w15:restartNumberingAfterBreak="0">
     <w:nsid w:val="69B17296"/>
     <w:multiLevelType w:val="hybridMultilevel"/>
     <w:tmpl w:val="4894CCB8"/>
@@ -5131,7 +7501,7 @@
       </w:rPr>
     </w:lvl>
   </w:abstractNum>
-  <w:abstractNum w:abstractNumId="24" w15:restartNumberingAfterBreak="0">
+  <w:abstractNum w:abstractNumId="32" w15:restartNumberingAfterBreak="0">
     <w:nsid w:val="6E161EB7"/>
     <w:multiLevelType w:val="hybridMultilevel"/>
     <w:tmpl w:val="06762C32"/>
@@ -5244,7 +7614,156 @@
       </w:rPr>
     </w:lvl>
   </w:abstractNum>
-  <w:abstractNum w:abstractNumId="25" w15:restartNumberingAfterBreak="0">
+  <w:abstractNum w:abstractNumId="33" w15:restartNumberingAfterBreak="0">
+    <w:nsid w:val="78F10EE2"/>
+    <w:multiLevelType w:val="multilevel"/>
+    <w:tmpl w:val="6CD82CCE"/>
+    <w:lvl w:ilvl="0">
+      <w:start w:val="1"/>
+      <w:numFmt w:val="bullet"/>
+      <w:lvlText w:val=""/>
+      <w:lvlJc w:val="left"/>
+      <w:pPr>
+        <w:tabs>
+          <w:tab w:val="num" w:pos="720"/>
+        </w:tabs>
+        <w:ind w:left="720" w:hanging="360"/>
+      </w:pPr>
+      <w:rPr>
+        <w:rFonts w:ascii="Symbol" w:hAnsi="Symbol" w:hint="default"/>
+        <w:sz w:val="20"/>
+      </w:rPr>
+    </w:lvl>
+    <w:lvl w:ilvl="1" w:tentative="1">
+      <w:start w:val="1"/>
+      <w:numFmt w:val="bullet"/>
+      <w:lvlText w:val="o"/>
+      <w:lvlJc w:val="left"/>
+      <w:pPr>
+        <w:tabs>
+          <w:tab w:val="num" w:pos="1440"/>
+        </w:tabs>
+        <w:ind w:left="1440" w:hanging="360"/>
+      </w:pPr>
+      <w:rPr>
+        <w:rFonts w:ascii="Courier New" w:hAnsi="Courier New" w:hint="default"/>
+        <w:sz w:val="20"/>
+      </w:rPr>
+    </w:lvl>
+    <w:lvl w:ilvl="2" w:tentative="1">
+      <w:start w:val="1"/>
+      <w:numFmt w:val="bullet"/>
+      <w:lvlText w:val=""/>
+      <w:lvlJc w:val="left"/>
+      <w:pPr>
+        <w:tabs>
+          <w:tab w:val="num" w:pos="2160"/>
+        </w:tabs>
+        <w:ind w:left="2160" w:hanging="360"/>
+      </w:pPr>
+      <w:rPr>
+        <w:rFonts w:ascii="Wingdings" w:hAnsi="Wingdings" w:hint="default"/>
+        <w:sz w:val="20"/>
+      </w:rPr>
+    </w:lvl>
+    <w:lvl w:ilvl="3" w:tentative="1">
+      <w:start w:val="1"/>
+      <w:numFmt w:val="bullet"/>
+      <w:lvlText w:val=""/>
+      <w:lvlJc w:val="left"/>
+      <w:pPr>
+        <w:tabs>
+          <w:tab w:val="num" w:pos="2880"/>
+        </w:tabs>
+        <w:ind w:left="2880" w:hanging="360"/>
+      </w:pPr>
+      <w:rPr>
+        <w:rFonts w:ascii="Wingdings" w:hAnsi="Wingdings" w:hint="default"/>
+        <w:sz w:val="20"/>
+      </w:rPr>
+    </w:lvl>
+    <w:lvl w:ilvl="4" w:tentative="1">
+      <w:start w:val="1"/>
+      <w:numFmt w:val="bullet"/>
+      <w:lvlText w:val=""/>
+      <w:lvlJc w:val="left"/>
+      <w:pPr>
+        <w:tabs>
+          <w:tab w:val="num" w:pos="3600"/>
+        </w:tabs>
+        <w:ind w:left="3600" w:hanging="360"/>
+      </w:pPr>
+      <w:rPr>
+        <w:rFonts w:ascii="Wingdings" w:hAnsi="Wingdings" w:hint="default"/>
+        <w:sz w:val="20"/>
+      </w:rPr>
+    </w:lvl>
+    <w:lvl w:ilvl="5" w:tentative="1">
+      <w:start w:val="1"/>
+      <w:numFmt w:val="bullet"/>
+      <w:lvlText w:val=""/>
+      <w:lvlJc w:val="left"/>
+      <w:pPr>
+        <w:tabs>
+          <w:tab w:val="num" w:pos="4320"/>
+        </w:tabs>
+        <w:ind w:left="4320" w:hanging="360"/>
+      </w:pPr>
+      <w:rPr>
+        <w:rFonts w:ascii="Wingdings" w:hAnsi="Wingdings" w:hint="default"/>
+        <w:sz w:val="20"/>
+      </w:rPr>
+    </w:lvl>
+    <w:lvl w:ilvl="6" w:tentative="1">
+      <w:start w:val="1"/>
+      <w:numFmt w:val="bullet"/>
+      <w:lvlText w:val=""/>
+      <w:lvlJc w:val="left"/>
+      <w:pPr>
+        <w:tabs>
+          <w:tab w:val="num" w:pos="5040"/>
+        </w:tabs>
+        <w:ind w:left="5040" w:hanging="360"/>
+      </w:pPr>
+      <w:rPr>
+        <w:rFonts w:ascii="Wingdings" w:hAnsi="Wingdings" w:hint="default"/>
+        <w:sz w:val="20"/>
+      </w:rPr>
+    </w:lvl>
+    <w:lvl w:ilvl="7" w:tentative="1">
+      <w:start w:val="1"/>
+      <w:numFmt w:val="bullet"/>
+      <w:lvlText w:val=""/>
+      <w:lvlJc w:val="left"/>
+      <w:pPr>
+        <w:tabs>
+          <w:tab w:val="num" w:pos="5760"/>
+        </w:tabs>
+        <w:ind w:left="5760" w:hanging="360"/>
+      </w:pPr>
+      <w:rPr>
+        <w:rFonts w:ascii="Wingdings" w:hAnsi="Wingdings" w:hint="default"/>
+        <w:sz w:val="20"/>
+      </w:rPr>
+    </w:lvl>
+    <w:lvl w:ilvl="8" w:tentative="1">
+      <w:start w:val="1"/>
+      <w:numFmt w:val="bullet"/>
+      <w:lvlText w:val=""/>
+      <w:lvlJc w:val="left"/>
+      <w:pPr>
+        <w:tabs>
+          <w:tab w:val="num" w:pos="6480"/>
+        </w:tabs>
+        <w:ind w:left="6480" w:hanging="360"/>
+      </w:pPr>
+      <w:rPr>
+        <w:rFonts w:ascii="Wingdings" w:hAnsi="Wingdings" w:hint="default"/>
+        <w:sz w:val="20"/>
+      </w:rPr>
+    </w:lvl>
+  </w:abstractNum>
+  <w:abstractNum w:abstractNumId="34" w15:restartNumberingAfterBreak="0">
     <w:nsid w:val="7A321AD1"/>
     <w:multiLevelType w:val="hybridMultilevel"/>
     <w:tmpl w:val="EC94ACA8"/>
@@ -5357,7 +7876,7 @@
       </w:rPr>
     </w:lvl>
   </w:abstractNum>
-  <w:abstractNum w:abstractNumId="26" w15:restartNumberingAfterBreak="0">
+  <w:abstractNum w:abstractNumId="35" w15:restartNumberingAfterBreak="0">
     <w:nsid w:val="7A61316F"/>
     <w:multiLevelType w:val="hybridMultilevel"/>
     <w:tmpl w:val="58DA159A"/>
@@ -5470,7 +7989,7 @@
       </w:rPr>
     </w:lvl>
   </w:abstractNum>
-  <w:abstractNum w:abstractNumId="27" w15:restartNumberingAfterBreak="0">
+  <w:abstractNum w:abstractNumId="36" w15:restartNumberingAfterBreak="0">
     <w:nsid w:val="7C981C1E"/>
     <w:multiLevelType w:val="multilevel"/>
     <w:tmpl w:val="DAD6C76A"/>
@@ -5619,7 +8138,7 @@
       </w:rPr>
     </w:lvl>
   </w:abstractNum>
-  <w:abstractNum w:abstractNumId="28" w15:restartNumberingAfterBreak="0">
+  <w:abstractNum w:abstractNumId="37" w15:restartNumberingAfterBreak="0">
     <w:nsid w:val="7EA96557"/>
     <w:multiLevelType w:val="multilevel"/>
     <w:tmpl w:val="2BD4EBBC"/>
@@ -5769,13 +8288,13 @@
     </w:lvl>
   </w:abstractNum>
   <w:num w:numId="1" w16cid:durableId="1801846876">
-    <w:abstractNumId w:val="13"/>
+    <w:abstractNumId w:val="18"/>
   </w:num>
   <w:num w:numId="2" w16cid:durableId="1904559340">
-    <w:abstractNumId w:val="27"/>
+    <w:abstractNumId w:val="36"/>
   </w:num>
   <w:num w:numId="3" w16cid:durableId="1104958712">
-    <w:abstractNumId w:val="17"/>
+    <w:abstractNumId w:val="24"/>
   </w:num>
   <w:num w:numId="4" w16cid:durableId="1865435517">
     <w:abstractNumId w:val="0"/>
@@ -5784,100 +8303,109 @@
     <w:abstractNumId w:val="1"/>
   </w:num>
   <w:num w:numId="6" w16cid:durableId="986277506">
+    <w:abstractNumId w:val="8"/>
+  </w:num>
+  <w:num w:numId="7" w16cid:durableId="1491949354">
+    <w:abstractNumId w:val="27"/>
+  </w:num>
+  <w:num w:numId="8" w16cid:durableId="553470653">
+    <w:abstractNumId w:val="16"/>
+  </w:num>
+  <w:num w:numId="9" w16cid:durableId="539167108">
+    <w:abstractNumId w:val="37"/>
+  </w:num>
+  <w:num w:numId="10" w16cid:durableId="1716153047">
+    <w:abstractNumId w:val="25"/>
+  </w:num>
+  <w:num w:numId="11" w16cid:durableId="329991630">
+    <w:abstractNumId w:val="7"/>
+  </w:num>
+  <w:num w:numId="12" w16cid:durableId="501437675">
+    <w:abstractNumId w:val="11"/>
+  </w:num>
+  <w:num w:numId="13" w16cid:durableId="370542647">
+    <w:abstractNumId w:val="6"/>
+  </w:num>
+  <w:num w:numId="14" w16cid:durableId="719011476">
+    <w:abstractNumId w:val="32"/>
+  </w:num>
+  <w:num w:numId="15" w16cid:durableId="917980449">
+    <w:abstractNumId w:val="28"/>
+  </w:num>
+  <w:num w:numId="16" w16cid:durableId="16271596">
+    <w:abstractNumId w:val="19"/>
+  </w:num>
+  <w:num w:numId="17" w16cid:durableId="664162679">
+    <w:abstractNumId w:val="35"/>
+  </w:num>
+  <w:num w:numId="18" w16cid:durableId="313336297">
+    <w:abstractNumId w:val="10"/>
+  </w:num>
+  <w:num w:numId="19" w16cid:durableId="1622031285">
+    <w:abstractNumId w:val="26"/>
+  </w:num>
+  <w:num w:numId="20" w16cid:durableId="529220824">
+    <w:abstractNumId w:val="22"/>
+  </w:num>
+  <w:num w:numId="21" w16cid:durableId="1540585074">
+    <w:abstractNumId w:val="20"/>
+  </w:num>
+  <w:num w:numId="22" w16cid:durableId="1231237492">
+    <w:abstractNumId w:val="30"/>
+  </w:num>
+  <w:num w:numId="23" w16cid:durableId="637416715">
+    <w:abstractNumId w:val="13"/>
+  </w:num>
+  <w:num w:numId="24" w16cid:durableId="730083340">
+    <w:abstractNumId w:val="34"/>
+  </w:num>
+  <w:num w:numId="25" w16cid:durableId="667051279">
+    <w:abstractNumId w:val="17"/>
+  </w:num>
+  <w:num w:numId="26" w16cid:durableId="630331837">
+    <w:abstractNumId w:val="15"/>
+  </w:num>
+  <w:num w:numId="27" w16cid:durableId="1737702074">
+    <w:abstractNumId w:val="14"/>
+  </w:num>
+  <w:num w:numId="28" w16cid:durableId="1288897673">
+    <w:abstractNumId w:val="12"/>
+  </w:num>
+  <w:num w:numId="29" w16cid:durableId="815612509">
+    <w:abstractNumId w:val="15"/>
+  </w:num>
+  <w:num w:numId="30" w16cid:durableId="524171746">
+    <w:abstractNumId w:val="18"/>
+  </w:num>
+  <w:num w:numId="31" w16cid:durableId="847409443">
+    <w:abstractNumId w:val="31"/>
+  </w:num>
+  <w:num w:numId="32" w16cid:durableId="500899221">
+    <w:abstractNumId w:val="5"/>
+  </w:num>
+  <w:num w:numId="33" w16cid:durableId="1374310998">
+    <w:abstractNumId w:val="9"/>
+  </w:num>
+  <w:num w:numId="34" w16cid:durableId="943610741">
     <w:abstractNumId w:val="4"/>
   </w:num>
-  <w:num w:numId="7" w16cid:durableId="1491949354">
-    <w:abstractNumId w:val="20"/>
+  <w:num w:numId="35" w16cid:durableId="532766918">
+    <w:abstractNumId w:val="33"/>
   </w:num>
-  <w:num w:numId="8" w16cid:durableId="553470653">
-    <w:abstractNumId w:val="11"/>
+  <w:num w:numId="36" w16cid:durableId="732462576">
+    <w:abstractNumId w:val="29"/>
   </w:num>
-  <w:num w:numId="9" w16cid:durableId="539167108">
-    <w:abstractNumId w:val="28"/>
+  <w:num w:numId="37" w16cid:durableId="321010526">
+    <w:abstractNumId w:val="21"/>
   </w:num>
-  <w:num w:numId="10" w16cid:durableId="1716153047">
-    <w:abstractNumId w:val="18"/>
+  <w:num w:numId="38" w16cid:durableId="803885870">
+    <w:abstractNumId w:val="23"/>
   </w:num>
-  <w:num w:numId="11" w16cid:durableId="329991630">
+  <w:num w:numId="39" w16cid:durableId="1329214270">
     <w:abstractNumId w:val="3"/>
   </w:num>
-  <w:num w:numId="12" w16cid:durableId="501437675">
-    <w:abstractNumId w:val="6"/>
-  </w:num>
-  <w:num w:numId="13" w16cid:durableId="370542647">
+  <w:num w:numId="40" w16cid:durableId="981736769">
     <w:abstractNumId w:val="2"/>
-  </w:num>
-  <w:num w:numId="14" w16cid:durableId="719011476">
-    <w:abstractNumId w:val="24"/>
-  </w:num>
-  <w:num w:numId="15" w16cid:durableId="917980449">
-    <w:abstractNumId w:val="21"/>
-  </w:num>
-  <w:num w:numId="16" w16cid:durableId="16271596">
-    <w:abstractNumId w:val="14"/>
-  </w:num>
-  <w:num w:numId="17" w16cid:durableId="664162679">
-    <w:abstractNumId w:val="26"/>
-  </w:num>
-  <w:num w:numId="18" w16cid:durableId="313336297">
-    <w:abstractNumId w:val="5"/>
-  </w:num>
-  <w:num w:numId="19" w16cid:durableId="1622031285">
-    <w:abstractNumId w:val="19"/>
-  </w:num>
-  <w:num w:numId="20" w16cid:durableId="529220824">
-    <w:abstractNumId w:val="16"/>
-  </w:num>
-  <w:num w:numId="21" w16cid:durableId="1540585074">
-    <w:abstractNumId w:val="15"/>
-  </w:num>
-  <w:num w:numId="22" w16cid:durableId="1231237492">
-    <w:abstractNumId w:val="22"/>
-  </w:num>
-  <w:num w:numId="23" w16cid:durableId="637416715">
-    <w:abstractNumId w:val="8"/>
-  </w:num>
-  <w:num w:numId="24" w16cid:durableId="730083340">
-    <w:abstractNumId w:val="25"/>
-  </w:num>
-  <w:num w:numId="25" w16cid:durableId="667051279">
-    <w:abstractNumId w:val="12"/>
-  </w:num>
-  <w:num w:numId="26" w16cid:durableId="630331837">
-    <w:abstractNumId w:val="10"/>
-  </w:num>
-  <w:num w:numId="27" w16cid:durableId="1737702074">
-    <w:abstractNumId w:val="9"/>
-  </w:num>
-  <w:num w:numId="28" w16cid:durableId="1288897673">
-    <w:abstractNumId w:val="7"/>
-  </w:num>
-  <w:num w:numId="29" w16cid:durableId="815612509">
-    <w:abstractNumId w:val="10"/>
-    <w:lvlOverride w:ilvl="0"/>
-    <w:lvlOverride w:ilvl="1"/>
-    <w:lvlOverride w:ilvl="2"/>
-    <w:lvlOverride w:ilvl="3"/>
-    <w:lvlOverride w:ilvl="4"/>
-    <w:lvlOverride w:ilvl="5"/>
-    <w:lvlOverride w:ilvl="6"/>
-    <w:lvlOverride w:ilvl="7"/>
-    <w:lvlOverride w:ilvl="8"/>
-  </w:num>
-  <w:num w:numId="30" w16cid:durableId="524171746">
-    <w:abstractNumId w:val="13"/>
-    <w:lvlOverride w:ilvl="0"/>
-    <w:lvlOverride w:ilvl="1"/>
-    <w:lvlOverride w:ilvl="2"/>
-    <w:lvlOverride w:ilvl="3"/>
-    <w:lvlOverride w:ilvl="4"/>
-    <w:lvlOverride w:ilvl="5"/>
-    <w:lvlOverride w:ilvl="6"/>
-    <w:lvlOverride w:ilvl="7"/>
-    <w:lvlOverride w:ilvl="8"/>
-  </w:num>
-  <w:num w:numId="31" w16cid:durableId="847409443">
-    <w:abstractNumId w:val="23"/>
   </w:num>
 </w:numbering>
 </file>
@@ -6825,6 +9353,25 @@
       <w:shd w:val="clear" w:color="auto" w:fill="E1DFDD"/>
     </w:rPr>
   </w:style>
+  <w:style w:type="table" w:styleId="TableGrid">
+    <w:name w:val="Table Grid"/>
+    <w:basedOn w:val="TableNormal"/>
+    <w:uiPriority w:val="39"/>
+    <w:rsid w:val="00450F3B"/>
+    <w:pPr>
+      <w:spacing w:line="240" w:lineRule="auto"/>
+    </w:pPr>
+    <w:tblPr>
+      <w:tblBorders>
+        <w:top w:val="single" w:sz="4" w:space="0" w:color="auto"/>
+        <w:left w:val="single" w:sz="4" w:space="0" w:color="auto"/>
+        <w:bottom w:val="single" w:sz="4" w:space="0" w:color="auto"/>
+        <w:right w:val="single" w:sz="4" w:space="0" w:color="auto"/>
+        <w:insideH w:val="single" w:sz="4" w:space="0" w:color="auto"/>
+        <w:insideV w:val="single" w:sz="4" w:space="0" w:color="auto"/>
+      </w:tblBorders>
+    </w:tblPr>
+  </w:style>
 </w:styles>
 </file>
 

</xml_diff>

<commit_message>
Sửa giao diện ví
</commit_message>
<xml_diff>
--- a/docs/HƯỚNG DẪN SỬ DỤNG HỆ THỐNG VÀ CHẠY DEMO.docx
+++ b/docs/HƯỚNG DẪN SỬ DỤNG HỆ THỐNG VÀ CHẠY DEMO.docx
@@ -3273,7 +3273,13 @@
         </w:tabs>
       </w:pPr>
       <w:r>
-        <w:t>Chọn tab Thẻ nội địa/Internet Banking → ngân hàng NCB, không dùng QR</w:t>
+        <w:t>Chọn tab Thẻ nội địa</w:t>
+      </w:r>
+      <w:r>
+        <w:t xml:space="preserve"> và tài khoản ngân hàng</w:t>
+      </w:r>
+      <w:r>
+        <w:t xml:space="preserve"> → ngân hàng NCB, không dùng QR</w:t>
       </w:r>
     </w:p>
     <w:p>
@@ -9015,6 +9021,7 @@
   <w:style w:type="character" w:default="1" w:styleId="DefaultParagraphFont">
     <w:name w:val="Default Paragraph Font"/>
     <w:uiPriority w:val="1"/>
+    <w:semiHidden/>
     <w:unhideWhenUsed/>
   </w:style>
   <w:style w:type="table" w:default="1" w:styleId="TableNormal">

</xml_diff>